<commit_message>
Revise USD/JPY News Tracker documentation for clarity and business focus
</commit_message>
<xml_diff>
--- a/docs/USDJPY_News_Tracker_逻辑说明.docx
+++ b/docs/USDJPY_News_Tracker_逻辑说明.docx
@@ -3,668 +3,365 @@
 <w:document xmlns:wpc="http://schemas.microsoft.com/office/word/2010/wordprocessingCanvas" xmlns:mo="http://schemas.microsoft.com/office/mac/office/2008/main" xmlns:mc="http://schemas.openxmlformats.org/markup-compatibility/2006" xmlns:mv="urn:schemas-microsoft-com:mac:vml" xmlns:o="urn:schemas-microsoft-com:office:office" xmlns:r="http://schemas.openxmlformats.org/officeDocument/2006/relationships" xmlns:m="http://schemas.openxmlformats.org/officeDocument/2006/math" xmlns:v="urn:schemas-microsoft-com:vml" xmlns:wp14="http://schemas.microsoft.com/office/word/2010/wordprocessingDrawing" xmlns:wp="http://schemas.openxmlformats.org/drawingml/2006/wordprocessingDrawing" xmlns:w10="urn:schemas-microsoft-com:office:word" xmlns:w="http://schemas.openxmlformats.org/wordprocessingml/2006/main" xmlns:w14="http://schemas.microsoft.com/office/word/2010/wordml" xmlns:wpg="http://schemas.microsoft.com/office/word/2010/wordprocessingGroup" xmlns:wpi="http://schemas.microsoft.com/office/word/2010/wordprocessingInk" xmlns:wne="http://schemas.microsoft.com/office/word/2006/wordml" xmlns:wps="http://schemas.microsoft.com/office/word/2010/wordprocessingShape" mc:Ignorable="w14 wp14">
   <w:body>
     <w:p>
+      <w:r>
+        <w:rPr>
+          <w:b/>
+          <w:sz w:val="36"/>
+        </w:rPr>
+        <w:t>USD/JPY News Tracker - Business Logic Summary / 业务逻辑说明</w:t>
+      </w:r>
+    </w:p>
+    <w:p>
       <w:pPr>
-        <w:spacing w:before="0" w:after="40" w:line="269" w:lineRule="auto"/>
+        <w:spacing w:after="160"/>
+      </w:pPr>
+      <w:r>
+        <w:t>This document explains the current product logic from a business perspective only. 本文仅从业务角度说明当前 USD/JPY 新闻追踪器的逻辑，不涉及技术实现、服务器部署或运行配置。</w:t>
+      </w:r>
+    </w:p>
+    <w:p>
+      <w:pPr>
+        <w:spacing w:before="200" w:after="80"/>
       </w:pPr>
       <w:r>
         <w:rPr>
           <w:b/>
-          <w:color w:val="1F3B6E"/>
-          <w:sz w:val="36"/>
+          <w:sz w:val="24"/>
         </w:rPr>
-        <w:t>USD/JPY News Tracker — 程序逻辑说明</w:t>
-      </w:r>
-    </w:p>
-    <w:p>
-      <w:pPr>
-        <w:spacing w:before="0" w:after="160" w:line="269" w:lineRule="auto"/>
-      </w:pPr>
-      <w:r>
-        <w:rPr>
-          <w:color w:val="666666"/>
-          <w:sz w:val="18"/>
-        </w:rPr>
-        <w:t>A local pipeline that collects Japanese financial news, scores each item for USD/JPY relevance with an LLM, and writes an executive summary. 本文档说明它的运行流程、评分逻辑与边界。请连同最新的 executive summary 一起阅读。</w:t>
-      </w:r>
-    </w:p>
-    <w:p>
-      <w:pPr>
-        <w:spacing w:before="200" w:after="60" w:line="269" w:lineRule="auto"/>
-      </w:pPr>
-      <w:r>
-        <w:rPr>
-          <w:b/>
-          <w:color w:val="1F3B6E"/>
-          <w:sz w:val="26"/>
-        </w:rPr>
-        <w:t>1. 这是什么 / What it is</w:t>
-      </w:r>
-    </w:p>
-    <w:p>
-      <w:pPr>
-        <w:spacing w:before="0" w:after="80" w:line="269" w:lineRule="auto"/>
-      </w:pPr>
-      <w:r>
-        <w:rPr>
-          <w:sz w:val="20"/>
-        </w:rPr>
-        <w:t>一个本地运行的 USD/JPY 新闻情报流水线。它定时从官方与公开渠道抓取日本相关财经新闻，用大模型（DeepSeek）逐条评估「这条新闻对美元/日元汇率的影响相关性」，再汇总成一页可读的执行摘要（Markdown + Word 两种格式）。</w:t>
-      </w:r>
-    </w:p>
-    <w:p>
-      <w:pPr>
-        <w:spacing w:before="0" w:after="80" w:line="269" w:lineRule="auto"/>
-      </w:pPr>
-      <w:r>
-        <w:rPr>
-          <w:sz w:val="20"/>
-        </w:rPr>
-        <w:t>Goal: turn a noisy stream of Japan macro/market headlines into a short, ranked, decision-oriented USD/JPY brief that a trader or analyst can read in two minutes.</w:t>
-      </w:r>
-    </w:p>
-    <w:p>
-      <w:pPr>
-        <w:spacing w:before="200" w:after="60" w:line="269" w:lineRule="auto"/>
-      </w:pPr>
-      <w:r>
-        <w:rPr>
-          <w:b/>
-          <w:color w:val="1F3B6E"/>
-          <w:sz w:val="26"/>
-        </w:rPr>
-        <w:t>2. 数据源 / Sources</w:t>
+        <w:t>1. Business Purpose / 业务目标</w:t>
       </w:r>
     </w:p>
     <w:p>
       <w:pPr>
         <w:pStyle w:val="ListBullet"/>
-        <w:spacing w:before="0" w:after="40" w:line="269" w:lineRule="auto"/>
+        <w:spacing w:after="40"/>
       </w:pPr>
       <w:r>
-        <w:rPr>
-          <w:b/>
-          <w:sz w:val="20"/>
-        </w:rPr>
-        <w:t xml:space="preserve">BOJ: </w:t>
-      </w:r>
-      <w:r>
-        <w:rPr>
-          <w:sz w:val="20"/>
-        </w:rPr>
-        <w:t>Bank of Japan — 官方英文 RSS（What's New + Statistics），政策与统计第一手。</w:t>
+        <w:t>Purpose: turn scattered Japan, US policy, and FX market news into a concise USD/JPY briefing for traders and analysts. 目标：把分散的日本、美国政策和外汇市场新闻，整理成可快速阅读的美元/日元简报。</w:t>
       </w:r>
     </w:p>
     <w:p>
       <w:pPr>
         <w:pStyle w:val="ListBullet"/>
-        <w:spacing w:before="0" w:after="40" w:line="269" w:lineRule="auto"/>
+        <w:spacing w:after="40"/>
       </w:pPr>
       <w:r>
-        <w:rPr>
-          <w:b/>
-          <w:sz w:val="20"/>
-        </w:rPr>
-        <w:t xml:space="preserve">Nikkei: </w:t>
-      </w:r>
-      <w:r>
-        <w:rPr>
-          <w:sz w:val="20"/>
-        </w:rPr>
-        <w:t>Nikkei Asia — 公开 RSS（不触碰付费墙正文，只读公开元数据补全日期）。</w:t>
+        <w:t>The brief is designed to answer three business questions: what happened, why it matters for USD/JPY, and what to watch next. 简报重点回答三个问题：发生了什么、为什么影响 USD/JPY、下一步关注什么。</w:t>
       </w:r>
     </w:p>
     <w:p>
       <w:pPr>
         <w:pStyle w:val="ListBullet"/>
-        <w:spacing w:before="0" w:after="40" w:line="269" w:lineRule="auto"/>
+        <w:spacing w:after="40"/>
+      </w:pPr>
+      <w:r>
+        <w:t>The output is decision-support context, not a buy/sell instruction or a statistically tested trading signal. 输出定位是决策辅助信息，不是买卖建议，也不是经过统计回测的交易信号。</w:t>
+      </w:r>
+    </w:p>
+    <w:p>
+      <w:pPr>
+        <w:spacing w:before="200" w:after="80"/>
       </w:pPr>
       <w:r>
         <w:rPr>
           <w:b/>
-          <w:sz w:val="20"/>
+          <w:sz w:val="24"/>
         </w:rPr>
-        <w:t xml:space="preserve">NHK: </w:t>
-      </w:r>
-      <w:r>
-        <w:rPr>
-          <w:sz w:val="20"/>
-        </w:rPr>
-        <w:t>NHK WORLD-JAPAN — 礼貌抓取公开 HTML 列表页。</w:t>
-      </w:r>
-    </w:p>
-    <w:p>
-      <w:pPr>
-        <w:spacing w:before="0" w:after="80" w:line="269" w:lineRule="auto"/>
-      </w:pPr>
-      <w:r>
-        <w:rPr>
-          <w:sz w:val="20"/>
-        </w:rPr>
-        <w:t>中文注解：全部为官方 / 公开渠道，合规优先；Nikkei 的付费正文从不抓取。</w:t>
-      </w:r>
-    </w:p>
-    <w:p>
-      <w:pPr>
-        <w:spacing w:before="200" w:after="60" w:line="269" w:lineRule="auto"/>
-      </w:pPr>
-      <w:r>
-        <w:rPr>
-          <w:b/>
-          <w:color w:val="1F3B6E"/>
-          <w:sz w:val="26"/>
-        </w:rPr>
-        <w:t>3. 端到端流程 / Pipeline</w:t>
-      </w:r>
-    </w:p>
-    <w:p>
-      <w:pPr>
-        <w:spacing w:before="0" w:after="80" w:line="269" w:lineRule="auto"/>
-      </w:pPr>
-      <w:r>
-        <w:rPr>
-          <w:sz w:val="20"/>
-        </w:rPr>
-        <w:t>一条命令 run-once 串起三步：Collect → Score → Summarize。</w:t>
-      </w:r>
-    </w:p>
-    <w:p>
-      <w:pPr>
-        <w:spacing w:before="80" w:after="40" w:line="269" w:lineRule="auto"/>
-      </w:pPr>
-      <w:r>
-        <w:rPr>
-          <w:b/>
-          <w:color w:val="1F3B6E"/>
-          <w:sz w:val="22"/>
-        </w:rPr>
-        <w:t xml:space="preserve">Step 1  </w:t>
-      </w:r>
-      <w:r>
-        <w:rPr>
-          <w:b/>
-          <w:sz w:val="22"/>
-        </w:rPr>
-        <w:t>Collect（抓取 + 去重落库）</w:t>
+        <w:t>2. Source Coverage / 信息覆盖范围</w:t>
       </w:r>
     </w:p>
     <w:p>
       <w:pPr>
         <w:pStyle w:val="ListBullet"/>
-        <w:spacing w:before="0" w:after="40" w:line="269" w:lineRule="auto"/>
+        <w:spacing w:after="40"/>
       </w:pPr>
       <w:r>
-        <w:rPr>
-          <w:sz w:val="20"/>
-        </w:rPr>
-        <w:t>从 4 个源拉取最新条目；Nikkei RSS 无日期时，读文章页 &lt;head&gt; 公开元数据补全发布时间。</w:t>
+        <w:t>Japan policy and macro channel: Bank of Japan announcements and statistics, Nikkei Asia, and NHK WORLD-JAPAN. 日本政策与宏观渠道：日本央行公告和统计、Nikkei Asia、NHK WORLD-JAPAN。</w:t>
       </w:r>
     </w:p>
     <w:p>
       <w:pPr>
         <w:pStyle w:val="ListBullet"/>
-        <w:spacing w:before="0" w:after="40" w:line="269" w:lineRule="auto"/>
+        <w:spacing w:after="40"/>
       </w:pPr>
       <w:r>
-        <w:rPr>
-          <w:sz w:val="20"/>
-        </w:rPr>
-        <w:t>用 sha256(source|title|url) 计算指纹，写入本地 SQLite；已存在的指纹直接跳过（去重，且每篇只抓一次）。</w:t>
+        <w:t>US policy channel: Federal Reserve monetary-policy releases, Federal Reserve speeches, and US Treasury press releases. 美国政策渠道：美联储货币政策公告、美联储讲话、美国财政部新闻。</w:t>
       </w:r>
     </w:p>
     <w:p>
       <w:pPr>
         <w:pStyle w:val="ListBullet"/>
-        <w:spacing w:before="0" w:after="40" w:line="269" w:lineRule="auto"/>
+        <w:spacing w:after="40"/>
       </w:pPr>
       <w:r>
-        <w:rPr>
-          <w:sz w:val="20"/>
-        </w:rPr>
-        <w:t>published_at（真实发布时间）与 collected_at（首次抓到时间）分开存储，无日期条目不会被伪造成「现在」。</w:t>
-      </w:r>
-    </w:p>
-    <w:p>
-      <w:pPr>
-        <w:spacing w:before="80" w:after="40" w:line="269" w:lineRule="auto"/>
-      </w:pPr>
-      <w:r>
-        <w:rPr>
-          <w:b/>
-          <w:color w:val="1F3B6E"/>
-          <w:sz w:val="22"/>
-        </w:rPr>
-        <w:t xml:space="preserve">Step 2  </w:t>
-      </w:r>
-      <w:r>
-        <w:rPr>
-          <w:b/>
-          <w:sz w:val="22"/>
-        </w:rPr>
-        <w:t>Score（关键词预筛 + LLM 打分）</w:t>
+        <w:t>FX market channel: FXStreet and Investing.com forex news, used as market-commentary supplements rather than primary official evidence. 外汇市场渠道：FXStreet 与 Investing.com 外汇新闻，作为市场解读补充，而非优先级最高的官方依据。</w:t>
       </w:r>
     </w:p>
     <w:p>
       <w:pPr>
         <w:pStyle w:val="ListBullet"/>
-        <w:spacing w:before="0" w:after="40" w:line="269" w:lineRule="auto"/>
+        <w:spacing w:after="40"/>
+      </w:pPr>
+      <w:r>
+        <w:t>Business focus: BOJ/Fed policy, rate differentials, inflation, wages, JGB and Treasury yields, intervention rhetoric, fiscal policy, risk sentiment, trade balance, oil/commodities, and growth data. 业务关注点：日美央行政策、利差、通胀、工资、日债与美债收益率、干预言论、财政政策、风险情绪、贸易收支、油价/商品和增长数据。</w:t>
+      </w:r>
+    </w:p>
+    <w:p>
+      <w:pPr>
+        <w:spacing w:before="200" w:after="80"/>
       </w:pPr>
       <w:r>
         <w:rPr>
-          <w:sz w:val="20"/>
+          <w:b/>
+          <w:sz w:val="24"/>
         </w:rPr>
-        <w:t>先用便宜的关键词规则预筛（yen / boj / fed / rate / cpi / intervention 等）；BOJ 来源即使无关键词也用宏观正则兜底。</w:t>
+        <w:t>3. Business Workflow / 业务流程</w:t>
       </w:r>
     </w:p>
     <w:p>
       <w:pPr>
         <w:pStyle w:val="ListBullet"/>
-        <w:spacing w:before="0" w:after="40" w:line="269" w:lineRule="auto"/>
+        <w:spacing w:after="40"/>
       </w:pPr>
       <w:r>
-        <w:rPr>
-          <w:sz w:val="20"/>
-        </w:rPr>
-        <w:t>再按优先级排序并截断（BOJ +3、命中预筛 +2，按发布时间倒序），每次最多送 25 篇打分——这是控制 API 成本的闸门。</w:t>
+        <w:t>Collect: gather recent public headlines from the source set above and keep the news items that can plausibly affect USD/JPY. 收集：从上述信源获取近期公开新闻，保留可能影响美元/日元的条目。</w:t>
       </w:r>
     </w:p>
     <w:p>
       <w:pPr>
         <w:pStyle w:val="ListBullet"/>
-        <w:spacing w:before="0" w:after="40" w:line="269" w:lineRule="auto"/>
+        <w:spacing w:after="40"/>
       </w:pPr>
       <w:r>
-        <w:rPr>
-          <w:sz w:val="20"/>
-        </w:rPr>
-        <w:t>对每篇调用 DeepSeek，要求返回固定结构 JSON：relevance_score、fx_channel、direction、confidence、summary、why_it_matters。</w:t>
-      </w:r>
-    </w:p>
-    <w:p>
-      <w:pPr>
-        <w:spacing w:before="80" w:after="40" w:line="269" w:lineRule="auto"/>
-      </w:pPr>
-      <w:r>
-        <w:rPr>
-          <w:b/>
-          <w:color w:val="1F3B6E"/>
-          <w:sz w:val="22"/>
-        </w:rPr>
-        <w:t xml:space="preserve">Step 3  </w:t>
-      </w:r>
-      <w:r>
-        <w:rPr>
-          <w:b/>
-          <w:sz w:val="22"/>
-        </w:rPr>
-        <w:t>Summarize（汇总 + 出报告）</w:t>
+        <w:t>Freshness control: prefer genuinely recent news; when a source has incomplete date information, the item is marked by first-seen timing instead of being treated as an exact publication date. 时效控制：优先近期新闻；当信源日期信息不完整时，用“首次看到”作为近似，不把它误写成确定发布时间。</w:t>
       </w:r>
     </w:p>
     <w:p>
       <w:pPr>
         <w:pStyle w:val="ListBullet"/>
-        <w:spacing w:before="0" w:after="40" w:line="269" w:lineRule="auto"/>
+        <w:spacing w:after="40"/>
       </w:pPr>
       <w:r>
-        <w:rPr>
-          <w:sz w:val="20"/>
-        </w:rPr>
-        <w:t>从库中取「近 72 小时内、分数 ≥ 40」的条目，再调一次 LLM 生成整体 Market Read 与 Watchlist。</w:t>
+        <w:t>Duplicate control: similar or repeated headlines are consolidated so the report does not over-count the same story. 去重控制：相似或重复标题会被合并，避免同一事件在报告中被重复放大。</w:t>
       </w:r>
     </w:p>
     <w:p>
       <w:pPr>
         <w:pStyle w:val="ListBullet"/>
-        <w:spacing w:before="0" w:after="40" w:line="269" w:lineRule="auto"/>
+        <w:spacing w:after="40"/>
       </w:pPr>
       <w:r>
-        <w:rPr>
-          <w:sz w:val="20"/>
-        </w:rPr>
-        <w:t>Top Stories 的方向、相关性、日期、链接均直接由数据库渲染，不让 LLM 复述数字，避免幻觉、保证可追溯。</w:t>
+        <w:t>Pre-screening: direct USD/JPY, yen, BOJ, Fed, Treasury-yield, inflation, intervention, and risk-sentiment clues are used to identify relevant candidates. 预筛选：使用 USD/JPY、日元、日本央行、美联储、美债收益率、通胀、干预、风险情绪等线索识别候选新闻。</w:t>
       </w:r>
     </w:p>
     <w:p>
       <w:pPr>
         <w:pStyle w:val="ListBullet"/>
-        <w:spacing w:before="0" w:after="40" w:line="269" w:lineRule="auto"/>
+        <w:spacing w:after="40"/>
       </w:pPr>
       <w:r>
-        <w:rPr>
-          <w:sz w:val="20"/>
-        </w:rPr>
-        <w:t>同时输出 Markdown 与 Word 两份报告到 summaries/ 目录。</w:t>
-      </w:r>
-    </w:p>
-    <w:p>
-      <w:pPr>
-        <w:spacing w:before="200" w:after="60" w:line="269" w:lineRule="auto"/>
-      </w:pPr>
-      <w:r>
-        <w:rPr>
-          <w:b/>
-          <w:color w:val="1F3B6E"/>
-          <w:sz w:val="26"/>
-        </w:rPr>
-        <w:t>4. 评分体系 / Scoring</w:t>
-      </w:r>
-    </w:p>
-    <w:p>
-      <w:pPr>
-        <w:spacing w:before="120" w:after="40" w:line="269" w:lineRule="auto"/>
-      </w:pPr>
-      <w:r>
-        <w:rPr>
-          <w:b/>
-          <w:sz w:val="22"/>
-        </w:rPr>
-        <w:t>Relevance（相关性，报告中显示为 High / Medium / Low）</w:t>
+        <w:t>Official-source preference: BOJ, Fed, and US Treasury items can pass the screen even when the headline does not explicitly say USD/JPY, as long as the topic has a clear macro or policy channel. 官方信源优先：BOJ、美联储、美国财政部新闻即使标题没有写 USD/JPY，只要有明确宏观或政策传导路径，也会进入评估。</w:t>
       </w:r>
     </w:p>
     <w:p>
       <w:pPr>
         <w:pStyle w:val="ListBullet"/>
-        <w:spacing w:before="0" w:after="40" w:line="269" w:lineRule="auto"/>
+        <w:spacing w:after="40"/>
       </w:pPr>
       <w:r>
-        <w:rPr>
-          <w:sz w:val="20"/>
-        </w:rPr>
-        <w:t>High — 直接的 BOJ/Fed 政策、汇率干预、重大 CPI/利率意外（内部分值 80–100）。</w:t>
+        <w:t>Noise reduction: generic forex headlines are filtered more strictly; FX media items need direct USD/JPY/Japan evidence or multiple strong macro clues. 降噪：泛泛的外汇新闻会被更严格过滤；外汇媒体条目需要直接的 USD/JPY/日本线索，或多个强宏观线索。</w:t>
       </w:r>
     </w:p>
     <w:p>
       <w:pPr>
         <w:pStyle w:val="ListBullet"/>
-        <w:spacing w:before="0" w:after="40" w:line="269" w:lineRule="auto"/>
+        <w:spacing w:after="40"/>
       </w:pPr>
       <w:r>
-        <w:rPr>
-          <w:sz w:val="20"/>
-        </w:rPr>
-        <w:t>Medium — 有清晰日元传导路径的强宏观（工资、JGB、对日油价冲击等，内部 60–79）。</w:t>
+        <w:t>Prioritization: official policy news and high-signal macro stories are ranked ahead of generic commentary, while source caps keep any one media feed from dominating. 排序：官方政策新闻和高信号宏观新闻优先于泛市场评论，同时限制单一媒体来源占比。</w:t>
       </w:r>
     </w:p>
     <w:p>
       <w:pPr>
         <w:pStyle w:val="ListBullet"/>
-        <w:spacing w:before="0" w:after="40" w:line="269" w:lineRule="auto"/>
+        <w:spacing w:after="40"/>
       </w:pPr>
       <w:r>
-        <w:rPr>
-          <w:sz w:val="20"/>
-        </w:rPr>
-        <w:t>Low — 间接或边缘相关（贸易、风险情绪、财政等，内部 &lt; 60）。</w:t>
-      </w:r>
-    </w:p>
-    <w:p>
-      <w:pPr>
-        <w:spacing w:before="120" w:after="40" w:line="269" w:lineRule="auto"/>
-      </w:pPr>
-      <w:r>
-        <w:rPr>
-          <w:b/>
-          <w:sz w:val="22"/>
-        </w:rPr>
-        <w:t>Direction（方向）</w:t>
-      </w:r>
-    </w:p>
-    <w:p>
-      <w:pPr>
-        <w:spacing w:before="0" w:after="80" w:line="269" w:lineRule="auto"/>
-      </w:pPr>
-      <w:r>
-        <w:rPr>
-          <w:sz w:val="20"/>
-        </w:rPr>
-        <w:t>USD/JPY ↑ 表示美元走强 / 日元走弱；USD/JPY ↓ 表示日元走强；另有 Mixed / Unclear。</w:t>
-      </w:r>
-    </w:p>
-    <w:p>
-      <w:pPr>
-        <w:spacing w:before="120" w:after="40" w:line="269" w:lineRule="auto"/>
-      </w:pPr>
-      <w:r>
-        <w:rPr>
-          <w:b/>
-          <w:sz w:val="22"/>
-        </w:rPr>
-        <w:t>其他字段</w:t>
-      </w:r>
-    </w:p>
-    <w:p>
-      <w:pPr>
-        <w:spacing w:before="0" w:after="80" w:line="269" w:lineRule="auto"/>
-      </w:pPr>
-      <w:r>
-        <w:rPr>
-          <w:sz w:val="20"/>
-        </w:rPr>
-        <w:t>fx_channel（传导渠道：货币政策 / 利差 / 通胀 / 干预 / 风险情绪 / 贸易商品 等）、why_it_matters（为什么影响 USD/JPY 的一两句解释）。</w:t>
-      </w:r>
-    </w:p>
-    <w:p>
-      <w:pPr>
-        <w:spacing w:before="200" w:after="60" w:line="269" w:lineRule="auto"/>
-      </w:pPr>
-      <w:r>
-        <w:rPr>
-          <w:b/>
-          <w:color w:val="1F3B6E"/>
-          <w:sz w:val="26"/>
-        </w:rPr>
-        <w:t>5. 重要边界 / What this is NOT</w:t>
-      </w:r>
-    </w:p>
-    <w:p>
-      <w:pPr>
-        <w:spacing w:before="0" w:after="80" w:line="269" w:lineRule="auto"/>
-      </w:pPr>
-      <w:r>
-        <w:rPr>
-          <w:sz w:val="20"/>
-        </w:rPr>
-        <w:t>这里的 Relevance 是大模型对「叙事层面影响概率」的主观判断，不是用历史行情回测出来的统计相关系数。</w:t>
+        <w:t>Assessment: each selected story is evaluated for relevance, likely USD/JPY direction, confidence, transmission channel, and a short "why it matters" explanation. 评估：每条新闻都会形成相关性、可能方向、信心程度、传导渠道和“为什么重要”的简短解释。</w:t>
       </w:r>
     </w:p>
     <w:p>
       <w:pPr>
         <w:pStyle w:val="ListBullet"/>
-        <w:spacing w:before="0" w:after="40" w:line="269" w:lineRule="auto"/>
+        <w:spacing w:after="40"/>
+      </w:pPr>
+      <w:r>
+        <w:t>Summary: the final briefing uses recent higher-relevance stories, diversifies sources, removes near-duplicates, and produces an overall market read plus a watchlist. 总结：最终简报选取近期高相关新闻，兼顾信源多样性，去除近似重复，并生成整体市场解读和观察清单。</w:t>
+      </w:r>
+    </w:p>
+    <w:p>
+      <w:pPr>
+        <w:spacing w:before="200" w:after="80"/>
       </w:pPr>
       <w:r>
         <w:rPr>
-          <w:sz w:val="20"/>
+          <w:b/>
+          <w:sz w:val="24"/>
         </w:rPr>
-        <w:t>没有接入真实 USD/JPY 行情，也没有做事件—价格的回测验证。</w:t>
+        <w:t>4. Relevance And Direction Logic / 相关性与方向解读</w:t>
       </w:r>
     </w:p>
     <w:p>
       <w:pPr>
         <w:pStyle w:val="ListBullet"/>
-        <w:spacing w:before="0" w:after="40" w:line="269" w:lineRule="auto"/>
+        <w:spacing w:after="40"/>
       </w:pPr>
       <w:r>
-        <w:rPr>
-          <w:sz w:val="20"/>
-        </w:rPr>
-        <w:t>数据源目前为 4 个、偏官方，时效性不及路透/彭博等实时终端。</w:t>
+        <w:t>High relevance: direct BOJ/Fed policy decisions, intervention risk, major inflation/rates surprises, or news with an immediate rate-differential channel. 高相关：直接的日美央行政策、汇率干预风险、重大通胀/利率意外，或对利差有直接影响的新闻。</w:t>
       </w:r>
     </w:p>
     <w:p>
       <w:pPr>
         <w:pStyle w:val="ListBullet"/>
-        <w:spacing w:before="0" w:after="40" w:line="269" w:lineRule="auto"/>
+        <w:spacing w:after="40"/>
       </w:pPr>
       <w:r>
-        <w:rPr>
-          <w:sz w:val="20"/>
-        </w:rPr>
-        <w:t>依赖 LLM 输出结构，单篇打分失败会被跳过（已有容错），但暂无强校验/重试。</w:t>
-      </w:r>
-    </w:p>
-    <w:p>
-      <w:pPr>
-        <w:spacing w:before="0" w:after="80" w:line="269" w:lineRule="auto"/>
-      </w:pPr>
-      <w:r>
-        <w:rPr>
-          <w:sz w:val="20"/>
-        </w:rPr>
-        <w:t>中文注解：作为 MVP 和方法论演示完全够用；若要往交易信号方向走，下一步最值钱的是接行情数据做相关性 / 回测验证。</w:t>
-      </w:r>
-    </w:p>
-    <w:p>
-      <w:pPr>
-        <w:spacing w:before="200" w:after="60" w:line="269" w:lineRule="auto"/>
-      </w:pPr>
-      <w:r>
-        <w:rPr>
-          <w:b/>
-          <w:color w:val="1F3B6E"/>
-          <w:sz w:val="26"/>
-        </w:rPr>
-        <w:t>6. 如何运行 / How to run</w:t>
-      </w:r>
-    </w:p>
-    <w:p>
-      <w:pPr>
-        <w:spacing w:before="0" w:after="80" w:line="269" w:lineRule="auto"/>
-      </w:pPr>
-      <w:r>
-        <w:rPr>
-          <w:sz w:val="20"/>
-        </w:rPr>
-        <w:t>前置：Python 3.10+，在 .env 中配置 DEEPSEEK_API_KEY。</w:t>
+        <w:t>Medium relevance: macro stories with a clear yen or dollar transmission path, such as wages, JGB yields, Treasury yields, oil shocks, or Japan growth data. 中相关：有清晰日元或美元传导路径的宏观新闻，例如工资、日债收益率、美债收益率、油价冲击或日本增长数据。</w:t>
       </w:r>
     </w:p>
     <w:p>
       <w:pPr>
         <w:pStyle w:val="ListBullet"/>
-        <w:spacing w:before="0" w:after="40" w:line="269" w:lineRule="auto"/>
+        <w:spacing w:after="40"/>
       </w:pPr>
       <w:r>
-        <w:rPr>
-          <w:b/>
-          <w:sz w:val="20"/>
-        </w:rPr>
-        <w:t xml:space="preserve">全流程: </w:t>
-      </w:r>
-      <w:r>
-        <w:rPr>
-          <w:sz w:val="20"/>
-        </w:rPr>
-        <w:t>python -m finance_news_tracker run-once   （一键：抓取 → 打分 → 汇总）</w:t>
+        <w:t>Low relevance: indirect but still useful context, such as trade, fiscal, commodity, or broad risk-sentiment developments. 低相关：影响较间接但仍有参考价值的背景信息，例如贸易、财政、商品或整体风险情绪变化。</w:t>
       </w:r>
     </w:p>
     <w:p>
       <w:pPr>
         <w:pStyle w:val="ListBullet"/>
-        <w:spacing w:before="0" w:after="40" w:line="269" w:lineRule="auto"/>
+        <w:spacing w:after="40"/>
       </w:pPr>
       <w:r>
-        <w:rPr>
-          <w:b/>
-          <w:sz w:val="20"/>
-        </w:rPr>
-        <w:t xml:space="preserve">分步: </w:t>
-      </w:r>
-      <w:r>
-        <w:rPr>
-          <w:sz w:val="20"/>
-        </w:rPr>
-        <w:t>collect / score / summarize 也可分步单独运行。</w:t>
+        <w:t>USD/JPY up means the dollar is stronger or the yen is weaker; USD/JPY down means the dollar is weaker or the yen is stronger. USD/JPY 上行表示美元走强或日元走弱；USD/JPY 下行表示美元走弱或日元走强。</w:t>
       </w:r>
     </w:p>
     <w:p>
       <w:pPr>
         <w:pStyle w:val="ListBullet"/>
-        <w:spacing w:before="0" w:after="40" w:line="269" w:lineRule="auto"/>
+        <w:spacing w:after="40"/>
+      </w:pPr>
+      <w:r>
+        <w:t>Mixed or unclear is used when competing forces exist or the headline does not support a clean directional read. 当多种力量相互抵消，或新闻本身不足以支持明确方向时，会标记为 Mixed 或 Unclear。</w:t>
+      </w:r>
+    </w:p>
+    <w:p>
+      <w:pPr>
+        <w:spacing w:before="200" w:after="80"/>
       </w:pPr>
       <w:r>
         <w:rPr>
           <w:b/>
-          <w:sz w:val="20"/>
+          <w:sz w:val="24"/>
         </w:rPr>
-        <w:t xml:space="preserve">定时: </w:t>
-      </w:r>
-      <w:r>
-        <w:rPr>
-          <w:sz w:val="20"/>
-        </w:rPr>
-        <w:t>可用 Windows 任务计划每 2–4 小时自动跑一次。</w:t>
-      </w:r>
-    </w:p>
-    <w:p>
-      <w:pPr>
-        <w:spacing w:before="120" w:after="40" w:line="269" w:lineRule="auto"/>
-      </w:pPr>
-      <w:r>
-        <w:rPr>
-          <w:b/>
-          <w:sz w:val="22"/>
-        </w:rPr>
-        <w:t>输出 / Output</w:t>
+        <w:t>5. Report Structure / 报告结构</w:t>
       </w:r>
     </w:p>
     <w:p>
       <w:pPr>
         <w:pStyle w:val="ListBullet"/>
-        <w:spacing w:before="0" w:after="40" w:line="269" w:lineRule="auto"/>
+        <w:spacing w:after="40"/>
       </w:pPr>
       <w:r>
-        <w:rPr>
-          <w:sz w:val="20"/>
-        </w:rPr>
-        <w:t>data/tracker.db — 本地 SQLite 数据库（去重、历史留存）。</w:t>
+        <w:t>Market Read: one concise paragraph summarizing the overall USD/JPY backdrop from the selected stories. Market Read：用一段话总结精选新闻所呈现的美元/日元整体背景。</w:t>
       </w:r>
     </w:p>
     <w:p>
       <w:pPr>
         <w:pStyle w:val="ListBullet"/>
-        <w:spacing w:before="0" w:after="40" w:line="269" w:lineRule="auto"/>
+        <w:spacing w:after="40"/>
       </w:pPr>
       <w:r>
-        <w:rPr>
-          <w:sz w:val="20"/>
-        </w:rPr>
-        <w:t>summaries/usdjpy_summary_YYYYMMDD_HHMMSS.md — Markdown 摘要。</w:t>
+        <w:t>Top Stories: ranked stories with source, direction, relevance label, business takeaway, date, and read-more link. Top Stories：按重要性排序，展示信源、方向、相关性标签、业务要点、日期和原文链接。</w:t>
       </w:r>
     </w:p>
     <w:p>
       <w:pPr>
         <w:pStyle w:val="ListBullet"/>
-        <w:spacing w:before="0" w:after="40" w:line="269" w:lineRule="auto"/>
+        <w:spacing w:after="40"/>
       </w:pPr>
       <w:r>
-        <w:rPr>
-          <w:sz w:val="20"/>
-        </w:rPr>
-        <w:t>summaries/usdjpy_summary_YYYYMMDD_HHMMSS.docx — Word 摘要（第 1 页执行内容，第 2 页来源引用，每条带日期与超链接）。</w:t>
+        <w:t>Watchlist: upcoming events, risks, or data points that may move USD/JPY next. Watchlist：列出后续可能影响美元/日元的事件、风险或数据。</w:t>
       </w:r>
     </w:p>
     <w:p>
       <w:pPr>
-        <w:spacing w:before="0" w:after="80" w:line="269" w:lineRule="auto"/>
+        <w:pStyle w:val="ListBullet"/>
+        <w:spacing w:after="40"/>
       </w:pPr>
       <w:r>
-        <w:rPr>
-          <w:sz w:val="20"/>
-        </w:rPr>
-        <w:t>时间戳统一显示为香港时间（HK time）。</w:t>
+        <w:t>Source Citations: source links are kept so readers can trace the briefing back to the original public news. Source Citations：保留来源链接，方便读者回溯到原始公开新闻。</w:t>
       </w:r>
     </w:p>
     <w:p>
       <w:pPr>
-        <w:spacing w:before="280" w:after="80" w:line="269" w:lineRule="auto"/>
-        <w:jc w:val="center"/>
+        <w:spacing w:before="200" w:after="80"/>
+      </w:pPr>
+      <w:r>
+        <w:rPr>
+          <w:b/>
+          <w:sz w:val="24"/>
+        </w:rPr>
+        <w:t>6. Business Boundaries / 业务边界</w:t>
+      </w:r>
+    </w:p>
+    <w:p>
+      <w:pPr>
+        <w:pStyle w:val="ListBullet"/>
+        <w:spacing w:after="40"/>
+      </w:pPr>
+      <w:r>
+        <w:t>This tracker explains narrative relevance; it does not prove historical correlation between news and USD/JPY price moves. 本工具解释新闻叙事相关性，不证明新闻与 USD/JPY 价格变化之间的历史统计相关。</w:t>
+      </w:r>
+    </w:p>
+    <w:p>
+      <w:pPr>
+        <w:pStyle w:val="ListBullet"/>
+        <w:spacing w:after="40"/>
+      </w:pPr>
+      <w:r>
+        <w:t>It does not replace real-time terminals, broker quotes, or trader judgment during fast markets. 它不能替代实时终端、券商报价，也不能替代快速行情中的交易员判断。</w:t>
+      </w:r>
+    </w:p>
+    <w:p>
+      <w:pPr>
+        <w:pStyle w:val="ListBullet"/>
+        <w:spacing w:after="40"/>
+      </w:pPr>
+      <w:r>
+        <w:t>Public-source delay, missing metadata, and ambiguous headlines can affect interpretation, so important decisions still require human review. 公开信源延迟、元数据缺失和标题歧义都可能影响解读，重要决策仍需人工复核。</w:t>
+      </w:r>
+    </w:p>
+    <w:p>
+      <w:pPr>
+        <w:pStyle w:val="ListBullet"/>
+        <w:spacing w:after="40"/>
+      </w:pPr>
+      <w:r>
+        <w:t>The source universe is intentionally focused on Japan, US policy, and FX commentary; it is not a complete global macro news terminal. 当前信源有意聚焦日本、美国政策和外汇评论，并不是完整的全球宏观新闻终端。</w:t>
+      </w:r>
+    </w:p>
+    <w:p>
+      <w:pPr>
+        <w:spacing w:before="240"/>
       </w:pPr>
       <w:r>
         <w:rPr>
           <w:i/>
-          <w:color w:val="666666"/>
-          <w:sz w:val="16"/>
+          <w:sz w:val="18"/>
         </w:rPr>
-        <w:t>Generated by finance-news-tracker · 本文档配合最新 executive summary 一起阅读</w:t>
+        <w:t>Updated to match current code behavior. / 已按当前代码行为更新。</w:t>
       </w:r>
     </w:p>
     <w:sectPr>
@@ -1041,8 +738,8 @@
     <w:qFormat/>
     <w:rsid w:val="00FC693F"/>
     <w:rPr>
-      <w:rFonts w:ascii="Calibri" w:hAnsi="Calibri"/>
-      <w:sz w:val="20"/>
+      <w:rFonts w:ascii="Calibri" w:hAnsi="Calibri" w:eastAsia="Microsoft YaHei"/>
+      <w:sz w:val="21"/>
     </w:rPr>
   </w:style>
   <w:style w:type="paragraph" w:styleId="Header">

</xml_diff>

<commit_message>
Add battery OEM sources and JEH entity ranking for jp_storage.
Extend HTML collectors with title/date selectors, add BYD CMS API
collection, and boost Japan Energy Hub EPC candidates without forcing
prefilter pass. Document Japan Energy Storage and USDJPY tracker logic.

Co-authored-by: Cursor <cursoragent@cursor.com>
</commit_message>
<xml_diff>
--- a/docs/USDJPY_News_Tracker_逻辑说明.docx
+++ b/docs/USDJPY_News_Tracker_逻辑说明.docx
@@ -3,32 +3,1165 @@
 <w:document xmlns:wpc="http://schemas.microsoft.com/office/word/2010/wordprocessingCanvas" xmlns:mo="http://schemas.microsoft.com/office/mac/office/2008/main" xmlns:mc="http://schemas.openxmlformats.org/markup-compatibility/2006" xmlns:mv="urn:schemas-microsoft-com:mac:vml" xmlns:o="urn:schemas-microsoft-com:office:office" xmlns:r="http://schemas.openxmlformats.org/officeDocument/2006/relationships" xmlns:m="http://schemas.openxmlformats.org/officeDocument/2006/math" xmlns:v="urn:schemas-microsoft-com:vml" xmlns:wp14="http://schemas.microsoft.com/office/word/2010/wordprocessingDrawing" xmlns:wp="http://schemas.openxmlformats.org/drawingml/2006/wordprocessingDrawing" xmlns:w10="urn:schemas-microsoft-com:office:word" xmlns:w="http://schemas.openxmlformats.org/wordprocessingml/2006/main" xmlns:w14="http://schemas.microsoft.com/office/word/2010/wordml" xmlns:wpg="http://schemas.microsoft.com/office/word/2010/wordprocessingGroup" xmlns:wpi="http://schemas.microsoft.com/office/word/2010/wordprocessingInk" xmlns:wne="http://schemas.microsoft.com/office/word/2006/wordml" xmlns:wps="http://schemas.microsoft.com/office/word/2010/wordprocessingShape" mc:Ignorable="w14 wp14">
   <w:body>
     <w:p>
+      <w:pPr>
+        <w:spacing w:before="720" w:after="160"/>
+      </w:pPr>
       <w:r>
         <w:rPr>
           <w:b/>
-          <w:sz w:val="36"/>
+          <w:color w:val="17365D"/>
+          <w:sz w:val="60"/>
         </w:rPr>
-        <w:t>USD/JPY News Tracker - Business Logic Summary / 业务逻辑说明</w:t>
+        <w:t>USD/JPY News Tracker</w:t>
       </w:r>
     </w:p>
     <w:p>
       <w:pPr>
-        <w:spacing w:after="160"/>
+        <w:spacing w:after="360"/>
       </w:pPr>
       <w:r>
-        <w:t>This document explains the current product logic from a business perspective only. 本文仅从业务角度说明当前 USD/JPY 新闻追踪器的逻辑，不涉及技术实现、服务器部署或运行配置。</w:t>
+        <w:rPr>
+          <w:b/>
+          <w:color w:val="2F75B5"/>
+          <w:sz w:val="36"/>
+        </w:rPr>
+        <w:t>Executive Operating Overview / 管理层运营概览</w:t>
       </w:r>
     </w:p>
     <w:p>
       <w:pPr>
-        <w:spacing w:before="200" w:after="80"/>
+        <w:spacing w:after="360"/>
+      </w:pPr>
+      <w:r>
+        <w:rPr>
+          <w:color w:val="6B7280"/>
+          <w:sz w:val="23"/>
+        </w:rPr>
+        <w:t>A concise view of the AI roles, information sources, workflow, outputs and controls.</w:t>
+      </w:r>
+    </w:p>
+    <w:p>
+      <w:pPr>
+        <w:spacing w:after="480"/>
+      </w:pPr>
+      <w:r>
+        <w:rPr>
+          <w:color w:val="6B7280"/>
+          <w:sz w:val="21"/>
+        </w:rPr>
+        <w:t>简要说明当前 AI 角色、信息来源、工作流程、交付物与管控边界。</w:t>
+      </w:r>
+    </w:p>
+    <w:tbl>
+      <w:tblPr>
+        <w:tblW w:type="auto" w:w="0"/>
+        <w:jc w:val="center"/>
+        <w:tblLayout w:type="autofit"/>
+        <w:tblLook w:firstColumn="1" w:firstRow="1" w:lastColumn="0" w:lastRow="0" w:noHBand="0" w:noVBand="1" w:val="04A0"/>
+      </w:tblPr>
+      <w:tblGrid>
+        <w:gridCol w:w="3408"/>
+        <w:gridCol w:w="3408"/>
+        <w:gridCol w:w="3408"/>
+      </w:tblGrid>
+      <w:tr>
+        <w:tc>
+          <w:tcPr>
+            <w:tcW w:type="dxa" w:w="3408"/>
+            <w:shd w:fill="DDEBF7"/>
+            <w:tcMar>
+              <w:top w:w="140" w:type="dxa"/>
+              <w:start w:w="130" w:type="dxa"/>
+              <w:bottom w:w="130" w:type="dxa"/>
+              <w:end w:w="130" w:type="dxa"/>
+            </w:tcMar>
+            <w:vAlign w:val="center"/>
+          </w:tcPr>
+          <w:p>
+            <w:pPr>
+              <w:spacing w:after="40"/>
+              <w:jc w:val="center"/>
+            </w:pPr>
+            <w:r>
+              <w:rPr>
+                <w:b/>
+                <w:color w:val="17365D"/>
+                <w:sz w:val="48"/>
+              </w:rPr>
+              <w:t>2</w:t>
+            </w:r>
+          </w:p>
+          <w:p>
+            <w:pPr>
+              <w:spacing w:after="20"/>
+              <w:jc w:val="center"/>
+            </w:pPr>
+            <w:r>
+              <w:rPr>
+                <w:b/>
+                <w:sz w:val="19"/>
+              </w:rPr>
+              <w:t>AI roles</w:t>
+            </w:r>
+          </w:p>
+          <w:p>
+            <w:pPr>
+              <w:spacing w:after="0"/>
+              <w:jc w:val="center"/>
+            </w:pPr>
+            <w:r>
+              <w:rPr>
+                <w:color w:val="6B7280"/>
+                <w:sz w:val="17"/>
+              </w:rPr>
+              <w:t>AI 角色</w:t>
+            </w:r>
+          </w:p>
+        </w:tc>
+        <w:tc>
+          <w:tcPr>
+            <w:tcW w:type="dxa" w:w="3408"/>
+            <w:shd w:fill="F3F7FB"/>
+            <w:tcMar>
+              <w:top w:w="140" w:type="dxa"/>
+              <w:start w:w="130" w:type="dxa"/>
+              <w:bottom w:w="130" w:type="dxa"/>
+              <w:end w:w="130" w:type="dxa"/>
+            </w:tcMar>
+            <w:vAlign w:val="center"/>
+          </w:tcPr>
+          <w:p>
+            <w:pPr>
+              <w:spacing w:after="40"/>
+              <w:jc w:val="center"/>
+            </w:pPr>
+            <w:r>
+              <w:rPr>
+                <w:b/>
+                <w:color w:val="17365D"/>
+                <w:sz w:val="48"/>
+              </w:rPr>
+              <w:t>9</w:t>
+            </w:r>
+          </w:p>
+          <w:p>
+            <w:pPr>
+              <w:spacing w:after="20"/>
+              <w:jc w:val="center"/>
+            </w:pPr>
+            <w:r>
+              <w:rPr>
+                <w:b/>
+                <w:sz w:val="19"/>
+              </w:rPr>
+              <w:t>source channels</w:t>
+            </w:r>
+          </w:p>
+          <w:p>
+            <w:pPr>
+              <w:spacing w:after="0"/>
+              <w:jc w:val="center"/>
+            </w:pPr>
+            <w:r>
+              <w:rPr>
+                <w:color w:val="6B7280"/>
+                <w:sz w:val="17"/>
+              </w:rPr>
+              <w:t>信息渠道</w:t>
+            </w:r>
+          </w:p>
+        </w:tc>
+        <w:tc>
+          <w:tcPr>
+            <w:tcW w:type="dxa" w:w="3408"/>
+            <w:shd w:fill="F2F2F2"/>
+            <w:tcMar>
+              <w:top w:w="140" w:type="dxa"/>
+              <w:start w:w="130" w:type="dxa"/>
+              <w:bottom w:w="130" w:type="dxa"/>
+              <w:end w:w="130" w:type="dxa"/>
+            </w:tcMar>
+            <w:vAlign w:val="center"/>
+          </w:tcPr>
+          <w:p>
+            <w:pPr>
+              <w:spacing w:after="40"/>
+              <w:jc w:val="center"/>
+            </w:pPr>
+            <w:r>
+              <w:rPr>
+                <w:b/>
+                <w:color w:val="17365D"/>
+                <w:sz w:val="48"/>
+              </w:rPr>
+              <w:t>1</w:t>
+            </w:r>
+          </w:p>
+          <w:p>
+            <w:pPr>
+              <w:spacing w:after="20"/>
+              <w:jc w:val="center"/>
+            </w:pPr>
+            <w:r>
+              <w:rPr>
+                <w:b/>
+                <w:sz w:val="19"/>
+              </w:rPr>
+              <w:t>executive brief</w:t>
+            </w:r>
+          </w:p>
+          <w:p>
+            <w:pPr>
+              <w:spacing w:after="0"/>
+              <w:jc w:val="center"/>
+            </w:pPr>
+            <w:r>
+              <w:rPr>
+                <w:color w:val="6B7280"/>
+                <w:sz w:val="17"/>
+              </w:rPr>
+              <w:t>管理层简报</w:t>
+            </w:r>
+          </w:p>
+        </w:tc>
+      </w:tr>
+    </w:tbl>
+    <w:p/>
+    <w:p>
+      <w:pPr>
+        <w:pStyle w:val="Heading1"/>
+        <w:keepNext/>
+      </w:pPr>
+      <w:r>
+        <w:t>Executive takeaway</w:t>
+      </w:r>
+      <w:r>
+        <w:rPr>
+          <w:color w:val="2F75B5"/>
+        </w:rPr>
+        <w:t xml:space="preserve">  /  管理层要点</w:t>
+      </w:r>
+    </w:p>
+    <w:p>
+      <w:pPr>
+        <w:spacing w:after="40"/>
+      </w:pPr>
+      <w:r>
+        <w:t>The tracker currently uses two distinct AI roles: one evaluates each news item for USD/JPY relevance and direction; the other interprets market impact and produces the executive briefing.</w:t>
+      </w:r>
+    </w:p>
+    <w:p>
+      <w:pPr>
+        <w:spacing w:after="120"/>
+      </w:pPr>
+      <w:r>
+        <w:rPr>
+          <w:color w:val="6B7280"/>
+          <w:sz w:val="19"/>
+        </w:rPr>
+        <w:t>系统目前设有两个明确的 AI 角色：第一个判断每条新闻与 USD/JPY 的相关性和可能方向；第二个解读市场影响并生成管理层简报。</w:t>
+      </w:r>
+    </w:p>
+    <w:p>
+      <w:pPr>
+        <w:spacing w:after="40"/>
+      </w:pPr>
+      <w:r>
+        <w:t>News collection, scheduling, duplicate removal and delivery are automated workflow components—not separate AI Agents.</w:t>
+      </w:r>
+    </w:p>
+    <w:p>
+      <w:pPr>
+        <w:spacing w:after="120"/>
+      </w:pPr>
+      <w:r>
+        <w:rPr>
+          <w:color w:val="6B7280"/>
+          <w:sz w:val="19"/>
+        </w:rPr>
+        <w:t>新闻采集、定时运行、去重和交付属于自动化流程，并不是独立的 AI Agent。</w:t>
+      </w:r>
+    </w:p>
+    <w:tbl>
+      <w:tblPr>
+        <w:tblStyle w:val="TableGrid"/>
+        <w:tblW w:type="auto" w:w="0"/>
+        <w:jc w:val="center"/>
+        <w:tblLook w:firstColumn="1" w:firstRow="1" w:lastColumn="0" w:lastRow="0" w:noHBand="0" w:noVBand="1" w:val="04A0"/>
+      </w:tblPr>
+      <w:tblGrid>
+        <w:gridCol w:w="2556"/>
+        <w:gridCol w:w="2556"/>
+        <w:gridCol w:w="2556"/>
+        <w:gridCol w:w="2556"/>
+      </w:tblGrid>
+      <w:tr>
+        <w:tc>
+          <w:tcPr>
+            <w:tcW w:type="dxa" w:w="2556"/>
+            <w:shd w:fill="17365D"/>
+            <w:vAlign w:val="center"/>
+            <w:tcMar>
+              <w:top w:w="90" w:type="dxa"/>
+              <w:start w:w="100" w:type="dxa"/>
+              <w:bottom w:w="90" w:type="dxa"/>
+              <w:end w:w="100" w:type="dxa"/>
+            </w:tcMar>
+          </w:tcPr>
+          <w:p>
+            <w:pPr>
+              <w:spacing w:after="20"/>
+            </w:pPr>
+            <w:r/>
+            <w:r>
+              <w:rPr>
+                <w:b/>
+                <w:color w:val="FFFFFF"/>
+                <w:sz w:val="18"/>
+              </w:rPr>
+              <w:t>1  Collect</w:t>
+            </w:r>
+          </w:p>
+          <w:p>
+            <w:pPr>
+              <w:spacing w:after="0"/>
+            </w:pPr>
+            <w:r>
+              <w:rPr>
+                <w:b/>
+                <w:color w:val="FFFFFF"/>
+                <w:sz w:val="17"/>
+              </w:rPr>
+              <w:t>采集</w:t>
+            </w:r>
+          </w:p>
+        </w:tc>
+        <w:tc>
+          <w:tcPr>
+            <w:tcW w:type="dxa" w:w="2556"/>
+            <w:shd w:fill="17365D"/>
+            <w:vAlign w:val="center"/>
+            <w:tcMar>
+              <w:top w:w="90" w:type="dxa"/>
+              <w:start w:w="100" w:type="dxa"/>
+              <w:bottom w:w="90" w:type="dxa"/>
+              <w:end w:w="100" w:type="dxa"/>
+            </w:tcMar>
+          </w:tcPr>
+          <w:p>
+            <w:pPr>
+              <w:spacing w:after="20"/>
+            </w:pPr>
+            <w:r/>
+            <w:r>
+              <w:rPr>
+                <w:b/>
+                <w:color w:val="FFFFFF"/>
+                <w:sz w:val="18"/>
+              </w:rPr>
+              <w:t>2  AI screen</w:t>
+            </w:r>
+          </w:p>
+          <w:p>
+            <w:pPr>
+              <w:spacing w:after="0"/>
+            </w:pPr>
+            <w:r>
+              <w:rPr>
+                <w:b/>
+                <w:color w:val="FFFFFF"/>
+                <w:sz w:val="17"/>
+              </w:rPr>
+              <w:t>AI 筛选</w:t>
+            </w:r>
+          </w:p>
+        </w:tc>
+        <w:tc>
+          <w:tcPr>
+            <w:tcW w:type="dxa" w:w="2556"/>
+            <w:shd w:fill="17365D"/>
+            <w:vAlign w:val="center"/>
+            <w:tcMar>
+              <w:top w:w="90" w:type="dxa"/>
+              <w:start w:w="100" w:type="dxa"/>
+              <w:bottom w:w="90" w:type="dxa"/>
+              <w:end w:w="100" w:type="dxa"/>
+            </w:tcMar>
+          </w:tcPr>
+          <w:p>
+            <w:pPr>
+              <w:spacing w:after="20"/>
+            </w:pPr>
+            <w:r/>
+            <w:r>
+              <w:rPr>
+                <w:b/>
+                <w:color w:val="FFFFFF"/>
+                <w:sz w:val="18"/>
+              </w:rPr>
+              <w:t>3  AI interpret</w:t>
+            </w:r>
+          </w:p>
+          <w:p>
+            <w:pPr>
+              <w:spacing w:after="0"/>
+            </w:pPr>
+            <w:r>
+              <w:rPr>
+                <w:b/>
+                <w:color w:val="FFFFFF"/>
+                <w:sz w:val="17"/>
+              </w:rPr>
+              <w:t>AI 解读</w:t>
+            </w:r>
+          </w:p>
+        </w:tc>
+        <w:tc>
+          <w:tcPr>
+            <w:tcW w:type="dxa" w:w="2556"/>
+            <w:shd w:fill="17365D"/>
+            <w:vAlign w:val="center"/>
+            <w:tcMar>
+              <w:top w:w="90" w:type="dxa"/>
+              <w:start w:w="100" w:type="dxa"/>
+              <w:bottom w:w="90" w:type="dxa"/>
+              <w:end w:w="100" w:type="dxa"/>
+            </w:tcMar>
+          </w:tcPr>
+          <w:p>
+            <w:pPr>
+              <w:spacing w:after="20"/>
+            </w:pPr>
+            <w:r/>
+            <w:r>
+              <w:rPr>
+                <w:b/>
+                <w:color w:val="FFFFFF"/>
+                <w:sz w:val="18"/>
+              </w:rPr>
+              <w:t>4  Deliver</w:t>
+            </w:r>
+          </w:p>
+          <w:p>
+            <w:pPr>
+              <w:spacing w:after="0"/>
+            </w:pPr>
+            <w:r>
+              <w:rPr>
+                <w:b/>
+                <w:color w:val="FFFFFF"/>
+                <w:sz w:val="17"/>
+              </w:rPr>
+              <w:t>交付</w:t>
+            </w:r>
+          </w:p>
+        </w:tc>
+      </w:tr>
+      <w:tr>
+        <w:tc>
+          <w:tcPr>
+            <w:tcW w:type="dxa" w:w="2556"/>
+            <w:shd w:fill="F3F7FB"/>
+            <w:vAlign w:val="center"/>
+            <w:tcMar>
+              <w:top w:w="90" w:type="dxa"/>
+              <w:start w:w="100" w:type="dxa"/>
+              <w:bottom w:w="90" w:type="dxa"/>
+              <w:end w:w="100" w:type="dxa"/>
+            </w:tcMar>
+          </w:tcPr>
+          <w:p>
+            <w:pPr>
+              <w:spacing w:after="20"/>
+            </w:pPr>
+            <w:r/>
+            <w:r>
+              <w:rPr>
+                <w:b w:val="0"/>
+                <w:sz w:val="17"/>
+              </w:rPr>
+              <w:t>Recent public news</w:t>
+            </w:r>
+          </w:p>
+          <w:p>
+            <w:pPr>
+              <w:spacing w:after="0"/>
+            </w:pPr>
+            <w:r>
+              <w:rPr>
+                <w:b w:val="0"/>
+                <w:color w:val="6B7280"/>
+                <w:sz w:val="16"/>
+              </w:rPr>
+              <w:t>近期公开新闻</w:t>
+            </w:r>
+          </w:p>
+        </w:tc>
+        <w:tc>
+          <w:tcPr>
+            <w:tcW w:type="dxa" w:w="2556"/>
+            <w:shd w:fill="F2F2F2"/>
+            <w:vAlign w:val="center"/>
+            <w:tcMar>
+              <w:top w:w="90" w:type="dxa"/>
+              <w:start w:w="100" w:type="dxa"/>
+              <w:bottom w:w="90" w:type="dxa"/>
+              <w:end w:w="100" w:type="dxa"/>
+            </w:tcMar>
+          </w:tcPr>
+          <w:p>
+            <w:pPr>
+              <w:spacing w:after="20"/>
+            </w:pPr>
+            <w:r/>
+            <w:r>
+              <w:rPr>
+                <w:b w:val="0"/>
+                <w:sz w:val="17"/>
+              </w:rPr>
+              <w:t>Relevance &amp; direction</w:t>
+            </w:r>
+          </w:p>
+          <w:p>
+            <w:pPr>
+              <w:spacing w:after="0"/>
+            </w:pPr>
+            <w:r>
+              <w:rPr>
+                <w:b w:val="0"/>
+                <w:color w:val="6B7280"/>
+                <w:sz w:val="16"/>
+              </w:rPr>
+              <w:t>相关性与方向</w:t>
+            </w:r>
+          </w:p>
+        </w:tc>
+        <w:tc>
+          <w:tcPr>
+            <w:tcW w:type="dxa" w:w="2556"/>
+            <w:shd w:fill="F3F7FB"/>
+            <w:vAlign w:val="center"/>
+            <w:tcMar>
+              <w:top w:w="90" w:type="dxa"/>
+              <w:start w:w="100" w:type="dxa"/>
+              <w:bottom w:w="90" w:type="dxa"/>
+              <w:end w:w="100" w:type="dxa"/>
+            </w:tcMar>
+          </w:tcPr>
+          <w:p>
+            <w:pPr>
+              <w:spacing w:after="20"/>
+            </w:pPr>
+            <w:r/>
+            <w:r>
+              <w:rPr>
+                <w:b w:val="0"/>
+                <w:sz w:val="17"/>
+              </w:rPr>
+              <w:t>Impact &amp; watchlist</w:t>
+            </w:r>
+          </w:p>
+          <w:p>
+            <w:pPr>
+              <w:spacing w:after="0"/>
+            </w:pPr>
+            <w:r>
+              <w:rPr>
+                <w:b w:val="0"/>
+                <w:color w:val="6B7280"/>
+                <w:sz w:val="16"/>
+              </w:rPr>
+              <w:t>影响与观察清单</w:t>
+            </w:r>
+          </w:p>
+        </w:tc>
+        <w:tc>
+          <w:tcPr>
+            <w:tcW w:type="dxa" w:w="2556"/>
+            <w:shd w:fill="F2F2F2"/>
+            <w:vAlign w:val="center"/>
+            <w:tcMar>
+              <w:top w:w="90" w:type="dxa"/>
+              <w:start w:w="100" w:type="dxa"/>
+              <w:bottom w:w="90" w:type="dxa"/>
+              <w:end w:w="100" w:type="dxa"/>
+            </w:tcMar>
+          </w:tcPr>
+          <w:p>
+            <w:pPr>
+              <w:spacing w:after="20"/>
+            </w:pPr>
+            <w:r/>
+            <w:r>
+              <w:rPr>
+                <w:b w:val="0"/>
+                <w:sz w:val="17"/>
+              </w:rPr>
+              <w:t>Word executive brief</w:t>
+            </w:r>
+          </w:p>
+          <w:p>
+            <w:pPr>
+              <w:spacing w:after="0"/>
+            </w:pPr>
+            <w:r>
+              <w:rPr>
+                <w:b w:val="0"/>
+                <w:color w:val="6B7280"/>
+                <w:sz w:val="16"/>
+              </w:rPr>
+              <w:t>Word 管理层简报</w:t>
+            </w:r>
+          </w:p>
+        </w:tc>
+      </w:tr>
+    </w:tbl>
+    <w:p>
+      <w:r>
+        <w:br w:type="page"/>
+      </w:r>
+    </w:p>
+    <w:p>
+      <w:pPr>
+        <w:pStyle w:val="Heading1"/>
+        <w:keepNext/>
+      </w:pPr>
+      <w:r>
+        <w:t>1. Current AI Agent model</w:t>
+      </w:r>
+      <w:r>
+        <w:rPr>
+          <w:color w:val="2F75B5"/>
+        </w:rPr>
+        <w:t xml:space="preserve">  /  当前 AI Agent 模式</w:t>
+      </w:r>
+    </w:p>
+    <w:p>
+      <w:pPr>
+        <w:spacing w:after="200"/>
       </w:pPr>
       <w:r>
         <w:rPr>
           <w:b/>
-          <w:sz w:val="24"/>
+          <w:color w:val="548235"/>
+          <w:sz w:val="26"/>
         </w:rPr>
-        <w:t>1. Business Purpose / 业务目标</w:t>
+        <w:t>Business definition: 2 AI Agents / roles</w:t>
+      </w:r>
+    </w:p>
+    <w:tbl>
+      <w:tblPr>
+        <w:tblStyle w:val="TableGrid"/>
+        <w:tblW w:type="auto" w:w="0"/>
+        <w:jc w:val="center"/>
+        <w:tblLook w:firstColumn="1" w:firstRow="1" w:lastColumn="0" w:lastRow="0" w:noHBand="0" w:noVBand="1" w:val="04A0"/>
+      </w:tblPr>
+      <w:tblGrid>
+        <w:gridCol w:w="2556"/>
+        <w:gridCol w:w="2556"/>
+        <w:gridCol w:w="2556"/>
+        <w:gridCol w:w="2556"/>
+      </w:tblGrid>
+      <w:tr>
+        <w:trPr>
+          <w:tblHeader w:val="true"/>
+        </w:trPr>
+        <w:tc>
+          <w:tcPr>
+            <w:tcW w:type="dxa" w:w="2556"/>
+            <w:shd w:fill="17365D"/>
+            <w:vAlign w:val="center"/>
+            <w:tcMar>
+              <w:top w:w="90" w:type="dxa"/>
+              <w:start w:w="100" w:type="dxa"/>
+              <w:bottom w:w="90" w:type="dxa"/>
+              <w:end w:w="100" w:type="dxa"/>
+            </w:tcMar>
+          </w:tcPr>
+          <w:p>
+            <w:pPr>
+              <w:spacing w:after="20"/>
+            </w:pPr>
+            <w:r/>
+            <w:r>
+              <w:rPr>
+                <w:b/>
+                <w:color w:val="FFFFFF"/>
+                <w:sz w:val="17"/>
+              </w:rPr>
+              <w:t>AI role</w:t>
+            </w:r>
+          </w:p>
+          <w:p>
+            <w:pPr>
+              <w:spacing w:after="0"/>
+            </w:pPr>
+            <w:r>
+              <w:rPr>
+                <w:b/>
+                <w:color w:val="FFFFFF"/>
+                <w:sz w:val="16"/>
+              </w:rPr>
+              <w:t>AI 角色</w:t>
+            </w:r>
+          </w:p>
+        </w:tc>
+        <w:tc>
+          <w:tcPr>
+            <w:tcW w:type="dxa" w:w="2556"/>
+            <w:shd w:fill="17365D"/>
+            <w:vAlign w:val="center"/>
+            <w:tcMar>
+              <w:top w:w="90" w:type="dxa"/>
+              <w:start w:w="100" w:type="dxa"/>
+              <w:bottom w:w="90" w:type="dxa"/>
+              <w:end w:w="100" w:type="dxa"/>
+            </w:tcMar>
+          </w:tcPr>
+          <w:p>
+            <w:pPr>
+              <w:spacing w:after="20"/>
+            </w:pPr>
+            <w:r/>
+            <w:r>
+              <w:rPr>
+                <w:b/>
+                <w:color w:val="FFFFFF"/>
+                <w:sz w:val="17"/>
+              </w:rPr>
+              <w:t>Primary task</w:t>
+            </w:r>
+          </w:p>
+          <w:p>
+            <w:pPr>
+              <w:spacing w:after="0"/>
+            </w:pPr>
+            <w:r>
+              <w:rPr>
+                <w:b/>
+                <w:color w:val="FFFFFF"/>
+                <w:sz w:val="16"/>
+              </w:rPr>
+              <w:t>主要任务</w:t>
+            </w:r>
+          </w:p>
+        </w:tc>
+        <w:tc>
+          <w:tcPr>
+            <w:tcW w:type="dxa" w:w="2556"/>
+            <w:shd w:fill="17365D"/>
+            <w:vAlign w:val="center"/>
+            <w:tcMar>
+              <w:top w:w="90" w:type="dxa"/>
+              <w:start w:w="100" w:type="dxa"/>
+              <w:bottom w:w="90" w:type="dxa"/>
+              <w:end w:w="100" w:type="dxa"/>
+            </w:tcMar>
+          </w:tcPr>
+          <w:p>
+            <w:pPr>
+              <w:spacing w:after="20"/>
+            </w:pPr>
+            <w:r/>
+            <w:r>
+              <w:rPr>
+                <w:b/>
+                <w:color w:val="FFFFFF"/>
+                <w:sz w:val="17"/>
+              </w:rPr>
+              <w:t>Business output</w:t>
+            </w:r>
+          </w:p>
+          <w:p>
+            <w:pPr>
+              <w:spacing w:after="0"/>
+            </w:pPr>
+            <w:r>
+              <w:rPr>
+                <w:b/>
+                <w:color w:val="FFFFFF"/>
+                <w:sz w:val="16"/>
+              </w:rPr>
+              <w:t>业务产出</w:t>
+            </w:r>
+          </w:p>
+        </w:tc>
+        <w:tc>
+          <w:tcPr>
+            <w:tcW w:type="dxa" w:w="2556"/>
+            <w:shd w:fill="17365D"/>
+            <w:vAlign w:val="center"/>
+            <w:tcMar>
+              <w:top w:w="90" w:type="dxa"/>
+              <w:start w:w="100" w:type="dxa"/>
+              <w:bottom w:w="90" w:type="dxa"/>
+              <w:end w:w="100" w:type="dxa"/>
+            </w:tcMar>
+          </w:tcPr>
+          <w:p>
+            <w:pPr>
+              <w:spacing w:after="20"/>
+            </w:pPr>
+            <w:r/>
+            <w:r>
+              <w:rPr>
+                <w:b/>
+                <w:color w:val="FFFFFF"/>
+                <w:sz w:val="17"/>
+              </w:rPr>
+              <w:t>What it does not do</w:t>
+            </w:r>
+          </w:p>
+          <w:p>
+            <w:pPr>
+              <w:spacing w:after="0"/>
+            </w:pPr>
+            <w:r>
+              <w:rPr>
+                <w:b/>
+                <w:color w:val="FFFFFF"/>
+                <w:sz w:val="16"/>
+              </w:rPr>
+              <w:t>不负责事项</w:t>
+            </w:r>
+          </w:p>
+        </w:tc>
+      </w:tr>
+      <w:tr>
+        <w:tc>
+          <w:tcPr>
+            <w:tcW w:type="dxa" w:w="2556"/>
+            <w:shd w:fill="FFFFFF"/>
+            <w:vAlign w:val="center"/>
+            <w:tcMar>
+              <w:top w:w="90" w:type="dxa"/>
+              <w:start w:w="100" w:type="dxa"/>
+              <w:bottom w:w="90" w:type="dxa"/>
+              <w:end w:w="100" w:type="dxa"/>
+            </w:tcMar>
+          </w:tcPr>
+          <w:p>
+            <w:pPr>
+              <w:spacing w:after="20"/>
+            </w:pPr>
+            <w:r/>
+            <w:r>
+              <w:rPr>
+                <w:b/>
+                <w:sz w:val="17"/>
+              </w:rPr>
+              <w:t>Agent 1</w:t>
+              <w:br/>
+              <w:t>News Relevance &amp; Signal</w:t>
+            </w:r>
+          </w:p>
+          <w:p>
+            <w:pPr>
+              <w:spacing w:after="0"/>
+            </w:pPr>
+            <w:r>
+              <w:rPr>
+                <w:b/>
+                <w:color w:val="6B7280"/>
+                <w:sz w:val="16"/>
+              </w:rPr>
+              <w:t>新闻相关性与信号判断</w:t>
+            </w:r>
+          </w:p>
+        </w:tc>
+        <w:tc>
+          <w:tcPr>
+            <w:tcW w:type="dxa" w:w="2556"/>
+            <w:shd w:fill="FFFFFF"/>
+            <w:vAlign w:val="center"/>
+            <w:tcMar>
+              <w:top w:w="90" w:type="dxa"/>
+              <w:start w:w="100" w:type="dxa"/>
+              <w:bottom w:w="90" w:type="dxa"/>
+              <w:end w:w="100" w:type="dxa"/>
+            </w:tcMar>
+          </w:tcPr>
+          <w:p>
+            <w:pPr>
+              <w:spacing w:after="20"/>
+            </w:pPr>
+            <w:r/>
+            <w:r>
+              <w:rPr>
+                <w:b w:val="0"/>
+                <w:sz w:val="17"/>
+              </w:rPr>
+              <w:t>Reviews each shortlisted item; assesses USD/JPY relevance, theme, likely direction and confidence.</w:t>
+            </w:r>
+          </w:p>
+          <w:p>
+            <w:pPr>
+              <w:spacing w:after="0"/>
+            </w:pPr>
+            <w:r>
+              <w:rPr>
+                <w:b w:val="0"/>
+                <w:color w:val="6B7280"/>
+                <w:sz w:val="16"/>
+              </w:rPr>
+              <w:t>审阅每条候选新闻，判断 USD/JPY 相关性、主题、可能方向及置信度。</w:t>
+            </w:r>
+          </w:p>
+        </w:tc>
+        <w:tc>
+          <w:tcPr>
+            <w:tcW w:type="dxa" w:w="2556"/>
+            <w:shd w:fill="FFFFFF"/>
+            <w:vAlign w:val="center"/>
+            <w:tcMar>
+              <w:top w:w="90" w:type="dxa"/>
+              <w:start w:w="100" w:type="dxa"/>
+              <w:bottom w:w="90" w:type="dxa"/>
+              <w:end w:w="100" w:type="dxa"/>
+            </w:tcMar>
+          </w:tcPr>
+          <w:p>
+            <w:pPr>
+              <w:spacing w:after="20"/>
+            </w:pPr>
+            <w:r/>
+            <w:r>
+              <w:rPr>
+                <w:b w:val="0"/>
+                <w:sz w:val="17"/>
+              </w:rPr>
+              <w:t>Prioritized news with a short explanation of why it matters.</w:t>
+            </w:r>
+          </w:p>
+          <w:p>
+            <w:pPr>
+              <w:spacing w:after="0"/>
+            </w:pPr>
+            <w:r>
+              <w:rPr>
+                <w:b w:val="0"/>
+                <w:color w:val="6B7280"/>
+                <w:sz w:val="16"/>
+              </w:rPr>
+              <w:t>形成新闻优先级及“为何重要”的简要说明。</w:t>
+            </w:r>
+          </w:p>
+        </w:tc>
+        <w:tc>
+          <w:tcPr>
+            <w:tcW w:type="dxa" w:w="2556"/>
+            <w:shd w:fill="FFFFFF"/>
+            <w:vAlign w:val="center"/>
+            <w:tcMar>
+              <w:top w:w="90" w:type="dxa"/>
+              <w:start w:w="100" w:type="dxa"/>
+              <w:bottom w:w="90" w:type="dxa"/>
+              <w:end w:w="100" w:type="dxa"/>
+            </w:tcMar>
+          </w:tcPr>
+          <w:p>
+            <w:pPr>
+              <w:spacing w:after="20"/>
+            </w:pPr>
+            <w:r/>
+            <w:r>
+              <w:rPr>
+                <w:b w:val="0"/>
+                <w:sz w:val="17"/>
+              </w:rPr>
+              <w:t>Does not execute trades or prove price causality.</w:t>
+            </w:r>
+          </w:p>
+          <w:p>
+            <w:pPr>
+              <w:spacing w:after="0"/>
+            </w:pPr>
+            <w:r>
+              <w:rPr>
+                <w:b w:val="0"/>
+                <w:color w:val="6B7280"/>
+                <w:sz w:val="16"/>
+              </w:rPr>
+              <w:t>不执行交易，也不证明新闻与价格之间的因果关系。</w:t>
+            </w:r>
+          </w:p>
+        </w:tc>
+      </w:tr>
+      <w:tr>
+        <w:tc>
+          <w:tcPr>
+            <w:tcW w:type="dxa" w:w="2556"/>
+            <w:shd w:fill="F3F7FB"/>
+            <w:vAlign w:val="center"/>
+            <w:tcMar>
+              <w:top w:w="90" w:type="dxa"/>
+              <w:start w:w="100" w:type="dxa"/>
+              <w:bottom w:w="90" w:type="dxa"/>
+              <w:end w:w="100" w:type="dxa"/>
+            </w:tcMar>
+          </w:tcPr>
+          <w:p>
+            <w:pPr>
+              <w:spacing w:after="20"/>
+            </w:pPr>
+            <w:r/>
+            <w:r>
+              <w:rPr>
+                <w:b/>
+                <w:sz w:val="17"/>
+              </w:rPr>
+              <w:t>Agent 2</w:t>
+              <w:br/>
+              <w:t>Market Impact &amp; Briefing</w:t>
+            </w:r>
+          </w:p>
+          <w:p>
+            <w:pPr>
+              <w:spacing w:after="0"/>
+            </w:pPr>
+            <w:r>
+              <w:rPr>
+                <w:b/>
+                <w:color w:val="6B7280"/>
+                <w:sz w:val="16"/>
+              </w:rPr>
+              <w:t>市场影响与简报生成</w:t>
+            </w:r>
+          </w:p>
+        </w:tc>
+        <w:tc>
+          <w:tcPr>
+            <w:tcW w:type="dxa" w:w="2556"/>
+            <w:shd w:fill="F3F7FB"/>
+            <w:vAlign w:val="center"/>
+            <w:tcMar>
+              <w:top w:w="90" w:type="dxa"/>
+              <w:start w:w="100" w:type="dxa"/>
+              <w:bottom w:w="90" w:type="dxa"/>
+              <w:end w:w="100" w:type="dxa"/>
+            </w:tcMar>
+          </w:tcPr>
+          <w:p>
+            <w:pPr>
+              <w:spacing w:after="20"/>
+            </w:pPr>
+            <w:r/>
+            <w:r>
+              <w:rPr>
+                <w:b w:val="0"/>
+                <w:sz w:val="17"/>
+              </w:rPr>
+              <w:t>Interprets transmission to USD/JPY, identifies the key institution/theme, suggests follow-up, and synthesizes the overall market read.</w:t>
+            </w:r>
+          </w:p>
+          <w:p>
+            <w:pPr>
+              <w:spacing w:after="0"/>
+            </w:pPr>
+            <w:r>
+              <w:rPr>
+                <w:b w:val="0"/>
+                <w:color w:val="6B7280"/>
+                <w:sz w:val="16"/>
+              </w:rPr>
+              <w:t>解读新闻如何影响 USD/JPY，识别关键机构或主题，提出后续关注点，并汇总整体市场判断。</w:t>
+            </w:r>
+          </w:p>
+        </w:tc>
+        <w:tc>
+          <w:tcPr>
+            <w:tcW w:type="dxa" w:w="2556"/>
+            <w:shd w:fill="F3F7FB"/>
+            <w:vAlign w:val="center"/>
+            <w:tcMar>
+              <w:top w:w="90" w:type="dxa"/>
+              <w:start w:w="100" w:type="dxa"/>
+              <w:bottom w:w="90" w:type="dxa"/>
+              <w:end w:w="100" w:type="dxa"/>
+            </w:tcMar>
+          </w:tcPr>
+          <w:p>
+            <w:pPr>
+              <w:spacing w:after="20"/>
+            </w:pPr>
+            <w:r/>
+            <w:r>
+              <w:rPr>
+                <w:b w:val="0"/>
+                <w:sz w:val="17"/>
+              </w:rPr>
+              <w:t>Executive narrative, top stories, monitoring actions and watchlist.</w:t>
+            </w:r>
+          </w:p>
+          <w:p>
+            <w:pPr>
+              <w:spacing w:after="0"/>
+            </w:pPr>
+            <w:r>
+              <w:rPr>
+                <w:b w:val="0"/>
+                <w:color w:val="6B7280"/>
+                <w:sz w:val="16"/>
+              </w:rPr>
+              <w:t>生成管理层摘要、重点新闻、监测建议及观察清单。</w:t>
+            </w:r>
+          </w:p>
+        </w:tc>
+        <w:tc>
+          <w:tcPr>
+            <w:tcW w:type="dxa" w:w="2556"/>
+            <w:shd w:fill="F3F7FB"/>
+            <w:vAlign w:val="center"/>
+            <w:tcMar>
+              <w:top w:w="90" w:type="dxa"/>
+              <w:start w:w="100" w:type="dxa"/>
+              <w:bottom w:w="90" w:type="dxa"/>
+              <w:end w:w="100" w:type="dxa"/>
+            </w:tcMar>
+          </w:tcPr>
+          <w:p>
+            <w:pPr>
+              <w:spacing w:after="20"/>
+            </w:pPr>
+            <w:r/>
+            <w:r>
+              <w:rPr>
+                <w:b w:val="0"/>
+                <w:sz w:val="17"/>
+              </w:rPr>
+              <w:t>Does not replace trader judgment or real-time market terminals.</w:t>
+            </w:r>
+          </w:p>
+          <w:p>
+            <w:pPr>
+              <w:spacing w:after="0"/>
+            </w:pPr>
+            <w:r>
+              <w:rPr>
+                <w:b w:val="0"/>
+                <w:color w:val="6B7280"/>
+                <w:sz w:val="16"/>
+              </w:rPr>
+              <w:t>不替代交易员判断或实时市场终端。</w:t>
+            </w:r>
+          </w:p>
+        </w:tc>
+      </w:tr>
+    </w:tbl>
+    <w:p/>
+    <w:p>
+      <w:pPr>
+        <w:pStyle w:val="Heading2"/>
+        <w:keepNext/>
+      </w:pPr>
+      <w:r>
+        <w:t>How the roles work together</w:t>
+      </w:r>
+      <w:r>
+        <w:rPr>
+          <w:color w:val="2F75B5"/>
+        </w:rPr>
+        <w:t xml:space="preserve">  /  两个角色如何协作</w:t>
       </w:r>
     </w:p>
     <w:p>
@@ -37,7 +1170,20 @@
         <w:spacing w:after="40"/>
       </w:pPr>
       <w:r>
-        <w:t>Purpose: turn scattered Japan, US policy, and FX market news into a concise USD/JPY briefing for traders and analysts. 目标：把分散的日本、美国政策和外汇市场新闻，整理成可快速阅读的美元/日元简报。</w:t>
+        <w:t>Agent 1 creates consistency at scale by applying the same USD/JPY lens to every candidate item.</w:t>
+      </w:r>
+    </w:p>
+    <w:p>
+      <w:pPr>
+        <w:pStyle w:val="ListBullet"/>
+        <w:spacing w:after="120"/>
+      </w:pPr>
+      <w:r>
+        <w:rPr>
+          <w:color w:val="6B7280"/>
+          <w:sz w:val="19"/>
+        </w:rPr>
+        <w:t>Agent 1 对所有候选新闻使用一致的 USD/JPY 判断标准，确保批量处理的一致性。</w:t>
       </w:r>
     </w:p>
     <w:p>
@@ -46,7 +1192,20 @@
         <w:spacing w:after="40"/>
       </w:pPr>
       <w:r>
-        <w:t>The brief is designed to answer three business questions: what happened, why it matters for USD/JPY, and what to watch next. 简报重点回答三个问题：发生了什么、为什么影响 USD/JPY、下一步关注什么。</w:t>
+        <w:t>Agent 2 adds context and converts the ranked items into an executive-level view of market drivers and next watchpoints.</w:t>
+      </w:r>
+    </w:p>
+    <w:p>
+      <w:pPr>
+        <w:pStyle w:val="ListBullet"/>
+        <w:spacing w:after="120"/>
+      </w:pPr>
+      <w:r>
+        <w:rPr>
+          <w:color w:val="6B7280"/>
+          <w:sz w:val="19"/>
+        </w:rPr>
+        <w:t>Agent 2 补充市场语境，将已排序新闻转化为管理层可读的市场驱动因素及后续观察点。</w:t>
       </w:r>
     </w:p>
     <w:p>
@@ -55,19 +1214,1808 @@
         <w:spacing w:after="40"/>
       </w:pPr>
       <w:r>
-        <w:t>The output is decision-support context, not a buy/sell instruction or a statistically tested trading signal. 输出定位是决策辅助信息，不是买卖建议，也不是经过统计回测的交易信号。</w:t>
+        <w:t>The two roles can use different AI models if required, while remaining one controlled workflow.</w:t>
       </w:r>
     </w:p>
     <w:p>
       <w:pPr>
-        <w:spacing w:before="200" w:after="80"/>
+        <w:pStyle w:val="ListBullet"/>
+        <w:spacing w:after="120"/>
       </w:pPr>
       <w:r>
         <w:rPr>
-          <w:b/>
-          <w:sz w:val="24"/>
+          <w:color w:val="6B7280"/>
+          <w:sz w:val="19"/>
         </w:rPr>
-        <w:t>2. Source Coverage / 信息覆盖范围</w:t>
+        <w:t>如业务需要，两个角色可使用不同 AI 模型，但仍在同一受控流程内运行。</w:t>
+      </w:r>
+    </w:p>
+    <w:p>
+      <w:r>
+        <w:br w:type="page"/>
+      </w:r>
+    </w:p>
+    <w:p>
+      <w:pPr>
+        <w:pStyle w:val="Heading1"/>
+        <w:keepNext/>
+      </w:pPr>
+      <w:r>
+        <w:t>2. Information sources</w:t>
+      </w:r>
+      <w:r>
+        <w:rPr>
+          <w:color w:val="2F75B5"/>
+        </w:rPr>
+        <w:t xml:space="preserve">  /  信息来源</w:t>
+      </w:r>
+    </w:p>
+    <w:p>
+      <w:pPr>
+        <w:spacing w:after="40"/>
+      </w:pPr>
+      <w:r>
+        <w:t>The current scope comprises nine public source channels across official institutions and established financial media. Official policy sources receive priority; FX media provides supplementary market context.</w:t>
+      </w:r>
+    </w:p>
+    <w:p>
+      <w:pPr>
+        <w:spacing w:after="120"/>
+      </w:pPr>
+      <w:r>
+        <w:rPr>
+          <w:color w:val="6B7280"/>
+          <w:sz w:val="19"/>
+        </w:rPr>
+        <w:t>当前覆盖 9 个公开信息渠道，包括官方机构和主流财经媒体。官方政策来源优先，外汇媒体用于补充市场观点。</w:t>
+      </w:r>
+    </w:p>
+    <w:tbl>
+      <w:tblPr>
+        <w:tblStyle w:val="TableGrid"/>
+        <w:tblW w:type="auto" w:w="0"/>
+        <w:jc w:val="center"/>
+        <w:tblLook w:firstColumn="1" w:firstRow="1" w:lastColumn="0" w:lastRow="0" w:noHBand="0" w:noVBand="1" w:val="04A0"/>
+      </w:tblPr>
+      <w:tblGrid>
+        <w:gridCol w:w="3408"/>
+        <w:gridCol w:w="3408"/>
+        <w:gridCol w:w="3408"/>
+      </w:tblGrid>
+      <w:tr>
+        <w:trPr>
+          <w:tblHeader w:val="true"/>
+        </w:trPr>
+        <w:tc>
+          <w:tcPr>
+            <w:tcW w:type="dxa" w:w="3408"/>
+            <w:shd w:fill="17365D"/>
+            <w:vAlign w:val="center"/>
+            <w:tcMar>
+              <w:top w:w="90" w:type="dxa"/>
+              <w:start w:w="100" w:type="dxa"/>
+              <w:bottom w:w="90" w:type="dxa"/>
+              <w:end w:w="100" w:type="dxa"/>
+            </w:tcMar>
+          </w:tcPr>
+          <w:p>
+            <w:pPr>
+              <w:spacing w:after="20"/>
+            </w:pPr>
+            <w:r/>
+            <w:r>
+              <w:rPr>
+                <w:b/>
+                <w:color w:val="FFFFFF"/>
+                <w:sz w:val="18"/>
+              </w:rPr>
+              <w:t>Source group</w:t>
+            </w:r>
+          </w:p>
+          <w:p>
+            <w:pPr>
+              <w:spacing w:after="0"/>
+            </w:pPr>
+            <w:r>
+              <w:rPr>
+                <w:b/>
+                <w:color w:val="FFFFFF"/>
+                <w:sz w:val="17"/>
+              </w:rPr>
+              <w:t>来源类别</w:t>
+            </w:r>
+          </w:p>
+        </w:tc>
+        <w:tc>
+          <w:tcPr>
+            <w:tcW w:type="dxa" w:w="3408"/>
+            <w:shd w:fill="17365D"/>
+            <w:vAlign w:val="center"/>
+            <w:tcMar>
+              <w:top w:w="90" w:type="dxa"/>
+              <w:start w:w="100" w:type="dxa"/>
+              <w:bottom w:w="90" w:type="dxa"/>
+              <w:end w:w="100" w:type="dxa"/>
+            </w:tcMar>
+          </w:tcPr>
+          <w:p>
+            <w:pPr>
+              <w:spacing w:after="20"/>
+            </w:pPr>
+            <w:r/>
+            <w:r>
+              <w:rPr>
+                <w:b/>
+                <w:color w:val="FFFFFF"/>
+                <w:sz w:val="18"/>
+              </w:rPr>
+              <w:t>Current channels</w:t>
+            </w:r>
+          </w:p>
+          <w:p>
+            <w:pPr>
+              <w:spacing w:after="0"/>
+            </w:pPr>
+            <w:r>
+              <w:rPr>
+                <w:b/>
+                <w:color w:val="FFFFFF"/>
+                <w:sz w:val="17"/>
+              </w:rPr>
+              <w:t>当前渠道</w:t>
+            </w:r>
+          </w:p>
+        </w:tc>
+        <w:tc>
+          <w:tcPr>
+            <w:tcW w:type="dxa" w:w="3408"/>
+            <w:shd w:fill="17365D"/>
+            <w:vAlign w:val="center"/>
+            <w:tcMar>
+              <w:top w:w="90" w:type="dxa"/>
+              <w:start w:w="100" w:type="dxa"/>
+              <w:bottom w:w="90" w:type="dxa"/>
+              <w:end w:w="100" w:type="dxa"/>
+            </w:tcMar>
+          </w:tcPr>
+          <w:p>
+            <w:pPr>
+              <w:spacing w:after="20"/>
+            </w:pPr>
+            <w:r/>
+            <w:r>
+              <w:rPr>
+                <w:b/>
+                <w:color w:val="FFFFFF"/>
+                <w:sz w:val="18"/>
+              </w:rPr>
+              <w:t>Information captured</w:t>
+            </w:r>
+          </w:p>
+          <w:p>
+            <w:pPr>
+              <w:spacing w:after="0"/>
+            </w:pPr>
+            <w:r>
+              <w:rPr>
+                <w:b/>
+                <w:color w:val="FFFFFF"/>
+                <w:sz w:val="17"/>
+              </w:rPr>
+              <w:t>抓取内容</w:t>
+            </w:r>
+          </w:p>
+        </w:tc>
+      </w:tr>
+      <w:tr>
+        <w:tc>
+          <w:tcPr>
+            <w:tcW w:type="dxa" w:w="3408"/>
+            <w:shd w:fill="FFFFFF"/>
+            <w:vAlign w:val="center"/>
+            <w:tcMar>
+              <w:top w:w="90" w:type="dxa"/>
+              <w:start w:w="100" w:type="dxa"/>
+              <w:bottom w:w="90" w:type="dxa"/>
+              <w:end w:w="100" w:type="dxa"/>
+            </w:tcMar>
+          </w:tcPr>
+          <w:p>
+            <w:pPr>
+              <w:spacing w:after="20"/>
+            </w:pPr>
+            <w:r/>
+            <w:r>
+              <w:rPr>
+                <w:b/>
+                <w:sz w:val="17"/>
+              </w:rPr>
+              <w:t>Japan — official</w:t>
+            </w:r>
+          </w:p>
+          <w:p>
+            <w:pPr>
+              <w:spacing w:after="0"/>
+            </w:pPr>
+            <w:r>
+              <w:rPr>
+                <w:b/>
+                <w:color w:val="6B7280"/>
+                <w:sz w:val="16"/>
+              </w:rPr>
+              <w:t>日本官方</w:t>
+            </w:r>
+          </w:p>
+        </w:tc>
+        <w:tc>
+          <w:tcPr>
+            <w:tcW w:type="dxa" w:w="3408"/>
+            <w:shd w:fill="FFFFFF"/>
+            <w:vAlign w:val="center"/>
+            <w:tcMar>
+              <w:top w:w="90" w:type="dxa"/>
+              <w:start w:w="100" w:type="dxa"/>
+              <w:bottom w:w="90" w:type="dxa"/>
+              <w:end w:w="100" w:type="dxa"/>
+            </w:tcMar>
+          </w:tcPr>
+          <w:p>
+            <w:pPr>
+              <w:spacing w:after="20"/>
+            </w:pPr>
+            <w:r/>
+            <w:r>
+              <w:rPr>
+                <w:b w:val="0"/>
+                <w:sz w:val="17"/>
+              </w:rPr>
+              <w:t>Bank of Japan: What's New</w:t>
+              <w:br/>
+              <w:t>Bank of Japan: Statistics</w:t>
+            </w:r>
+          </w:p>
+          <w:p>
+            <w:pPr>
+              <w:spacing w:after="0"/>
+            </w:pPr>
+            <w:r>
+              <w:rPr>
+                <w:b w:val="0"/>
+                <w:color w:val="6B7280"/>
+                <w:sz w:val="16"/>
+              </w:rPr>
+              <w:t>日本银行：最新发布</w:t>
+              <w:br/>
+              <w:t>日本银行：统计数据</w:t>
+            </w:r>
+          </w:p>
+        </w:tc>
+        <w:tc>
+          <w:tcPr>
+            <w:tcW w:type="dxa" w:w="3408"/>
+            <w:shd w:fill="FFFFFF"/>
+            <w:vAlign w:val="center"/>
+            <w:tcMar>
+              <w:top w:w="90" w:type="dxa"/>
+              <w:start w:w="100" w:type="dxa"/>
+              <w:bottom w:w="90" w:type="dxa"/>
+              <w:end w:w="100" w:type="dxa"/>
+            </w:tcMar>
+          </w:tcPr>
+          <w:p>
+            <w:pPr>
+              <w:spacing w:after="20"/>
+            </w:pPr>
+            <w:r/>
+            <w:r>
+              <w:rPr>
+                <w:b w:val="0"/>
+                <w:sz w:val="17"/>
+              </w:rPr>
+              <w:t>Policy announcements, official publications, monetary and economic statistics.</w:t>
+            </w:r>
+          </w:p>
+          <w:p>
+            <w:pPr>
+              <w:spacing w:after="0"/>
+            </w:pPr>
+            <w:r>
+              <w:rPr>
+                <w:b w:val="0"/>
+                <w:color w:val="6B7280"/>
+                <w:sz w:val="16"/>
+              </w:rPr>
+              <w:t>政策公告、官方发布、货币及经济统计数据。</w:t>
+            </w:r>
+          </w:p>
+        </w:tc>
+      </w:tr>
+      <w:tr>
+        <w:tc>
+          <w:tcPr>
+            <w:tcW w:type="dxa" w:w="3408"/>
+            <w:shd w:fill="F3F7FB"/>
+            <w:vAlign w:val="center"/>
+            <w:tcMar>
+              <w:top w:w="90" w:type="dxa"/>
+              <w:start w:w="100" w:type="dxa"/>
+              <w:bottom w:w="90" w:type="dxa"/>
+              <w:end w:w="100" w:type="dxa"/>
+            </w:tcMar>
+          </w:tcPr>
+          <w:p>
+            <w:pPr>
+              <w:spacing w:after="20"/>
+            </w:pPr>
+            <w:r/>
+            <w:r>
+              <w:rPr>
+                <w:b/>
+                <w:sz w:val="17"/>
+              </w:rPr>
+              <w:t>Japan — media</w:t>
+            </w:r>
+          </w:p>
+          <w:p>
+            <w:pPr>
+              <w:spacing w:after="0"/>
+            </w:pPr>
+            <w:r>
+              <w:rPr>
+                <w:b/>
+                <w:color w:val="6B7280"/>
+                <w:sz w:val="16"/>
+              </w:rPr>
+              <w:t>日本媒体</w:t>
+            </w:r>
+          </w:p>
+        </w:tc>
+        <w:tc>
+          <w:tcPr>
+            <w:tcW w:type="dxa" w:w="3408"/>
+            <w:shd w:fill="F3F7FB"/>
+            <w:vAlign w:val="center"/>
+            <w:tcMar>
+              <w:top w:w="90" w:type="dxa"/>
+              <w:start w:w="100" w:type="dxa"/>
+              <w:bottom w:w="90" w:type="dxa"/>
+              <w:end w:w="100" w:type="dxa"/>
+            </w:tcMar>
+          </w:tcPr>
+          <w:p>
+            <w:pPr>
+              <w:spacing w:after="20"/>
+            </w:pPr>
+            <w:r/>
+            <w:r>
+              <w:rPr>
+                <w:b w:val="0"/>
+                <w:sz w:val="17"/>
+              </w:rPr>
+              <w:t>Nikkei Asia</w:t>
+              <w:br/>
+              <w:t>NHK WORLD-JAPAN</w:t>
+            </w:r>
+          </w:p>
+          <w:p>
+            <w:pPr>
+              <w:spacing w:after="0"/>
+            </w:pPr>
+            <w:r>
+              <w:rPr>
+                <w:b w:val="0"/>
+                <w:color w:val="6B7280"/>
+                <w:sz w:val="16"/>
+              </w:rPr>
+              <w:t>Nikkei Asia</w:t>
+              <w:br/>
+              <w:t>NHK WORLD-JAPAN</w:t>
+            </w:r>
+          </w:p>
+        </w:tc>
+        <w:tc>
+          <w:tcPr>
+            <w:tcW w:type="dxa" w:w="3408"/>
+            <w:shd w:fill="F3F7FB"/>
+            <w:vAlign w:val="center"/>
+            <w:tcMar>
+              <w:top w:w="90" w:type="dxa"/>
+              <w:start w:w="100" w:type="dxa"/>
+              <w:bottom w:w="90" w:type="dxa"/>
+              <w:end w:w="100" w:type="dxa"/>
+            </w:tcMar>
+          </w:tcPr>
+          <w:p>
+            <w:pPr>
+              <w:spacing w:after="20"/>
+            </w:pPr>
+            <w:r/>
+            <w:r>
+              <w:rPr>
+                <w:b w:val="0"/>
+                <w:sz w:val="17"/>
+              </w:rPr>
+              <w:t>Japan macro, policy, corporate and market developments relevant to the yen.</w:t>
+            </w:r>
+          </w:p>
+          <w:p>
+            <w:pPr>
+              <w:spacing w:after="0"/>
+            </w:pPr>
+            <w:r>
+              <w:rPr>
+                <w:b w:val="0"/>
+                <w:color w:val="6B7280"/>
+                <w:sz w:val="16"/>
+              </w:rPr>
+              <w:t>与日元相关的日本宏观、政策、企业及市场动态。</w:t>
+            </w:r>
+          </w:p>
+        </w:tc>
+      </w:tr>
+      <w:tr>
+        <w:tc>
+          <w:tcPr>
+            <w:tcW w:type="dxa" w:w="3408"/>
+            <w:shd w:fill="FFFFFF"/>
+            <w:vAlign w:val="center"/>
+            <w:tcMar>
+              <w:top w:w="90" w:type="dxa"/>
+              <w:start w:w="100" w:type="dxa"/>
+              <w:bottom w:w="90" w:type="dxa"/>
+              <w:end w:w="100" w:type="dxa"/>
+            </w:tcMar>
+          </w:tcPr>
+          <w:p>
+            <w:pPr>
+              <w:spacing w:after="20"/>
+            </w:pPr>
+            <w:r/>
+            <w:r>
+              <w:rPr>
+                <w:b/>
+                <w:sz w:val="17"/>
+              </w:rPr>
+              <w:t>United States — official</w:t>
+            </w:r>
+          </w:p>
+          <w:p>
+            <w:pPr>
+              <w:spacing w:after="0"/>
+            </w:pPr>
+            <w:r>
+              <w:rPr>
+                <w:b/>
+                <w:color w:val="6B7280"/>
+                <w:sz w:val="16"/>
+              </w:rPr>
+              <w:t>美国官方</w:t>
+            </w:r>
+          </w:p>
+        </w:tc>
+        <w:tc>
+          <w:tcPr>
+            <w:tcW w:type="dxa" w:w="3408"/>
+            <w:shd w:fill="FFFFFF"/>
+            <w:vAlign w:val="center"/>
+            <w:tcMar>
+              <w:top w:w="90" w:type="dxa"/>
+              <w:start w:w="100" w:type="dxa"/>
+              <w:bottom w:w="90" w:type="dxa"/>
+              <w:end w:w="100" w:type="dxa"/>
+            </w:tcMar>
+          </w:tcPr>
+          <w:p>
+            <w:pPr>
+              <w:spacing w:after="20"/>
+            </w:pPr>
+            <w:r/>
+            <w:r>
+              <w:rPr>
+                <w:b w:val="0"/>
+                <w:sz w:val="17"/>
+              </w:rPr>
+              <w:t>Federal Reserve: monetary policy releases</w:t>
+              <w:br/>
+              <w:t>Federal Reserve: speeches</w:t>
+              <w:br/>
+              <w:t>US Treasury: press releases</w:t>
+            </w:r>
+          </w:p>
+          <w:p>
+            <w:pPr>
+              <w:spacing w:after="0"/>
+            </w:pPr>
+            <w:r>
+              <w:rPr>
+                <w:b w:val="0"/>
+                <w:color w:val="6B7280"/>
+                <w:sz w:val="16"/>
+              </w:rPr>
+              <w:t>美联储：货币政策发布</w:t>
+              <w:br/>
+              <w:t>美联储：官员讲话</w:t>
+              <w:br/>
+              <w:t>美国财政部：新闻稿</w:t>
+            </w:r>
+          </w:p>
+        </w:tc>
+        <w:tc>
+          <w:tcPr>
+            <w:tcW w:type="dxa" w:w="3408"/>
+            <w:shd w:fill="FFFFFF"/>
+            <w:vAlign w:val="center"/>
+            <w:tcMar>
+              <w:top w:w="90" w:type="dxa"/>
+              <w:start w:w="100" w:type="dxa"/>
+              <w:bottom w:w="90" w:type="dxa"/>
+              <w:end w:w="100" w:type="dxa"/>
+            </w:tcMar>
+          </w:tcPr>
+          <w:p>
+            <w:pPr>
+              <w:spacing w:after="20"/>
+            </w:pPr>
+            <w:r/>
+            <w:r>
+              <w:rPr>
+                <w:b w:val="0"/>
+                <w:sz w:val="17"/>
+              </w:rPr>
+              <w:t>Rate decisions, policy communication, speeches, fiscal and Treasury developments.</w:t>
+            </w:r>
+          </w:p>
+          <w:p>
+            <w:pPr>
+              <w:spacing w:after="0"/>
+            </w:pPr>
+            <w:r>
+              <w:rPr>
+                <w:b w:val="0"/>
+                <w:color w:val="6B7280"/>
+                <w:sz w:val="16"/>
+              </w:rPr>
+              <w:t>利率决策、政策沟通、官员讲话、财政及美国国债动态。</w:t>
+            </w:r>
+          </w:p>
+        </w:tc>
+      </w:tr>
+      <w:tr>
+        <w:tc>
+          <w:tcPr>
+            <w:tcW w:type="dxa" w:w="3408"/>
+            <w:shd w:fill="F3F7FB"/>
+            <w:vAlign w:val="center"/>
+            <w:tcMar>
+              <w:top w:w="90" w:type="dxa"/>
+              <w:start w:w="100" w:type="dxa"/>
+              <w:bottom w:w="90" w:type="dxa"/>
+              <w:end w:w="100" w:type="dxa"/>
+            </w:tcMar>
+          </w:tcPr>
+          <w:p>
+            <w:pPr>
+              <w:spacing w:after="20"/>
+            </w:pPr>
+            <w:r/>
+            <w:r>
+              <w:rPr>
+                <w:b/>
+                <w:sz w:val="17"/>
+              </w:rPr>
+              <w:t>FX market commentary</w:t>
+            </w:r>
+          </w:p>
+          <w:p>
+            <w:pPr>
+              <w:spacing w:after="0"/>
+            </w:pPr>
+            <w:r>
+              <w:rPr>
+                <w:b/>
+                <w:color w:val="6B7280"/>
+                <w:sz w:val="16"/>
+              </w:rPr>
+              <w:t>外汇市场评论</w:t>
+            </w:r>
+          </w:p>
+        </w:tc>
+        <w:tc>
+          <w:tcPr>
+            <w:tcW w:type="dxa" w:w="3408"/>
+            <w:shd w:fill="F3F7FB"/>
+            <w:vAlign w:val="center"/>
+            <w:tcMar>
+              <w:top w:w="90" w:type="dxa"/>
+              <w:start w:w="100" w:type="dxa"/>
+              <w:bottom w:w="90" w:type="dxa"/>
+              <w:end w:w="100" w:type="dxa"/>
+            </w:tcMar>
+          </w:tcPr>
+          <w:p>
+            <w:pPr>
+              <w:spacing w:after="20"/>
+            </w:pPr>
+            <w:r/>
+            <w:r>
+              <w:rPr>
+                <w:b w:val="0"/>
+                <w:sz w:val="17"/>
+              </w:rPr>
+              <w:t>FXStreet</w:t>
+              <w:br/>
+              <w:t>Investing.com Forex</w:t>
+            </w:r>
+          </w:p>
+          <w:p>
+            <w:pPr>
+              <w:spacing w:after="0"/>
+            </w:pPr>
+            <w:r>
+              <w:rPr>
+                <w:b w:val="0"/>
+                <w:color w:val="6B7280"/>
+                <w:sz w:val="16"/>
+              </w:rPr>
+              <w:t>FXStreet</w:t>
+              <w:br/>
+              <w:t>Investing.com 外汇</w:t>
+            </w:r>
+          </w:p>
+        </w:tc>
+        <w:tc>
+          <w:tcPr>
+            <w:tcW w:type="dxa" w:w="3408"/>
+            <w:shd w:fill="F3F7FB"/>
+            <w:vAlign w:val="center"/>
+            <w:tcMar>
+              <w:top w:w="90" w:type="dxa"/>
+              <w:start w:w="100" w:type="dxa"/>
+              <w:bottom w:w="90" w:type="dxa"/>
+              <w:end w:w="100" w:type="dxa"/>
+            </w:tcMar>
+          </w:tcPr>
+          <w:p>
+            <w:pPr>
+              <w:spacing w:after="20"/>
+            </w:pPr>
+            <w:r/>
+            <w:r>
+              <w:rPr>
+                <w:b w:val="0"/>
+                <w:sz w:val="17"/>
+              </w:rPr>
+              <w:t>Market reaction and FX commentary; treated as supporting context rather than primary official evidence.</w:t>
+            </w:r>
+          </w:p>
+          <w:p>
+            <w:pPr>
+              <w:spacing w:after="0"/>
+            </w:pPr>
+            <w:r>
+              <w:rPr>
+                <w:b w:val="0"/>
+                <w:color w:val="6B7280"/>
+                <w:sz w:val="16"/>
+              </w:rPr>
+              <w:t>市场反应及外汇评论；作为辅助背景，不作为最高优先级的官方依据。</w:t>
+            </w:r>
+          </w:p>
+        </w:tc>
+      </w:tr>
+    </w:tbl>
+    <w:p/>
+    <w:p>
+      <w:pPr>
+        <w:pStyle w:val="Heading2"/>
+        <w:keepNext/>
+      </w:pPr>
+      <w:r>
+        <w:t>What is captured</w:t>
+      </w:r>
+      <w:r>
+        <w:rPr>
+          <w:color w:val="2F75B5"/>
+        </w:rPr>
+        <w:t xml:space="preserve">  /  采集哪些数据</w:t>
+      </w:r>
+    </w:p>
+    <w:tbl>
+      <w:tblPr>
+        <w:tblStyle w:val="TableGrid"/>
+        <w:tblW w:type="auto" w:w="0"/>
+        <w:jc w:val="center"/>
+        <w:tblLook w:firstColumn="1" w:firstRow="1" w:lastColumn="0" w:lastRow="0" w:noHBand="0" w:noVBand="1" w:val="04A0"/>
+      </w:tblPr>
+      <w:tblGrid>
+        <w:gridCol w:w="3408"/>
+        <w:gridCol w:w="3408"/>
+        <w:gridCol w:w="3408"/>
+      </w:tblGrid>
+      <w:tr>
+        <w:tc>
+          <w:tcPr>
+            <w:tcW w:type="dxa" w:w="3408"/>
+            <w:shd w:fill="DDEBF7"/>
+            <w:vAlign w:val="center"/>
+            <w:tcMar>
+              <w:top w:w="90" w:type="dxa"/>
+              <w:start w:w="100" w:type="dxa"/>
+              <w:bottom w:w="90" w:type="dxa"/>
+              <w:end w:w="100" w:type="dxa"/>
+            </w:tcMar>
+          </w:tcPr>
+          <w:p>
+            <w:pPr>
+              <w:spacing w:after="20"/>
+            </w:pPr>
+            <w:r/>
+            <w:r>
+              <w:rPr>
+                <w:b/>
+                <w:color w:val="17365D"/>
+                <w:sz w:val="18"/>
+              </w:rPr>
+              <w:t>Headline &amp; excerpt</w:t>
+            </w:r>
+          </w:p>
+          <w:p>
+            <w:pPr>
+              <w:spacing w:after="0"/>
+            </w:pPr>
+            <w:r>
+              <w:rPr>
+                <w:b/>
+                <w:color w:val="17365D"/>
+                <w:sz w:val="17"/>
+              </w:rPr>
+              <w:t>标题与摘要</w:t>
+            </w:r>
+          </w:p>
+          <w:p>
+            <w:pPr>
+              <w:spacing w:after="20"/>
+            </w:pPr>
+            <w:r>
+              <w:rPr>
+                <w:sz w:val="17"/>
+              </w:rPr>
+              <w:t>Public headline and available summary/excerpt</w:t>
+            </w:r>
+          </w:p>
+          <w:p>
+            <w:pPr>
+              <w:spacing w:after="0"/>
+            </w:pPr>
+            <w:r>
+              <w:rPr>
+                <w:color w:val="6B7280"/>
+                <w:sz w:val="16"/>
+              </w:rPr>
+              <w:t>公开标题及可获取的摘要/摘录</w:t>
+            </w:r>
+          </w:p>
+        </w:tc>
+        <w:tc>
+          <w:tcPr>
+            <w:tcW w:type="dxa" w:w="3408"/>
+            <w:shd w:fill="DDEBF7"/>
+            <w:vAlign w:val="center"/>
+            <w:tcMar>
+              <w:top w:w="90" w:type="dxa"/>
+              <w:start w:w="100" w:type="dxa"/>
+              <w:bottom w:w="90" w:type="dxa"/>
+              <w:end w:w="100" w:type="dxa"/>
+            </w:tcMar>
+          </w:tcPr>
+          <w:p>
+            <w:pPr>
+              <w:spacing w:after="20"/>
+            </w:pPr>
+            <w:r/>
+            <w:r>
+              <w:rPr>
+                <w:b/>
+                <w:color w:val="17365D"/>
+                <w:sz w:val="18"/>
+              </w:rPr>
+              <w:t>Source &amp; link</w:t>
+            </w:r>
+          </w:p>
+          <w:p>
+            <w:pPr>
+              <w:spacing w:after="0"/>
+            </w:pPr>
+            <w:r>
+              <w:rPr>
+                <w:b/>
+                <w:color w:val="17365D"/>
+                <w:sz w:val="17"/>
+              </w:rPr>
+              <w:t>来源与链接</w:t>
+            </w:r>
+          </w:p>
+          <w:p>
+            <w:pPr>
+              <w:spacing w:after="20"/>
+            </w:pPr>
+            <w:r>
+              <w:rPr>
+                <w:sz w:val="17"/>
+              </w:rPr>
+              <w:t>Publisher identity and original URL</w:t>
+            </w:r>
+          </w:p>
+          <w:p>
+            <w:pPr>
+              <w:spacing w:after="0"/>
+            </w:pPr>
+            <w:r>
+              <w:rPr>
+                <w:color w:val="6B7280"/>
+                <w:sz w:val="16"/>
+              </w:rPr>
+              <w:t>发布方信息及原文链接</w:t>
+            </w:r>
+          </w:p>
+        </w:tc>
+        <w:tc>
+          <w:tcPr>
+            <w:tcW w:type="dxa" w:w="3408"/>
+            <w:shd w:fill="DDEBF7"/>
+            <w:vAlign w:val="center"/>
+            <w:tcMar>
+              <w:top w:w="90" w:type="dxa"/>
+              <w:start w:w="100" w:type="dxa"/>
+              <w:bottom w:w="90" w:type="dxa"/>
+              <w:end w:w="100" w:type="dxa"/>
+            </w:tcMar>
+          </w:tcPr>
+          <w:p>
+            <w:pPr>
+              <w:spacing w:after="20"/>
+            </w:pPr>
+            <w:r/>
+            <w:r>
+              <w:rPr>
+                <w:b/>
+                <w:color w:val="17365D"/>
+                <w:sz w:val="18"/>
+              </w:rPr>
+              <w:t>Timing</w:t>
+            </w:r>
+          </w:p>
+          <w:p>
+            <w:pPr>
+              <w:spacing w:after="0"/>
+            </w:pPr>
+            <w:r>
+              <w:rPr>
+                <w:b/>
+                <w:color w:val="17365D"/>
+                <w:sz w:val="17"/>
+              </w:rPr>
+              <w:t>时间信息</w:t>
+            </w:r>
+          </w:p>
+          <w:p>
+            <w:pPr>
+              <w:spacing w:after="20"/>
+            </w:pPr>
+            <w:r>
+              <w:rPr>
+                <w:sz w:val="17"/>
+              </w:rPr>
+              <w:t>Publication date where available; otherwise first-seen timing</w:t>
+            </w:r>
+          </w:p>
+          <w:p>
+            <w:pPr>
+              <w:spacing w:after="0"/>
+            </w:pPr>
+            <w:r>
+              <w:rPr>
+                <w:color w:val="6B7280"/>
+                <w:sz w:val="16"/>
+              </w:rPr>
+              <w:t>优先记录发布日期；缺失时使用首次发现时间</w:t>
+            </w:r>
+          </w:p>
+        </w:tc>
+      </w:tr>
+    </w:tbl>
+    <w:p>
+      <w:r>
+        <w:br w:type="page"/>
+      </w:r>
+    </w:p>
+    <w:p>
+      <w:pPr>
+        <w:pStyle w:val="Heading1"/>
+        <w:keepNext/>
+      </w:pPr>
+      <w:r>
+        <w:t>3. End-to-end business workflow</w:t>
+      </w:r>
+      <w:r>
+        <w:rPr>
+          <w:color w:val="2F75B5"/>
+        </w:rPr>
+        <w:t xml:space="preserve">  /  端到端业务流程</w:t>
+      </w:r>
+    </w:p>
+    <w:tbl>
+      <w:tblPr>
+        <w:tblStyle w:val="TableGrid"/>
+        <w:tblW w:type="auto" w:w="0"/>
+        <w:jc w:val="center"/>
+        <w:tblLook w:firstColumn="1" w:firstRow="1" w:lastColumn="0" w:lastRow="0" w:noHBand="0" w:noVBand="1" w:val="04A0"/>
+      </w:tblPr>
+      <w:tblGrid>
+        <w:gridCol w:w="3408"/>
+        <w:gridCol w:w="3408"/>
+        <w:gridCol w:w="3408"/>
+      </w:tblGrid>
+      <w:tr>
+        <w:trPr>
+          <w:tblHeader w:val="true"/>
+        </w:trPr>
+        <w:tc>
+          <w:tcPr>
+            <w:tcW w:type="dxa" w:w="3408"/>
+            <w:shd w:fill="17365D"/>
+            <w:vAlign w:val="center"/>
+            <w:tcMar>
+              <w:top w:w="90" w:type="dxa"/>
+              <w:start w:w="100" w:type="dxa"/>
+              <w:bottom w:w="90" w:type="dxa"/>
+              <w:end w:w="100" w:type="dxa"/>
+            </w:tcMar>
+          </w:tcPr>
+          <w:p>
+            <w:pPr>
+              <w:spacing w:after="20"/>
+            </w:pPr>
+            <w:r/>
+            <w:r>
+              <w:rPr>
+                <w:b/>
+                <w:color w:val="FFFFFF"/>
+                <w:sz w:val="18"/>
+              </w:rPr>
+              <w:t>Step</w:t>
+            </w:r>
+          </w:p>
+          <w:p>
+            <w:pPr>
+              <w:spacing w:after="0"/>
+            </w:pPr>
+            <w:r>
+              <w:rPr>
+                <w:b/>
+                <w:color w:val="FFFFFF"/>
+                <w:sz w:val="17"/>
+              </w:rPr>
+              <w:t>步骤</w:t>
+            </w:r>
+          </w:p>
+        </w:tc>
+        <w:tc>
+          <w:tcPr>
+            <w:tcW w:type="dxa" w:w="3408"/>
+            <w:shd w:fill="17365D"/>
+            <w:vAlign w:val="center"/>
+            <w:tcMar>
+              <w:top w:w="90" w:type="dxa"/>
+              <w:start w:w="100" w:type="dxa"/>
+              <w:bottom w:w="90" w:type="dxa"/>
+              <w:end w:w="100" w:type="dxa"/>
+            </w:tcMar>
+          </w:tcPr>
+          <w:p>
+            <w:pPr>
+              <w:spacing w:after="20"/>
+            </w:pPr>
+            <w:r/>
+            <w:r>
+              <w:rPr>
+                <w:b/>
+                <w:color w:val="FFFFFF"/>
+                <w:sz w:val="18"/>
+              </w:rPr>
+              <w:t>Business purpose</w:t>
+            </w:r>
+          </w:p>
+          <w:p>
+            <w:pPr>
+              <w:spacing w:after="0"/>
+            </w:pPr>
+            <w:r>
+              <w:rPr>
+                <w:b/>
+                <w:color w:val="FFFFFF"/>
+                <w:sz w:val="17"/>
+              </w:rPr>
+              <w:t>业务目的</w:t>
+            </w:r>
+          </w:p>
+        </w:tc>
+        <w:tc>
+          <w:tcPr>
+            <w:tcW w:type="dxa" w:w="3408"/>
+            <w:shd w:fill="17365D"/>
+            <w:vAlign w:val="center"/>
+            <w:tcMar>
+              <w:top w:w="90" w:type="dxa"/>
+              <w:start w:w="100" w:type="dxa"/>
+              <w:bottom w:w="90" w:type="dxa"/>
+              <w:end w:w="100" w:type="dxa"/>
+            </w:tcMar>
+          </w:tcPr>
+          <w:p>
+            <w:pPr>
+              <w:spacing w:after="20"/>
+            </w:pPr>
+            <w:r/>
+            <w:r>
+              <w:rPr>
+                <w:b/>
+                <w:color w:val="FFFFFF"/>
+                <w:sz w:val="18"/>
+              </w:rPr>
+              <w:t>Outcome</w:t>
+            </w:r>
+          </w:p>
+          <w:p>
+            <w:pPr>
+              <w:spacing w:after="0"/>
+            </w:pPr>
+            <w:r>
+              <w:rPr>
+                <w:b/>
+                <w:color w:val="FFFFFF"/>
+                <w:sz w:val="17"/>
+              </w:rPr>
+              <w:t>结果</w:t>
+            </w:r>
+          </w:p>
+        </w:tc>
+      </w:tr>
+      <w:tr>
+        <w:tc>
+          <w:tcPr>
+            <w:tcW w:type="dxa" w:w="3408"/>
+            <w:shd w:fill="DDEBF7"/>
+            <w:vAlign w:val="center"/>
+            <w:tcMar>
+              <w:top w:w="90" w:type="dxa"/>
+              <w:start w:w="100" w:type="dxa"/>
+              <w:bottom w:w="90" w:type="dxa"/>
+              <w:end w:w="100" w:type="dxa"/>
+            </w:tcMar>
+          </w:tcPr>
+          <w:p>
+            <w:pPr>
+              <w:spacing w:after="20"/>
+            </w:pPr>
+            <w:r/>
+            <w:r>
+              <w:rPr>
+                <w:b/>
+                <w:color w:val="17365D"/>
+                <w:sz w:val="17"/>
+              </w:rPr>
+              <w:t>1. Collect</w:t>
+            </w:r>
+          </w:p>
+          <w:p>
+            <w:pPr>
+              <w:spacing w:after="0"/>
+            </w:pPr>
+            <w:r>
+              <w:rPr>
+                <w:b/>
+                <w:color w:val="17365D"/>
+                <w:sz w:val="16"/>
+              </w:rPr>
+              <w:t>采集</w:t>
+            </w:r>
+          </w:p>
+        </w:tc>
+        <w:tc>
+          <w:tcPr>
+            <w:tcW w:type="dxa" w:w="3408"/>
+            <w:shd w:fill="FFFFFF"/>
+            <w:vAlign w:val="center"/>
+            <w:tcMar>
+              <w:top w:w="90" w:type="dxa"/>
+              <w:start w:w="100" w:type="dxa"/>
+              <w:bottom w:w="90" w:type="dxa"/>
+              <w:end w:w="100" w:type="dxa"/>
+            </w:tcMar>
+          </w:tcPr>
+          <w:p>
+            <w:pPr>
+              <w:spacing w:after="20"/>
+            </w:pPr>
+            <w:r/>
+            <w:r>
+              <w:rPr>
+                <w:b w:val="0"/>
+                <w:sz w:val="17"/>
+              </w:rPr>
+              <w:t>Gather recent public news from the nine configured channels.</w:t>
+            </w:r>
+          </w:p>
+          <w:p>
+            <w:pPr>
+              <w:spacing w:after="0"/>
+            </w:pPr>
+            <w:r>
+              <w:rPr>
+                <w:b w:val="0"/>
+                <w:color w:val="6B7280"/>
+                <w:sz w:val="16"/>
+              </w:rPr>
+              <w:t>从 9 个已配置渠道采集近期公开新闻。</w:t>
+            </w:r>
+          </w:p>
+        </w:tc>
+        <w:tc>
+          <w:tcPr>
+            <w:tcW w:type="dxa" w:w="3408"/>
+            <w:shd w:fill="FFFFFF"/>
+            <w:vAlign w:val="center"/>
+            <w:tcMar>
+              <w:top w:w="90" w:type="dxa"/>
+              <w:start w:w="100" w:type="dxa"/>
+              <w:bottom w:w="90" w:type="dxa"/>
+              <w:end w:w="100" w:type="dxa"/>
+            </w:tcMar>
+          </w:tcPr>
+          <w:p>
+            <w:pPr>
+              <w:spacing w:after="20"/>
+            </w:pPr>
+            <w:r/>
+            <w:r>
+              <w:rPr>
+                <w:b/>
+                <w:sz w:val="17"/>
+              </w:rPr>
+              <w:t>Source pool</w:t>
+            </w:r>
+          </w:p>
+          <w:p>
+            <w:pPr>
+              <w:spacing w:after="0"/>
+            </w:pPr>
+            <w:r>
+              <w:rPr>
+                <w:b/>
+                <w:color w:val="6B7280"/>
+                <w:sz w:val="16"/>
+              </w:rPr>
+              <w:t>来源池</w:t>
+            </w:r>
+          </w:p>
+        </w:tc>
+      </w:tr>
+      <w:tr>
+        <w:tc>
+          <w:tcPr>
+            <w:tcW w:type="dxa" w:w="3408"/>
+            <w:shd w:fill="DDEBF7"/>
+            <w:vAlign w:val="center"/>
+            <w:tcMar>
+              <w:top w:w="90" w:type="dxa"/>
+              <w:start w:w="100" w:type="dxa"/>
+              <w:bottom w:w="90" w:type="dxa"/>
+              <w:end w:w="100" w:type="dxa"/>
+            </w:tcMar>
+          </w:tcPr>
+          <w:p>
+            <w:pPr>
+              <w:spacing w:after="20"/>
+            </w:pPr>
+            <w:r/>
+            <w:r>
+              <w:rPr>
+                <w:b/>
+                <w:color w:val="17365D"/>
+                <w:sz w:val="17"/>
+              </w:rPr>
+              <w:t>2. Clean &amp; shortlist</w:t>
+            </w:r>
+          </w:p>
+          <w:p>
+            <w:pPr>
+              <w:spacing w:after="0"/>
+            </w:pPr>
+            <w:r>
+              <w:rPr>
+                <w:b/>
+                <w:color w:val="17365D"/>
+                <w:sz w:val="16"/>
+              </w:rPr>
+              <w:t>清理与初筛</w:t>
+            </w:r>
+          </w:p>
+        </w:tc>
+        <w:tc>
+          <w:tcPr>
+            <w:tcW w:type="dxa" w:w="3408"/>
+            <w:shd w:fill="F3F7FB"/>
+            <w:vAlign w:val="center"/>
+            <w:tcMar>
+              <w:top w:w="90" w:type="dxa"/>
+              <w:start w:w="100" w:type="dxa"/>
+              <w:bottom w:w="90" w:type="dxa"/>
+              <w:end w:w="100" w:type="dxa"/>
+            </w:tcMar>
+          </w:tcPr>
+          <w:p>
+            <w:pPr>
+              <w:spacing w:after="20"/>
+            </w:pPr>
+            <w:r/>
+            <w:r>
+              <w:rPr>
+                <w:b w:val="0"/>
+                <w:sz w:val="17"/>
+              </w:rPr>
+              <w:t>Remove repeats, apply freshness checks and filter out low-value noise.</w:t>
+            </w:r>
+          </w:p>
+          <w:p>
+            <w:pPr>
+              <w:spacing w:after="0"/>
+            </w:pPr>
+            <w:r>
+              <w:rPr>
+                <w:b w:val="0"/>
+                <w:color w:val="6B7280"/>
+                <w:sz w:val="16"/>
+              </w:rPr>
+              <w:t>去除重复内容，检查时效性，并过滤低价值噪音。</w:t>
+            </w:r>
+          </w:p>
+        </w:tc>
+        <w:tc>
+          <w:tcPr>
+            <w:tcW w:type="dxa" w:w="3408"/>
+            <w:shd w:fill="F3F7FB"/>
+            <w:vAlign w:val="center"/>
+            <w:tcMar>
+              <w:top w:w="90" w:type="dxa"/>
+              <w:start w:w="100" w:type="dxa"/>
+              <w:bottom w:w="90" w:type="dxa"/>
+              <w:end w:w="100" w:type="dxa"/>
+            </w:tcMar>
+          </w:tcPr>
+          <w:p>
+            <w:pPr>
+              <w:spacing w:after="20"/>
+            </w:pPr>
+            <w:r/>
+            <w:r>
+              <w:rPr>
+                <w:b/>
+                <w:sz w:val="17"/>
+              </w:rPr>
+              <w:t>Relevant candidates</w:t>
+            </w:r>
+          </w:p>
+          <w:p>
+            <w:pPr>
+              <w:spacing w:after="0"/>
+            </w:pPr>
+            <w:r>
+              <w:rPr>
+                <w:b/>
+                <w:color w:val="6B7280"/>
+                <w:sz w:val="16"/>
+              </w:rPr>
+              <w:t>相关候选新闻</w:t>
+            </w:r>
+          </w:p>
+        </w:tc>
+      </w:tr>
+      <w:tr>
+        <w:tc>
+          <w:tcPr>
+            <w:tcW w:type="dxa" w:w="3408"/>
+            <w:shd w:fill="DDEBF7"/>
+            <w:vAlign w:val="center"/>
+            <w:tcMar>
+              <w:top w:w="90" w:type="dxa"/>
+              <w:start w:w="100" w:type="dxa"/>
+              <w:bottom w:w="90" w:type="dxa"/>
+              <w:end w:w="100" w:type="dxa"/>
+            </w:tcMar>
+          </w:tcPr>
+          <w:p>
+            <w:pPr>
+              <w:spacing w:after="20"/>
+            </w:pPr>
+            <w:r/>
+            <w:r>
+              <w:rPr>
+                <w:b/>
+                <w:color w:val="17365D"/>
+                <w:sz w:val="17"/>
+              </w:rPr>
+              <w:t>3. AI relevance assessment</w:t>
+            </w:r>
+          </w:p>
+          <w:p>
+            <w:pPr>
+              <w:spacing w:after="0"/>
+            </w:pPr>
+            <w:r>
+              <w:rPr>
+                <w:b/>
+                <w:color w:val="17365D"/>
+                <w:sz w:val="16"/>
+              </w:rPr>
+              <w:t>AI 相关性判断</w:t>
+            </w:r>
+          </w:p>
+        </w:tc>
+        <w:tc>
+          <w:tcPr>
+            <w:tcW w:type="dxa" w:w="3408"/>
+            <w:shd w:fill="FFFFFF"/>
+            <w:vAlign w:val="center"/>
+            <w:tcMar>
+              <w:top w:w="90" w:type="dxa"/>
+              <w:start w:w="100" w:type="dxa"/>
+              <w:bottom w:w="90" w:type="dxa"/>
+              <w:end w:w="100" w:type="dxa"/>
+            </w:tcMar>
+          </w:tcPr>
+          <w:p>
+            <w:pPr>
+              <w:spacing w:after="20"/>
+            </w:pPr>
+            <w:r/>
+            <w:r>
+              <w:rPr>
+                <w:b w:val="0"/>
+                <w:sz w:val="17"/>
+              </w:rPr>
+              <w:t>Agent 1 ranks items and assesses topic, direction and confidence.</w:t>
+            </w:r>
+          </w:p>
+          <w:p>
+            <w:pPr>
+              <w:spacing w:after="0"/>
+            </w:pPr>
+            <w:r>
+              <w:rPr>
+                <w:b w:val="0"/>
+                <w:color w:val="6B7280"/>
+                <w:sz w:val="16"/>
+              </w:rPr>
+              <w:t>Agent 1 对新闻排序，并判断主题、方向和置信度。</w:t>
+            </w:r>
+          </w:p>
+        </w:tc>
+        <w:tc>
+          <w:tcPr>
+            <w:tcW w:type="dxa" w:w="3408"/>
+            <w:shd w:fill="FFFFFF"/>
+            <w:vAlign w:val="center"/>
+            <w:tcMar>
+              <w:top w:w="90" w:type="dxa"/>
+              <w:start w:w="100" w:type="dxa"/>
+              <w:bottom w:w="90" w:type="dxa"/>
+              <w:end w:w="100" w:type="dxa"/>
+            </w:tcMar>
+          </w:tcPr>
+          <w:p>
+            <w:pPr>
+              <w:spacing w:after="20"/>
+            </w:pPr>
+            <w:r/>
+            <w:r>
+              <w:rPr>
+                <w:b/>
+                <w:sz w:val="17"/>
+              </w:rPr>
+              <w:t>Ranked signals</w:t>
+            </w:r>
+          </w:p>
+          <w:p>
+            <w:pPr>
+              <w:spacing w:after="0"/>
+            </w:pPr>
+            <w:r>
+              <w:rPr>
+                <w:b/>
+                <w:color w:val="6B7280"/>
+                <w:sz w:val="16"/>
+              </w:rPr>
+              <w:t>排序后的信号</w:t>
+            </w:r>
+          </w:p>
+        </w:tc>
+      </w:tr>
+      <w:tr>
+        <w:tc>
+          <w:tcPr>
+            <w:tcW w:type="dxa" w:w="3408"/>
+            <w:shd w:fill="DDEBF7"/>
+            <w:vAlign w:val="center"/>
+            <w:tcMar>
+              <w:top w:w="90" w:type="dxa"/>
+              <w:start w:w="100" w:type="dxa"/>
+              <w:bottom w:w="90" w:type="dxa"/>
+              <w:end w:w="100" w:type="dxa"/>
+            </w:tcMar>
+          </w:tcPr>
+          <w:p>
+            <w:pPr>
+              <w:spacing w:after="20"/>
+            </w:pPr>
+            <w:r/>
+            <w:r>
+              <w:rPr>
+                <w:b/>
+                <w:color w:val="17365D"/>
+                <w:sz w:val="17"/>
+              </w:rPr>
+              <w:t>4. AI impact interpretation</w:t>
+            </w:r>
+          </w:p>
+          <w:p>
+            <w:pPr>
+              <w:spacing w:after="0"/>
+            </w:pPr>
+            <w:r>
+              <w:rPr>
+                <w:b/>
+                <w:color w:val="17365D"/>
+                <w:sz w:val="16"/>
+              </w:rPr>
+              <w:t>AI 影响解读</w:t>
+            </w:r>
+          </w:p>
+        </w:tc>
+        <w:tc>
+          <w:tcPr>
+            <w:tcW w:type="dxa" w:w="3408"/>
+            <w:shd w:fill="F3F7FB"/>
+            <w:vAlign w:val="center"/>
+            <w:tcMar>
+              <w:top w:w="90" w:type="dxa"/>
+              <w:start w:w="100" w:type="dxa"/>
+              <w:bottom w:w="90" w:type="dxa"/>
+              <w:end w:w="100" w:type="dxa"/>
+            </w:tcMar>
+          </w:tcPr>
+          <w:p>
+            <w:pPr>
+              <w:spacing w:after="20"/>
+            </w:pPr>
+            <w:r/>
+            <w:r>
+              <w:rPr>
+                <w:b w:val="0"/>
+                <w:sz w:val="17"/>
+              </w:rPr>
+              <w:t>Agent 2 explains market transmission and identifies follow-up actions.</w:t>
+            </w:r>
+          </w:p>
+          <w:p>
+            <w:pPr>
+              <w:spacing w:after="0"/>
+            </w:pPr>
+            <w:r>
+              <w:rPr>
+                <w:b w:val="0"/>
+                <w:color w:val="6B7280"/>
+                <w:sz w:val="16"/>
+              </w:rPr>
+              <w:t>Agent 2 解释市场传导逻辑并识别后续关注事项。</w:t>
+            </w:r>
+          </w:p>
+        </w:tc>
+        <w:tc>
+          <w:tcPr>
+            <w:tcW w:type="dxa" w:w="3408"/>
+            <w:shd w:fill="F3F7FB"/>
+            <w:vAlign w:val="center"/>
+            <w:tcMar>
+              <w:top w:w="90" w:type="dxa"/>
+              <w:start w:w="100" w:type="dxa"/>
+              <w:bottom w:w="90" w:type="dxa"/>
+              <w:end w:w="100" w:type="dxa"/>
+            </w:tcMar>
+          </w:tcPr>
+          <w:p>
+            <w:pPr>
+              <w:spacing w:after="20"/>
+            </w:pPr>
+            <w:r/>
+            <w:r>
+              <w:rPr>
+                <w:b/>
+                <w:sz w:val="17"/>
+              </w:rPr>
+              <w:t>Actionable context</w:t>
+            </w:r>
+          </w:p>
+          <w:p>
+            <w:pPr>
+              <w:spacing w:after="0"/>
+            </w:pPr>
+            <w:r>
+              <w:rPr>
+                <w:b/>
+                <w:color w:val="6B7280"/>
+                <w:sz w:val="16"/>
+              </w:rPr>
+              <w:t>可行动的市场语境</w:t>
+            </w:r>
+          </w:p>
+        </w:tc>
+      </w:tr>
+      <w:tr>
+        <w:tc>
+          <w:tcPr>
+            <w:tcW w:type="dxa" w:w="3408"/>
+            <w:shd w:fill="DDEBF7"/>
+            <w:vAlign w:val="center"/>
+            <w:tcMar>
+              <w:top w:w="90" w:type="dxa"/>
+              <w:start w:w="100" w:type="dxa"/>
+              <w:bottom w:w="90" w:type="dxa"/>
+              <w:end w:w="100" w:type="dxa"/>
+            </w:tcMar>
+          </w:tcPr>
+          <w:p>
+            <w:pPr>
+              <w:spacing w:after="20"/>
+            </w:pPr>
+            <w:r/>
+            <w:r>
+              <w:rPr>
+                <w:b/>
+                <w:color w:val="17365D"/>
+                <w:sz w:val="17"/>
+              </w:rPr>
+              <w:t>5. Executive synthesis</w:t>
+            </w:r>
+          </w:p>
+          <w:p>
+            <w:pPr>
+              <w:spacing w:after="0"/>
+            </w:pPr>
+            <w:r>
+              <w:rPr>
+                <w:b/>
+                <w:color w:val="17365D"/>
+                <w:sz w:val="16"/>
+              </w:rPr>
+              <w:t>管理层汇总</w:t>
+            </w:r>
+          </w:p>
+        </w:tc>
+        <w:tc>
+          <w:tcPr>
+            <w:tcW w:type="dxa" w:w="3408"/>
+            <w:shd w:fill="FFFFFF"/>
+            <w:vAlign w:val="center"/>
+            <w:tcMar>
+              <w:top w:w="90" w:type="dxa"/>
+              <w:start w:w="100" w:type="dxa"/>
+              <w:bottom w:w="90" w:type="dxa"/>
+              <w:end w:w="100" w:type="dxa"/>
+            </w:tcMar>
+          </w:tcPr>
+          <w:p>
+            <w:pPr>
+              <w:spacing w:after="20"/>
+            </w:pPr>
+            <w:r/>
+            <w:r>
+              <w:rPr>
+                <w:b w:val="0"/>
+                <w:sz w:val="17"/>
+              </w:rPr>
+              <w:t>Create the overall market read, top stories and watchlist.</w:t>
+            </w:r>
+          </w:p>
+          <w:p>
+            <w:pPr>
+              <w:spacing w:after="0"/>
+            </w:pPr>
+            <w:r>
+              <w:rPr>
+                <w:b w:val="0"/>
+                <w:color w:val="6B7280"/>
+                <w:sz w:val="16"/>
+              </w:rPr>
+              <w:t>生成整体市场判断、重点新闻和观察清单。</w:t>
+            </w:r>
+          </w:p>
+        </w:tc>
+        <w:tc>
+          <w:tcPr>
+            <w:tcW w:type="dxa" w:w="3408"/>
+            <w:shd w:fill="FFFFFF"/>
+            <w:vAlign w:val="center"/>
+            <w:tcMar>
+              <w:top w:w="90" w:type="dxa"/>
+              <w:start w:w="100" w:type="dxa"/>
+              <w:bottom w:w="90" w:type="dxa"/>
+              <w:end w:w="100" w:type="dxa"/>
+            </w:tcMar>
+          </w:tcPr>
+          <w:p>
+            <w:pPr>
+              <w:spacing w:after="20"/>
+            </w:pPr>
+            <w:r/>
+            <w:r>
+              <w:rPr>
+                <w:b/>
+                <w:sz w:val="17"/>
+              </w:rPr>
+              <w:t>Executive view</w:t>
+            </w:r>
+          </w:p>
+          <w:p>
+            <w:pPr>
+              <w:spacing w:after="0"/>
+            </w:pPr>
+            <w:r>
+              <w:rPr>
+                <w:b/>
+                <w:color w:val="6B7280"/>
+                <w:sz w:val="16"/>
+              </w:rPr>
+              <w:t>管理层视图</w:t>
+            </w:r>
+          </w:p>
+        </w:tc>
+      </w:tr>
+      <w:tr>
+        <w:tc>
+          <w:tcPr>
+            <w:tcW w:type="dxa" w:w="3408"/>
+            <w:shd w:fill="DDEBF7"/>
+            <w:vAlign w:val="center"/>
+            <w:tcMar>
+              <w:top w:w="90" w:type="dxa"/>
+              <w:start w:w="100" w:type="dxa"/>
+              <w:bottom w:w="90" w:type="dxa"/>
+              <w:end w:w="100" w:type="dxa"/>
+            </w:tcMar>
+          </w:tcPr>
+          <w:p>
+            <w:pPr>
+              <w:spacing w:after="20"/>
+            </w:pPr>
+            <w:r/>
+            <w:r>
+              <w:rPr>
+                <w:b/>
+                <w:color w:val="17365D"/>
+                <w:sz w:val="17"/>
+              </w:rPr>
+              <w:t>6. Deliver &amp; trace</w:t>
+            </w:r>
+          </w:p>
+          <w:p>
+            <w:pPr>
+              <w:spacing w:after="0"/>
+            </w:pPr>
+            <w:r>
+              <w:rPr>
+                <w:b/>
+                <w:color w:val="17365D"/>
+                <w:sz w:val="16"/>
+              </w:rPr>
+              <w:t>交付与溯源</w:t>
+            </w:r>
+          </w:p>
+        </w:tc>
+        <w:tc>
+          <w:tcPr>
+            <w:tcW w:type="dxa" w:w="3408"/>
+            <w:shd w:fill="F3F7FB"/>
+            <w:vAlign w:val="center"/>
+            <w:tcMar>
+              <w:top w:w="90" w:type="dxa"/>
+              <w:start w:w="100" w:type="dxa"/>
+              <w:bottom w:w="90" w:type="dxa"/>
+              <w:end w:w="100" w:type="dxa"/>
+            </w:tcMar>
+          </w:tcPr>
+          <w:p>
+            <w:pPr>
+              <w:spacing w:after="20"/>
+            </w:pPr>
+            <w:r/>
+            <w:r>
+              <w:rPr>
+                <w:b w:val="0"/>
+                <w:sz w:val="17"/>
+              </w:rPr>
+              <w:t>Produce a Word briefing with links back to original public sources.</w:t>
+            </w:r>
+          </w:p>
+          <w:p>
+            <w:pPr>
+              <w:spacing w:after="0"/>
+            </w:pPr>
+            <w:r>
+              <w:rPr>
+                <w:b w:val="0"/>
+                <w:color w:val="6B7280"/>
+                <w:sz w:val="16"/>
+              </w:rPr>
+              <w:t>生成 Word 简报，并保留原始公开来源链接以便追溯。</w:t>
+            </w:r>
+          </w:p>
+        </w:tc>
+        <w:tc>
+          <w:tcPr>
+            <w:tcW w:type="dxa" w:w="3408"/>
+            <w:shd w:fill="F3F7FB"/>
+            <w:vAlign w:val="center"/>
+            <w:tcMar>
+              <w:top w:w="90" w:type="dxa"/>
+              <w:start w:w="100" w:type="dxa"/>
+              <w:bottom w:w="90" w:type="dxa"/>
+              <w:end w:w="100" w:type="dxa"/>
+            </w:tcMar>
+          </w:tcPr>
+          <w:p>
+            <w:pPr>
+              <w:spacing w:after="20"/>
+            </w:pPr>
+            <w:r/>
+            <w:r>
+              <w:rPr>
+                <w:b/>
+                <w:sz w:val="17"/>
+              </w:rPr>
+              <w:t>Traceable report</w:t>
+            </w:r>
+          </w:p>
+          <w:p>
+            <w:pPr>
+              <w:spacing w:after="0"/>
+            </w:pPr>
+            <w:r>
+              <w:rPr>
+                <w:b/>
+                <w:color w:val="6B7280"/>
+                <w:sz w:val="16"/>
+              </w:rPr>
+              <w:t>可追溯报告</w:t>
+            </w:r>
+          </w:p>
+        </w:tc>
+      </w:tr>
+    </w:tbl>
+    <w:p/>
+    <w:p>
+      <w:pPr>
+        <w:pStyle w:val="Heading1"/>
+        <w:keepNext/>
+      </w:pPr>
+      <w:r>
+        <w:t>4. Executive output</w:t>
+      </w:r>
+      <w:r>
+        <w:rPr>
+          <w:color w:val="2F75B5"/>
+        </w:rPr>
+        <w:t xml:space="preserve">  /  管理层交付内容</w:t>
       </w:r>
     </w:p>
     <w:p>
@@ -76,7 +3024,20 @@
         <w:spacing w:after="40"/>
       </w:pPr>
       <w:r>
-        <w:t>Japan policy and macro channel: Bank of Japan announcements and statistics, Nikkei Asia, and NHK WORLD-JAPAN. 日本政策与宏观渠道：日本央行公告和统计、Nikkei Asia、NHK WORLD-JAPAN。</w:t>
+        <w:t>Market Read — a concise view of the main forces affecting USD/JPY.</w:t>
+      </w:r>
+    </w:p>
+    <w:p>
+      <w:pPr>
+        <w:pStyle w:val="ListBullet"/>
+        <w:spacing w:after="120"/>
+      </w:pPr>
+      <w:r>
+        <w:rPr>
+          <w:color w:val="6B7280"/>
+          <w:sz w:val="19"/>
+        </w:rPr>
+        <w:t>Market Read —— 简明概括影响 USD/JPY 的主要力量。</w:t>
       </w:r>
     </w:p>
     <w:p>
@@ -85,7 +3046,20 @@
         <w:spacing w:after="40"/>
       </w:pPr>
       <w:r>
-        <w:t>US policy channel: Federal Reserve monetary-policy releases, Federal Reserve speeches, and US Treasury press releases. 美国政策渠道：美联储货币政策公告、美联储讲话、美国财政部新闻。</w:t>
+        <w:t>Top Stories — prioritized developments with source, direction, relevance and business takeaway.</w:t>
+      </w:r>
+    </w:p>
+    <w:p>
+      <w:pPr>
+        <w:pStyle w:val="ListBullet"/>
+        <w:spacing w:after="120"/>
+      </w:pPr>
+      <w:r>
+        <w:rPr>
+          <w:color w:val="6B7280"/>
+          <w:sz w:val="19"/>
+        </w:rPr>
+        <w:t>Top Stories —— 按优先级展示新闻来源、方向、相关性及业务要点。</w:t>
       </w:r>
     </w:p>
     <w:p>
@@ -94,7 +3068,20 @@
         <w:spacing w:after="40"/>
       </w:pPr>
       <w:r>
-        <w:t>FX market channel: FXStreet and Investing.com forex news, used as market-commentary supplements rather than primary official evidence. 外汇市场渠道：FXStreet 与 Investing.com 外汇新闻，作为市场解读补充，而非优先级最高的官方依据。</w:t>
+        <w:t>Watchlist — upcoming decisions, data and risks that may move the currency pair.</w:t>
+      </w:r>
+    </w:p>
+    <w:p>
+      <w:pPr>
+        <w:pStyle w:val="ListBullet"/>
+        <w:spacing w:after="120"/>
+      </w:pPr>
+      <w:r>
+        <w:rPr>
+          <w:color w:val="6B7280"/>
+          <w:sz w:val="19"/>
+        </w:rPr>
+        <w:t>Watchlist —— 列出可能影响汇率的后续决策、数据及风险。</w:t>
       </w:r>
     </w:p>
     <w:p>
@@ -103,275 +3090,524 @@
         <w:spacing w:after="40"/>
       </w:pPr>
       <w:r>
-        <w:t>Business focus: BOJ/Fed policy, rate differentials, inflation, wages, JGB and Treasury yields, intervention rhetoric, fiscal policy, risk sentiment, trade balance, oil/commodities, and growth data. 业务关注点：日美央行政策、利差、通胀、工资、日债与美债收益率、干预言论、财政政策、风险情绪、贸易收支、油价/商品和增长数据。</w:t>
-      </w:r>
-    </w:p>
-    <w:p>
-      <w:pPr>
-        <w:spacing w:before="200" w:after="80"/>
-      </w:pPr>
-      <w:r>
-        <w:rPr>
-          <w:b/>
-          <w:sz w:val="24"/>
-        </w:rPr>
-        <w:t>3. Business Workflow / 业务流程</w:t>
+        <w:t>Source Citations — direct links for validation and deeper reading.</w:t>
       </w:r>
     </w:p>
     <w:p>
       <w:pPr>
         <w:pStyle w:val="ListBullet"/>
-        <w:spacing w:after="40"/>
+        <w:spacing w:after="120"/>
       </w:pPr>
       <w:r>
-        <w:t>Collect: gather recent public headlines from the source set above and keep the news items that can plausibly affect USD/JPY. 收集：从上述信源获取近期公开新闻，保留可能影响美元/日元的条目。</w:t>
+        <w:rPr>
+          <w:color w:val="6B7280"/>
+          <w:sz w:val="19"/>
+        </w:rPr>
+        <w:t>Source Citations —— 提供原文链接，便于核实和进一步阅读。</w:t>
       </w:r>
     </w:p>
     <w:p>
       <w:pPr>
-        <w:pStyle w:val="ListBullet"/>
-        <w:spacing w:after="40"/>
+        <w:pStyle w:val="Heading1"/>
+        <w:keepNext/>
       </w:pPr>
       <w:r>
-        <w:t>Freshness control: prefer genuinely recent news; when a source has incomplete date information, the item is marked by first-seen timing instead of being treated as an exact publication date. 时效控制：优先近期新闻；当信源日期信息不完整时，用“首次看到”作为近似，不把它误写成确定发布时间。</w:t>
+        <w:t>5. Governance and boundaries</w:t>
+      </w:r>
+      <w:r>
+        <w:rPr>
+          <w:color w:val="2F75B5"/>
+        </w:rPr>
+        <w:t xml:space="preserve">  /  管控与边界</w:t>
+      </w:r>
+    </w:p>
+    <w:tbl>
+      <w:tblPr>
+        <w:tblStyle w:val="TableGrid"/>
+        <w:tblW w:type="auto" w:w="0"/>
+        <w:jc w:val="center"/>
+        <w:tblLook w:firstColumn="1" w:firstRow="1" w:lastColumn="0" w:lastRow="0" w:noHBand="0" w:noVBand="1" w:val="04A0"/>
+      </w:tblPr>
+      <w:tblGrid>
+        <w:gridCol w:w="5112"/>
+        <w:gridCol w:w="5112"/>
+      </w:tblGrid>
+      <w:tr>
+        <w:tc>
+          <w:tcPr>
+            <w:tcW w:type="dxa" w:w="5112"/>
+            <w:shd w:fill="17365D"/>
+            <w:vAlign w:val="center"/>
+            <w:tcMar>
+              <w:top w:w="90" w:type="dxa"/>
+              <w:start w:w="100" w:type="dxa"/>
+              <w:bottom w:w="90" w:type="dxa"/>
+              <w:end w:w="100" w:type="dxa"/>
+            </w:tcMar>
+          </w:tcPr>
+          <w:p>
+            <w:pPr>
+              <w:spacing w:after="20"/>
+            </w:pPr>
+            <w:r/>
+            <w:r>
+              <w:rPr>
+                <w:b/>
+                <w:color w:val="FFFFFF"/>
+                <w:sz w:val="18"/>
+              </w:rPr>
+              <w:t>Control</w:t>
+            </w:r>
+          </w:p>
+          <w:p>
+            <w:pPr>
+              <w:spacing w:after="0"/>
+            </w:pPr>
+            <w:r>
+              <w:rPr>
+                <w:b/>
+                <w:color w:val="FFFFFF"/>
+                <w:sz w:val="17"/>
+              </w:rPr>
+              <w:t>管控</w:t>
+            </w:r>
+          </w:p>
+        </w:tc>
+        <w:tc>
+          <w:tcPr>
+            <w:tcW w:type="dxa" w:w="5112"/>
+            <w:shd w:fill="17365D"/>
+            <w:vAlign w:val="center"/>
+            <w:tcMar>
+              <w:top w:w="90" w:type="dxa"/>
+              <w:start w:w="100" w:type="dxa"/>
+              <w:bottom w:w="90" w:type="dxa"/>
+              <w:end w:w="100" w:type="dxa"/>
+            </w:tcMar>
+          </w:tcPr>
+          <w:p>
+            <w:pPr>
+              <w:spacing w:after="20"/>
+            </w:pPr>
+            <w:r/>
+            <w:r>
+              <w:rPr>
+                <w:b/>
+                <w:color w:val="FFFFFF"/>
+                <w:sz w:val="18"/>
+              </w:rPr>
+              <w:t>Executive implication</w:t>
+            </w:r>
+          </w:p>
+          <w:p>
+            <w:pPr>
+              <w:spacing w:after="0"/>
+            </w:pPr>
+            <w:r>
+              <w:rPr>
+                <w:b/>
+                <w:color w:val="FFFFFF"/>
+                <w:sz w:val="17"/>
+              </w:rPr>
+              <w:t>管理层含义</w:t>
+            </w:r>
+          </w:p>
+        </w:tc>
+      </w:tr>
+      <w:tr>
+        <w:tc>
+          <w:tcPr>
+            <w:tcW w:type="dxa" w:w="5112"/>
+            <w:shd w:fill="FFFFFF"/>
+            <w:vAlign w:val="center"/>
+            <w:tcMar>
+              <w:top w:w="90" w:type="dxa"/>
+              <w:start w:w="100" w:type="dxa"/>
+              <w:bottom w:w="90" w:type="dxa"/>
+              <w:end w:w="100" w:type="dxa"/>
+            </w:tcMar>
+          </w:tcPr>
+          <w:p>
+            <w:pPr>
+              <w:spacing w:after="20"/>
+            </w:pPr>
+            <w:r/>
+            <w:r>
+              <w:rPr>
+                <w:b/>
+                <w:sz w:val="17"/>
+              </w:rPr>
+              <w:t>Official-source priority</w:t>
+            </w:r>
+          </w:p>
+          <w:p>
+            <w:pPr>
+              <w:spacing w:after="0"/>
+            </w:pPr>
+            <w:r>
+              <w:rPr>
+                <w:b/>
+                <w:color w:val="6B7280"/>
+                <w:sz w:val="16"/>
+              </w:rPr>
+              <w:t>官方来源优先</w:t>
+            </w:r>
+          </w:p>
+        </w:tc>
+        <w:tc>
+          <w:tcPr>
+            <w:tcW w:type="dxa" w:w="5112"/>
+            <w:shd w:fill="FFFFFF"/>
+            <w:vAlign w:val="center"/>
+            <w:tcMar>
+              <w:top w:w="90" w:type="dxa"/>
+              <w:start w:w="100" w:type="dxa"/>
+              <w:bottom w:w="90" w:type="dxa"/>
+              <w:end w:w="100" w:type="dxa"/>
+            </w:tcMar>
+          </w:tcPr>
+          <w:p>
+            <w:pPr>
+              <w:spacing w:after="20"/>
+            </w:pPr>
+            <w:r/>
+            <w:r>
+              <w:rPr>
+                <w:b w:val="0"/>
+                <w:sz w:val="17"/>
+              </w:rPr>
+              <w:t>Policy sources lead; media commentary supplements interpretation.</w:t>
+            </w:r>
+          </w:p>
+          <w:p>
+            <w:pPr>
+              <w:spacing w:after="0"/>
+            </w:pPr>
+            <w:r>
+              <w:rPr>
+                <w:b w:val="0"/>
+                <w:color w:val="6B7280"/>
+                <w:sz w:val="16"/>
+              </w:rPr>
+              <w:t>政策类官方来源优先，媒体评论用于补充解读。</w:t>
+            </w:r>
+          </w:p>
+        </w:tc>
+      </w:tr>
+      <w:tr>
+        <w:tc>
+          <w:tcPr>
+            <w:tcW w:type="dxa" w:w="5112"/>
+            <w:shd w:fill="F2F2F2"/>
+            <w:vAlign w:val="center"/>
+            <w:tcMar>
+              <w:top w:w="90" w:type="dxa"/>
+              <w:start w:w="100" w:type="dxa"/>
+              <w:bottom w:w="90" w:type="dxa"/>
+              <w:end w:w="100" w:type="dxa"/>
+            </w:tcMar>
+          </w:tcPr>
+          <w:p>
+            <w:pPr>
+              <w:spacing w:after="20"/>
+            </w:pPr>
+            <w:r/>
+            <w:r>
+              <w:rPr>
+                <w:b/>
+                <w:sz w:val="17"/>
+              </w:rPr>
+              <w:t>No autonomous trading</w:t>
+            </w:r>
+          </w:p>
+          <w:p>
+            <w:pPr>
+              <w:spacing w:after="0"/>
+            </w:pPr>
+            <w:r>
+              <w:rPr>
+                <w:b/>
+                <w:color w:val="6B7280"/>
+                <w:sz w:val="16"/>
+              </w:rPr>
+              <w:t>不进行自动交易</w:t>
+            </w:r>
+          </w:p>
+        </w:tc>
+        <w:tc>
+          <w:tcPr>
+            <w:tcW w:type="dxa" w:w="5112"/>
+            <w:shd w:fill="F2F2F2"/>
+            <w:vAlign w:val="center"/>
+            <w:tcMar>
+              <w:top w:w="90" w:type="dxa"/>
+              <w:start w:w="100" w:type="dxa"/>
+              <w:bottom w:w="90" w:type="dxa"/>
+              <w:end w:w="100" w:type="dxa"/>
+            </w:tcMar>
+          </w:tcPr>
+          <w:p>
+            <w:pPr>
+              <w:spacing w:after="20"/>
+            </w:pPr>
+            <w:r/>
+            <w:r>
+              <w:rPr>
+                <w:b w:val="0"/>
+                <w:sz w:val="17"/>
+              </w:rPr>
+              <w:t>Outputs support decisions but never place or recommend trades.</w:t>
+            </w:r>
+          </w:p>
+          <w:p>
+            <w:pPr>
+              <w:spacing w:after="0"/>
+            </w:pPr>
+            <w:r>
+              <w:rPr>
+                <w:b w:val="0"/>
+                <w:color w:val="6B7280"/>
+                <w:sz w:val="16"/>
+              </w:rPr>
+              <w:t>输出用于辅助决策，但不会执行或直接建议交易。</w:t>
+            </w:r>
+          </w:p>
+        </w:tc>
+      </w:tr>
+      <w:tr>
+        <w:tc>
+          <w:tcPr>
+            <w:tcW w:type="dxa" w:w="5112"/>
+            <w:shd w:fill="FFFFFF"/>
+            <w:vAlign w:val="center"/>
+            <w:tcMar>
+              <w:top w:w="90" w:type="dxa"/>
+              <w:start w:w="100" w:type="dxa"/>
+              <w:bottom w:w="90" w:type="dxa"/>
+              <w:end w:w="100" w:type="dxa"/>
+            </w:tcMar>
+          </w:tcPr>
+          <w:p>
+            <w:pPr>
+              <w:spacing w:after="20"/>
+            </w:pPr>
+            <w:r/>
+            <w:r>
+              <w:rPr>
+                <w:b/>
+                <w:sz w:val="17"/>
+              </w:rPr>
+              <w:t>Human review remains required</w:t>
+            </w:r>
+          </w:p>
+          <w:p>
+            <w:pPr>
+              <w:spacing w:after="0"/>
+            </w:pPr>
+            <w:r>
+              <w:rPr>
+                <w:b/>
+                <w:color w:val="6B7280"/>
+                <w:sz w:val="16"/>
+              </w:rPr>
+              <w:t>仍需人工复核</w:t>
+            </w:r>
+          </w:p>
+        </w:tc>
+        <w:tc>
+          <w:tcPr>
+            <w:tcW w:type="dxa" w:w="5112"/>
+            <w:shd w:fill="FFFFFF"/>
+            <w:vAlign w:val="center"/>
+            <w:tcMar>
+              <w:top w:w="90" w:type="dxa"/>
+              <w:start w:w="100" w:type="dxa"/>
+              <w:bottom w:w="90" w:type="dxa"/>
+              <w:end w:w="100" w:type="dxa"/>
+            </w:tcMar>
+          </w:tcPr>
+          <w:p>
+            <w:pPr>
+              <w:spacing w:after="20"/>
+            </w:pPr>
+            <w:r/>
+            <w:r>
+              <w:rPr>
+                <w:b w:val="0"/>
+                <w:sz w:val="17"/>
+              </w:rPr>
+              <w:t>Material decisions should be checked against original sources and current market conditions.</w:t>
+            </w:r>
+          </w:p>
+          <w:p>
+            <w:pPr>
+              <w:spacing w:after="0"/>
+            </w:pPr>
+            <w:r>
+              <w:rPr>
+                <w:b w:val="0"/>
+                <w:color w:val="6B7280"/>
+                <w:sz w:val="16"/>
+              </w:rPr>
+              <w:t>重要决策应结合原始来源及当时市场情况进行人工核实。</w:t>
+            </w:r>
+          </w:p>
+        </w:tc>
+      </w:tr>
+      <w:tr>
+        <w:tc>
+          <w:tcPr>
+            <w:tcW w:type="dxa" w:w="5112"/>
+            <w:shd w:fill="F2F2F2"/>
+            <w:vAlign w:val="center"/>
+            <w:tcMar>
+              <w:top w:w="90" w:type="dxa"/>
+              <w:start w:w="100" w:type="dxa"/>
+              <w:bottom w:w="90" w:type="dxa"/>
+              <w:end w:w="100" w:type="dxa"/>
+            </w:tcMar>
+          </w:tcPr>
+          <w:p>
+            <w:pPr>
+              <w:spacing w:after="20"/>
+            </w:pPr>
+            <w:r/>
+            <w:r>
+              <w:rPr>
+                <w:b/>
+                <w:sz w:val="17"/>
+              </w:rPr>
+              <w:t>Public-source limitations</w:t>
+            </w:r>
+          </w:p>
+          <w:p>
+            <w:pPr>
+              <w:spacing w:after="0"/>
+            </w:pPr>
+            <w:r>
+              <w:rPr>
+                <w:b/>
+                <w:color w:val="6B7280"/>
+                <w:sz w:val="16"/>
+              </w:rPr>
+              <w:t>公开来源限制</w:t>
+            </w:r>
+          </w:p>
+        </w:tc>
+        <w:tc>
+          <w:tcPr>
+            <w:tcW w:type="dxa" w:w="5112"/>
+            <w:shd w:fill="F2F2F2"/>
+            <w:vAlign w:val="center"/>
+            <w:tcMar>
+              <w:top w:w="90" w:type="dxa"/>
+              <w:start w:w="100" w:type="dxa"/>
+              <w:bottom w:w="90" w:type="dxa"/>
+              <w:end w:w="100" w:type="dxa"/>
+            </w:tcMar>
+          </w:tcPr>
+          <w:p>
+            <w:pPr>
+              <w:spacing w:after="20"/>
+            </w:pPr>
+            <w:r/>
+            <w:r>
+              <w:rPr>
+                <w:b w:val="0"/>
+                <w:sz w:val="17"/>
+              </w:rPr>
+              <w:t>Delays, missing dates or ambiguous headlines can affect interpretation.</w:t>
+            </w:r>
+          </w:p>
+          <w:p>
+            <w:pPr>
+              <w:spacing w:after="0"/>
+            </w:pPr>
+            <w:r>
+              <w:rPr>
+                <w:b w:val="0"/>
+                <w:color w:val="6B7280"/>
+                <w:sz w:val="16"/>
+              </w:rPr>
+              <w:t>信息延迟、日期缺失或标题歧义可能影响判断。</w:t>
+            </w:r>
+          </w:p>
+        </w:tc>
+      </w:tr>
+    </w:tbl>
+    <w:p>
+      <w:pPr>
+        <w:spacing w:before="200"/>
+        <w:jc w:val="center"/>
+      </w:pPr>
+      <w:r>
+        <w:rPr>
+          <w:b/>
+          <w:color w:val="17365D"/>
+          <w:sz w:val="22"/>
+        </w:rPr>
+        <w:t>Bottom line: two AI roles convert nine public source channels into one traceable executive briefing.</w:t>
       </w:r>
     </w:p>
     <w:p>
       <w:pPr>
-        <w:pStyle w:val="ListBullet"/>
-        <w:spacing w:after="40"/>
-      </w:pPr>
-      <w:r>
-        <w:t>Duplicate control: similar or repeated headlines are consolidated so the report does not over-count the same story. 去重控制：相似或重复标题会被合并，避免同一事件在报告中被重复放大。</w:t>
-      </w:r>
-    </w:p>
-    <w:p>
-      <w:pPr>
-        <w:pStyle w:val="ListBullet"/>
-        <w:spacing w:after="40"/>
-      </w:pPr>
-      <w:r>
-        <w:t>Pre-screening: direct USD/JPY, yen, BOJ, Fed, Treasury-yield, inflation, intervention, and risk-sentiment clues are used to identify relevant candidates. 预筛选：使用 USD/JPY、日元、日本央行、美联储、美债收益率、通胀、干预、风险情绪等线索识别候选新闻。</w:t>
-      </w:r>
-    </w:p>
-    <w:p>
-      <w:pPr>
-        <w:pStyle w:val="ListBullet"/>
-        <w:spacing w:after="40"/>
-      </w:pPr>
-      <w:r>
-        <w:t>Official-source preference: BOJ, Fed, and US Treasury items can pass the screen even when the headline does not explicitly say USD/JPY, as long as the topic has a clear macro or policy channel. 官方信源优先：BOJ、美联储、美国财政部新闻即使标题没有写 USD/JPY，只要有明确宏观或政策传导路径，也会进入评估。</w:t>
-      </w:r>
-    </w:p>
-    <w:p>
-      <w:pPr>
-        <w:pStyle w:val="ListBullet"/>
-        <w:spacing w:after="40"/>
-      </w:pPr>
-      <w:r>
-        <w:t>Noise reduction: generic forex headlines are filtered more strictly; FX media items need direct USD/JPY/Japan evidence or multiple strong macro clues. 降噪：泛泛的外汇新闻会被更严格过滤；外汇媒体条目需要直接的 USD/JPY/日本线索，或多个强宏观线索。</w:t>
-      </w:r>
-    </w:p>
-    <w:p>
-      <w:pPr>
-        <w:pStyle w:val="ListBullet"/>
-        <w:spacing w:after="40"/>
-      </w:pPr>
-      <w:r>
-        <w:t>Prioritization: official policy news and high-signal macro stories are ranked ahead of generic commentary, while source caps keep any one media feed from dominating. 排序：官方政策新闻和高信号宏观新闻优先于泛市场评论，同时限制单一媒体来源占比。</w:t>
-      </w:r>
-    </w:p>
-    <w:p>
-      <w:pPr>
-        <w:pStyle w:val="ListBullet"/>
-        <w:spacing w:after="40"/>
-      </w:pPr>
-      <w:r>
-        <w:t>Assessment: each selected story is evaluated for relevance, likely USD/JPY direction, confidence, transmission channel, and a short "why it matters" explanation. 评估：每条新闻都会形成相关性、可能方向、信心程度、传导渠道和“为什么重要”的简短解释。</w:t>
-      </w:r>
-    </w:p>
-    <w:p>
-      <w:pPr>
-        <w:pStyle w:val="ListBullet"/>
-        <w:spacing w:after="40"/>
-      </w:pPr>
-      <w:r>
-        <w:t>Summary: the final briefing uses recent higher-relevance stories, diversifies sources, removes near-duplicates, and produces an overall market read plus a watchlist. 总结：最终简报选取近期高相关新闻，兼顾信源多样性，去除近似重复，并生成整体市场解读和观察清单。</w:t>
-      </w:r>
-    </w:p>
-    <w:p>
-      <w:pPr>
-        <w:spacing w:before="200" w:after="80"/>
+        <w:jc w:val="center"/>
       </w:pPr>
       <w:r>
         <w:rPr>
           <w:b/>
-          <w:sz w:val="24"/>
+          <w:color w:val="2F75B5"/>
+          <w:sz w:val="20"/>
         </w:rPr>
-        <w:t>4. Relevance And Direction Logic / 相关性与方向解读</w:t>
-      </w:r>
-    </w:p>
-    <w:p>
-      <w:pPr>
-        <w:pStyle w:val="ListBullet"/>
-        <w:spacing w:after="40"/>
-      </w:pPr>
-      <w:r>
-        <w:t>High relevance: direct BOJ/Fed policy decisions, intervention risk, major inflation/rates surprises, or news with an immediate rate-differential channel. 高相关：直接的日美央行政策、汇率干预风险、重大通胀/利率意外，或对利差有直接影响的新闻。</w:t>
-      </w:r>
-    </w:p>
-    <w:p>
-      <w:pPr>
-        <w:pStyle w:val="ListBullet"/>
-        <w:spacing w:after="40"/>
-      </w:pPr>
-      <w:r>
-        <w:t>Medium relevance: macro stories with a clear yen or dollar transmission path, such as wages, JGB yields, Treasury yields, oil shocks, or Japan growth data. 中相关：有清晰日元或美元传导路径的宏观新闻，例如工资、日债收益率、美债收益率、油价冲击或日本增长数据。</w:t>
-      </w:r>
-    </w:p>
-    <w:p>
-      <w:pPr>
-        <w:pStyle w:val="ListBullet"/>
-        <w:spacing w:after="40"/>
-      </w:pPr>
-      <w:r>
-        <w:t>Low relevance: indirect but still useful context, such as trade, fiscal, commodity, or broad risk-sentiment developments. 低相关：影响较间接但仍有参考价值的背景信息，例如贸易、财政、商品或整体风险情绪变化。</w:t>
-      </w:r>
-    </w:p>
-    <w:p>
-      <w:pPr>
-        <w:pStyle w:val="ListBullet"/>
-        <w:spacing w:after="40"/>
-      </w:pPr>
-      <w:r>
-        <w:t>USD/JPY up means the dollar is stronger or the yen is weaker; USD/JPY down means the dollar is weaker or the yen is stronger. USD/JPY 上行表示美元走强或日元走弱；USD/JPY 下行表示美元走弱或日元走强。</w:t>
-      </w:r>
-    </w:p>
-    <w:p>
-      <w:pPr>
-        <w:pStyle w:val="ListBullet"/>
-        <w:spacing w:after="40"/>
-      </w:pPr>
-      <w:r>
-        <w:t>Mixed or unclear is used when competing forces exist or the headline does not support a clean directional read. 当多种力量相互抵消，或新闻本身不足以支持明确方向时，会标记为 Mixed 或 Unclear。</w:t>
-      </w:r>
-    </w:p>
-    <w:p>
-      <w:pPr>
-        <w:spacing w:before="200" w:after="80"/>
-      </w:pPr>
-      <w:r>
-        <w:rPr>
-          <w:b/>
-          <w:sz w:val="24"/>
-        </w:rPr>
-        <w:t>5. Report Structure / 报告结构</w:t>
-      </w:r>
-    </w:p>
-    <w:p>
-      <w:pPr>
-        <w:pStyle w:val="ListBullet"/>
-        <w:spacing w:after="40"/>
-      </w:pPr>
-      <w:r>
-        <w:t>Market Read: one concise paragraph summarizing the overall USD/JPY backdrop from the selected stories. Market Read：用一段话总结精选新闻所呈现的美元/日元整体背景。</w:t>
-      </w:r>
-    </w:p>
-    <w:p>
-      <w:pPr>
-        <w:pStyle w:val="ListBullet"/>
-        <w:spacing w:after="40"/>
-      </w:pPr>
-      <w:r>
-        <w:t>Top Stories: ranked stories with source, direction, relevance label, business takeaway, date, and read-more link. Top Stories：按重要性排序，展示信源、方向、相关性标签、业务要点、日期和原文链接。</w:t>
-      </w:r>
-    </w:p>
-    <w:p>
-      <w:pPr>
-        <w:pStyle w:val="ListBullet"/>
-        <w:spacing w:after="40"/>
-      </w:pPr>
-      <w:r>
-        <w:t>Watchlist: upcoming events, risks, or data points that may move USD/JPY next. Watchlist：列出后续可能影响美元/日元的事件、风险或数据。</w:t>
-      </w:r>
-    </w:p>
-    <w:p>
-      <w:pPr>
-        <w:pStyle w:val="ListBullet"/>
-        <w:spacing w:after="40"/>
-      </w:pPr>
-      <w:r>
-        <w:t>Source Citations: source links are kept so readers can trace the briefing back to the original public news. Source Citations：保留来源链接，方便读者回溯到原始公开新闻。</w:t>
-      </w:r>
-    </w:p>
-    <w:p>
-      <w:pPr>
-        <w:spacing w:before="200" w:after="80"/>
-      </w:pPr>
-      <w:r>
-        <w:rPr>
-          <w:b/>
-          <w:sz w:val="24"/>
-        </w:rPr>
-        <w:t>6. Business Boundaries / 业务边界</w:t>
-      </w:r>
-    </w:p>
-    <w:p>
-      <w:pPr>
-        <w:pStyle w:val="ListBullet"/>
-        <w:spacing w:after="40"/>
-      </w:pPr>
-      <w:r>
-        <w:t>This tracker explains narrative relevance; it does not prove historical correlation between news and USD/JPY price moves. 本工具解释新闻叙事相关性，不证明新闻与 USD/JPY 价格变化之间的历史统计相关。</w:t>
-      </w:r>
-    </w:p>
-    <w:p>
-      <w:pPr>
-        <w:pStyle w:val="ListBullet"/>
-        <w:spacing w:after="40"/>
-      </w:pPr>
-      <w:r>
-        <w:t>It does not replace real-time terminals, broker quotes, or trader judgment during fast markets. 它不能替代实时终端、券商报价，也不能替代快速行情中的交易员判断。</w:t>
-      </w:r>
-    </w:p>
-    <w:p>
-      <w:pPr>
-        <w:pStyle w:val="ListBullet"/>
-        <w:spacing w:after="40"/>
-      </w:pPr>
-      <w:r>
-        <w:t>Public-source delay, missing metadata, and ambiguous headlines can affect interpretation, so important decisions still require human review. 公开信源延迟、元数据缺失和标题歧义都可能影响解读，重要决策仍需人工复核。</w:t>
-      </w:r>
-    </w:p>
-    <w:p>
-      <w:pPr>
-        <w:pStyle w:val="ListBullet"/>
-        <w:spacing w:after="40"/>
-      </w:pPr>
-      <w:r>
-        <w:t>The source universe is intentionally focused on Japan, US policy, and FX commentary; it is not a complete global macro news terminal. 当前信源有意聚焦日本、美国政策和外汇评论，并不是完整的全球宏观新闻终端。</w:t>
-      </w:r>
-    </w:p>
-    <w:p>
-      <w:pPr>
-        <w:spacing w:before="240"/>
-      </w:pPr>
-      <w:r>
-        <w:rPr>
-          <w:i/>
-          <w:sz w:val="18"/>
-        </w:rPr>
-        <w:t>Updated to match current code behavior. / 已按当前代码行为更新。</w:t>
+        <w:t>结论：两个 AI 角色将 9 个公开信息渠道整合为一份可追溯的管理层简报。</w:t>
       </w:r>
     </w:p>
     <w:sectPr>
+      <w:headerReference w:type="default" r:id="rId9"/>
+      <w:footerReference w:type="default" r:id="rId10"/>
       <w:pgSz w:w="12240" w:h="15840"/>
-      <w:pgMar w:top="1080" w:right="1200" w:bottom="1080" w:left="1200" w:header="720" w:footer="720" w:gutter="0"/>
+      <w:pgMar w:top="936" w:right="1008" w:bottom="893" w:left="1008" w:header="720" w:footer="720" w:gutter="0"/>
       <w:cols w:space="720"/>
       <w:docGrid w:linePitch="360"/>
     </w:sectPr>
   </w:body>
 </w:document>
+</file>
+
+<file path=word/footer1.xml><?xml version="1.0" encoding="utf-8"?>
+<w:ftr xmlns:m="http://schemas.openxmlformats.org/officeDocument/2006/math" xmlns:mc="http://schemas.openxmlformats.org/markup-compatibility/2006" xmlns:mo="http://schemas.microsoft.com/office/mac/office/2008/main" xmlns:mv="urn:schemas-microsoft-com:mac:vml" xmlns:o="urn:schemas-microsoft-com:office:office" xmlns:r="http://schemas.openxmlformats.org/officeDocument/2006/relationships" xmlns:v="urn:schemas-microsoft-com:vml" xmlns:w10="urn:schemas-microsoft-com:office:word" xmlns:w14="http://schemas.microsoft.com/office/word/2010/wordml" xmlns:w="http://schemas.openxmlformats.org/wordprocessingml/2006/main" xmlns:wne="http://schemas.microsoft.com/office/word/2006/wordml" xmlns:wp14="http://schemas.microsoft.com/office/word/2010/wordprocessingDrawing" xmlns:wp="http://schemas.openxmlformats.org/drawingml/2006/wordprocessingDrawing" xmlns:wpc="http://schemas.microsoft.com/office/word/2010/wordprocessingCanvas" xmlns:wpg="http://schemas.microsoft.com/office/word/2010/wordprocessingGroup" xmlns:wpi="http://schemas.microsoft.com/office/word/2010/wordprocessingInk" xmlns:wps="http://schemas.microsoft.com/office/word/2010/wordprocessingShape" mc:Ignorable="w14 wp14">
+  <w:p>
+    <w:pPr>
+      <w:pStyle w:val="Footer"/>
+      <w:jc w:val="center"/>
+    </w:pPr>
+    <w:r>
+      <w:rPr>
+        <w:color w:val="6B7280"/>
+        <w:sz w:val="16"/>
+      </w:rPr>
+      <w:t>Internal working document  •  29 July 2026</w:t>
+    </w:r>
+  </w:p>
+</w:ftr>
+</file>
+
+<file path=word/header1.xml><?xml version="1.0" encoding="utf-8"?>
+<w:hdr xmlns:m="http://schemas.openxmlformats.org/officeDocument/2006/math" xmlns:mc="http://schemas.openxmlformats.org/markup-compatibility/2006" xmlns:mo="http://schemas.microsoft.com/office/mac/office/2008/main" xmlns:mv="urn:schemas-microsoft-com:mac:vml" xmlns:o="urn:schemas-microsoft-com:office:office" xmlns:r="http://schemas.openxmlformats.org/officeDocument/2006/relationships" xmlns:v="urn:schemas-microsoft-com:vml" xmlns:w10="urn:schemas-microsoft-com:office:word" xmlns:w14="http://schemas.microsoft.com/office/word/2010/wordml" xmlns:w="http://schemas.openxmlformats.org/wordprocessingml/2006/main" xmlns:wne="http://schemas.microsoft.com/office/word/2006/wordml" xmlns:wp14="http://schemas.microsoft.com/office/word/2010/wordprocessingDrawing" xmlns:wp="http://schemas.openxmlformats.org/drawingml/2006/wordprocessingDrawing" xmlns:wpc="http://schemas.microsoft.com/office/word/2010/wordprocessingCanvas" xmlns:wpg="http://schemas.microsoft.com/office/word/2010/wordprocessingGroup" xmlns:wpi="http://schemas.microsoft.com/office/word/2010/wordprocessingInk" xmlns:wps="http://schemas.microsoft.com/office/word/2010/wordprocessingShape" mc:Ignorable="w14 wp14">
+  <w:p>
+    <w:pPr>
+      <w:pStyle w:val="Header"/>
+      <w:jc w:val="right"/>
+    </w:pPr>
+    <w:r>
+      <w:rPr>
+        <w:color w:val="6B7280"/>
+        <w:sz w:val="16"/>
+      </w:rPr>
+      <w:t>USD/JPY NEWS TRACKER  |  EXECUTIVE OVERVIEW</w:t>
+    </w:r>
+  </w:p>
+</w:hdr>
 </file>
 
 <file path=word/numbering.xml><?xml version="1.0" encoding="utf-8"?>
@@ -737,8 +3973,11 @@
     <w:name w:val="Normal"/>
     <w:qFormat/>
     <w:rsid w:val="00FC693F"/>
+    <w:pPr>
+      <w:spacing w:after="100" w:line="252" w:lineRule="auto"/>
+    </w:pPr>
     <w:rPr>
-      <w:rFonts w:ascii="Calibri" w:hAnsi="Calibri" w:eastAsia="Microsoft YaHei"/>
+      <w:rFonts w:ascii="Aptos" w:hAnsi="Aptos" w:eastAsia="Microsoft YaHei"/>
       <w:sz w:val="21"/>
     </w:rPr>
   </w:style>
@@ -797,15 +4036,15 @@
     <w:pPr>
       <w:keepNext/>
       <w:keepLines/>
-      <w:spacing w:before="480" w:after="0"/>
+      <w:spacing w:before="160" w:after="120"/>
       <w:outlineLvl w:val="0"/>
     </w:pPr>
     <w:rPr>
-      <w:rFonts w:asciiTheme="majorHAnsi" w:eastAsiaTheme="majorEastAsia" w:hAnsiTheme="majorHAnsi" w:cstheme="majorBidi"/>
+      <w:rFonts w:asciiTheme="majorHAnsi" w:eastAsiaTheme="majorEastAsia" w:hAnsiTheme="majorHAnsi" w:cstheme="majorBidi" w:ascii="Aptos Display" w:hAnsi="Aptos Display" w:eastAsia="Microsoft YaHei"/>
       <w:b/>
       <w:bCs/>
-      <w:color w:val="365F91" w:themeColor="accent1" w:themeShade="BF"/>
-      <w:sz w:val="28"/>
+      <w:color w:val="17365D"/>
+      <w:sz w:val="36"/>
       <w:szCs w:val="28"/>
     </w:rPr>
   </w:style>
@@ -821,14 +4060,14 @@
     <w:pPr>
       <w:keepNext/>
       <w:keepLines/>
-      <w:spacing w:before="200" w:after="0"/>
+      <w:spacing w:before="160" w:after="120"/>
       <w:outlineLvl w:val="1"/>
     </w:pPr>
     <w:rPr>
-      <w:rFonts w:asciiTheme="majorHAnsi" w:eastAsiaTheme="majorEastAsia" w:hAnsiTheme="majorHAnsi" w:cstheme="majorBidi"/>
+      <w:rFonts w:asciiTheme="majorHAnsi" w:eastAsiaTheme="majorEastAsia" w:hAnsiTheme="majorHAnsi" w:cstheme="majorBidi" w:ascii="Aptos Display" w:hAnsi="Aptos Display" w:eastAsia="Microsoft YaHei"/>
       <w:b/>
       <w:bCs/>
-      <w:color w:val="4F81BD" w:themeColor="accent1"/>
+      <w:color w:val="2F75B5"/>
       <w:sz w:val="26"/>
       <w:szCs w:val="26"/>
     </w:rPr>
@@ -1086,15 +4325,16 @@
       <w:pBdr>
         <w:bottom w:val="single" w:sz="8" w:space="4" w:color="4F81BD" w:themeColor="accent1"/>
       </w:pBdr>
-      <w:spacing w:after="300" w:line="240" w:lineRule="auto"/>
+      <w:spacing w:after="120" w:line="240" w:lineRule="auto" w:before="160"/>
       <w:contextualSpacing/>
     </w:pPr>
     <w:rPr>
-      <w:rFonts w:asciiTheme="majorHAnsi" w:eastAsiaTheme="majorEastAsia" w:hAnsiTheme="majorHAnsi" w:cstheme="majorBidi"/>
-      <w:color w:val="17365D" w:themeColor="text2" w:themeShade="BF"/>
+      <w:rFonts w:asciiTheme="majorHAnsi" w:eastAsiaTheme="majorEastAsia" w:hAnsiTheme="majorHAnsi" w:cstheme="majorBidi" w:ascii="Aptos Display" w:hAnsi="Aptos Display" w:eastAsia="Microsoft YaHei"/>
+      <w:b/>
+      <w:color w:val="17365D"/>
       <w:spacing w:val="5"/>
       <w:kern w:val="28"/>
-      <w:sz w:val="52"/>
+      <w:sz w:val="56"/>
       <w:szCs w:val="52"/>
     </w:rPr>
   </w:style>

</xml_diff>

<commit_message>
Extract multi-profile framework with usdjpy as the only built-in profile.
Port profile-driven collection, scoring, analysis, summary, and tracker
persistence from the jp_storage feature work while excluding domain-specific
collectors, keywords, and ranking rules. Keep generic HTML selectors and
source-entity boost hooks with empty defaults.

Co-authored-by: Cursor <cursoragent@cursor.com>
</commit_message>
<xml_diff>
--- a/docs/USDJPY_News_Tracker_逻辑说明.docx
+++ b/docs/USDJPY_News_Tracker_逻辑说明.docx
@@ -3,32 +3,1165 @@
 <w:document xmlns:wpc="http://schemas.microsoft.com/office/word/2010/wordprocessingCanvas" xmlns:mo="http://schemas.microsoft.com/office/mac/office/2008/main" xmlns:mc="http://schemas.openxmlformats.org/markup-compatibility/2006" xmlns:mv="urn:schemas-microsoft-com:mac:vml" xmlns:o="urn:schemas-microsoft-com:office:office" xmlns:r="http://schemas.openxmlformats.org/officeDocument/2006/relationships" xmlns:m="http://schemas.openxmlformats.org/officeDocument/2006/math" xmlns:v="urn:schemas-microsoft-com:vml" xmlns:wp14="http://schemas.microsoft.com/office/word/2010/wordprocessingDrawing" xmlns:wp="http://schemas.openxmlformats.org/drawingml/2006/wordprocessingDrawing" xmlns:w10="urn:schemas-microsoft-com:office:word" xmlns:w="http://schemas.openxmlformats.org/wordprocessingml/2006/main" xmlns:w14="http://schemas.microsoft.com/office/word/2010/wordml" xmlns:wpg="http://schemas.microsoft.com/office/word/2010/wordprocessingGroup" xmlns:wpi="http://schemas.microsoft.com/office/word/2010/wordprocessingInk" xmlns:wne="http://schemas.microsoft.com/office/word/2006/wordml" xmlns:wps="http://schemas.microsoft.com/office/word/2010/wordprocessingShape" mc:Ignorable="w14 wp14">
   <w:body>
     <w:p>
+      <w:pPr>
+        <w:spacing w:before="720" w:after="160"/>
+      </w:pPr>
       <w:r>
         <w:rPr>
           <w:b/>
-          <w:sz w:val="36"/>
+          <w:color w:val="17365D"/>
+          <w:sz w:val="60"/>
         </w:rPr>
-        <w:t>USD/JPY News Tracker - Business Logic Summary / 业务逻辑说明</w:t>
+        <w:t>USD/JPY News Tracker</w:t>
       </w:r>
     </w:p>
     <w:p>
       <w:pPr>
-        <w:spacing w:after="160"/>
+        <w:spacing w:after="360"/>
       </w:pPr>
       <w:r>
-        <w:t>This document explains the current product logic from a business perspective only. 本文仅从业务角度说明当前 USD/JPY 新闻追踪器的逻辑，不涉及技术实现、服务器部署或运行配置。</w:t>
+        <w:rPr>
+          <w:b/>
+          <w:color w:val="2F75B5"/>
+          <w:sz w:val="36"/>
+        </w:rPr>
+        <w:t>Executive Operating Overview / 管理层运营概览</w:t>
       </w:r>
     </w:p>
     <w:p>
       <w:pPr>
-        <w:spacing w:before="200" w:after="80"/>
+        <w:spacing w:after="360"/>
+      </w:pPr>
+      <w:r>
+        <w:rPr>
+          <w:color w:val="6B7280"/>
+          <w:sz w:val="23"/>
+        </w:rPr>
+        <w:t>A concise view of the AI roles, information sources, workflow, outputs and controls.</w:t>
+      </w:r>
+    </w:p>
+    <w:p>
+      <w:pPr>
+        <w:spacing w:after="480"/>
+      </w:pPr>
+      <w:r>
+        <w:rPr>
+          <w:color w:val="6B7280"/>
+          <w:sz w:val="21"/>
+        </w:rPr>
+        <w:t>简要说明当前 AI 角色、信息来源、工作流程、交付物与管控边界。</w:t>
+      </w:r>
+    </w:p>
+    <w:tbl>
+      <w:tblPr>
+        <w:tblW w:type="auto" w:w="0"/>
+        <w:jc w:val="center"/>
+        <w:tblLayout w:type="autofit"/>
+        <w:tblLook w:firstColumn="1" w:firstRow="1" w:lastColumn="0" w:lastRow="0" w:noHBand="0" w:noVBand="1" w:val="04A0"/>
+      </w:tblPr>
+      <w:tblGrid>
+        <w:gridCol w:w="3408"/>
+        <w:gridCol w:w="3408"/>
+        <w:gridCol w:w="3408"/>
+      </w:tblGrid>
+      <w:tr>
+        <w:tc>
+          <w:tcPr>
+            <w:tcW w:type="dxa" w:w="3408"/>
+            <w:shd w:fill="DDEBF7"/>
+            <w:tcMar>
+              <w:top w:w="140" w:type="dxa"/>
+              <w:start w:w="130" w:type="dxa"/>
+              <w:bottom w:w="130" w:type="dxa"/>
+              <w:end w:w="130" w:type="dxa"/>
+            </w:tcMar>
+            <w:vAlign w:val="center"/>
+          </w:tcPr>
+          <w:p>
+            <w:pPr>
+              <w:spacing w:after="40"/>
+              <w:jc w:val="center"/>
+            </w:pPr>
+            <w:r>
+              <w:rPr>
+                <w:b/>
+                <w:color w:val="17365D"/>
+                <w:sz w:val="48"/>
+              </w:rPr>
+              <w:t>2</w:t>
+            </w:r>
+          </w:p>
+          <w:p>
+            <w:pPr>
+              <w:spacing w:after="20"/>
+              <w:jc w:val="center"/>
+            </w:pPr>
+            <w:r>
+              <w:rPr>
+                <w:b/>
+                <w:sz w:val="19"/>
+              </w:rPr>
+              <w:t>AI roles</w:t>
+            </w:r>
+          </w:p>
+          <w:p>
+            <w:pPr>
+              <w:spacing w:after="0"/>
+              <w:jc w:val="center"/>
+            </w:pPr>
+            <w:r>
+              <w:rPr>
+                <w:color w:val="6B7280"/>
+                <w:sz w:val="17"/>
+              </w:rPr>
+              <w:t>AI 角色</w:t>
+            </w:r>
+          </w:p>
+        </w:tc>
+        <w:tc>
+          <w:tcPr>
+            <w:tcW w:type="dxa" w:w="3408"/>
+            <w:shd w:fill="F3F7FB"/>
+            <w:tcMar>
+              <w:top w:w="140" w:type="dxa"/>
+              <w:start w:w="130" w:type="dxa"/>
+              <w:bottom w:w="130" w:type="dxa"/>
+              <w:end w:w="130" w:type="dxa"/>
+            </w:tcMar>
+            <w:vAlign w:val="center"/>
+          </w:tcPr>
+          <w:p>
+            <w:pPr>
+              <w:spacing w:after="40"/>
+              <w:jc w:val="center"/>
+            </w:pPr>
+            <w:r>
+              <w:rPr>
+                <w:b/>
+                <w:color w:val="17365D"/>
+                <w:sz w:val="48"/>
+              </w:rPr>
+              <w:t>9</w:t>
+            </w:r>
+          </w:p>
+          <w:p>
+            <w:pPr>
+              <w:spacing w:after="20"/>
+              <w:jc w:val="center"/>
+            </w:pPr>
+            <w:r>
+              <w:rPr>
+                <w:b/>
+                <w:sz w:val="19"/>
+              </w:rPr>
+              <w:t>source channels</w:t>
+            </w:r>
+          </w:p>
+          <w:p>
+            <w:pPr>
+              <w:spacing w:after="0"/>
+              <w:jc w:val="center"/>
+            </w:pPr>
+            <w:r>
+              <w:rPr>
+                <w:color w:val="6B7280"/>
+                <w:sz w:val="17"/>
+              </w:rPr>
+              <w:t>信息渠道</w:t>
+            </w:r>
+          </w:p>
+        </w:tc>
+        <w:tc>
+          <w:tcPr>
+            <w:tcW w:type="dxa" w:w="3408"/>
+            <w:shd w:fill="F2F2F2"/>
+            <w:tcMar>
+              <w:top w:w="140" w:type="dxa"/>
+              <w:start w:w="130" w:type="dxa"/>
+              <w:bottom w:w="130" w:type="dxa"/>
+              <w:end w:w="130" w:type="dxa"/>
+            </w:tcMar>
+            <w:vAlign w:val="center"/>
+          </w:tcPr>
+          <w:p>
+            <w:pPr>
+              <w:spacing w:after="40"/>
+              <w:jc w:val="center"/>
+            </w:pPr>
+            <w:r>
+              <w:rPr>
+                <w:b/>
+                <w:color w:val="17365D"/>
+                <w:sz w:val="48"/>
+              </w:rPr>
+              <w:t>1</w:t>
+            </w:r>
+          </w:p>
+          <w:p>
+            <w:pPr>
+              <w:spacing w:after="20"/>
+              <w:jc w:val="center"/>
+            </w:pPr>
+            <w:r>
+              <w:rPr>
+                <w:b/>
+                <w:sz w:val="19"/>
+              </w:rPr>
+              <w:t>executive brief</w:t>
+            </w:r>
+          </w:p>
+          <w:p>
+            <w:pPr>
+              <w:spacing w:after="0"/>
+              <w:jc w:val="center"/>
+            </w:pPr>
+            <w:r>
+              <w:rPr>
+                <w:color w:val="6B7280"/>
+                <w:sz w:val="17"/>
+              </w:rPr>
+              <w:t>管理层简报</w:t>
+            </w:r>
+          </w:p>
+        </w:tc>
+      </w:tr>
+    </w:tbl>
+    <w:p/>
+    <w:p>
+      <w:pPr>
+        <w:pStyle w:val="Heading1"/>
+        <w:keepNext/>
+      </w:pPr>
+      <w:r>
+        <w:t>Executive takeaway</w:t>
+      </w:r>
+      <w:r>
+        <w:rPr>
+          <w:color w:val="2F75B5"/>
+        </w:rPr>
+        <w:t xml:space="preserve">  /  管理层要点</w:t>
+      </w:r>
+    </w:p>
+    <w:p>
+      <w:pPr>
+        <w:spacing w:after="40"/>
+      </w:pPr>
+      <w:r>
+        <w:t>The tracker currently uses two distinct AI roles: one evaluates each news item for USD/JPY relevance and direction; the other interprets market impact and produces the executive briefing.</w:t>
+      </w:r>
+    </w:p>
+    <w:p>
+      <w:pPr>
+        <w:spacing w:after="120"/>
+      </w:pPr>
+      <w:r>
+        <w:rPr>
+          <w:color w:val="6B7280"/>
+          <w:sz w:val="19"/>
+        </w:rPr>
+        <w:t>系统目前设有两个明确的 AI 角色：第一个判断每条新闻与 USD/JPY 的相关性和可能方向；第二个解读市场影响并生成管理层简报。</w:t>
+      </w:r>
+    </w:p>
+    <w:p>
+      <w:pPr>
+        <w:spacing w:after="40"/>
+      </w:pPr>
+      <w:r>
+        <w:t>News collection, scheduling, duplicate removal and delivery are automated workflow components—not separate AI Agents.</w:t>
+      </w:r>
+    </w:p>
+    <w:p>
+      <w:pPr>
+        <w:spacing w:after="120"/>
+      </w:pPr>
+      <w:r>
+        <w:rPr>
+          <w:color w:val="6B7280"/>
+          <w:sz w:val="19"/>
+        </w:rPr>
+        <w:t>新闻采集、定时运行、去重和交付属于自动化流程，并不是独立的 AI Agent。</w:t>
+      </w:r>
+    </w:p>
+    <w:tbl>
+      <w:tblPr>
+        <w:tblStyle w:val="TableGrid"/>
+        <w:tblW w:type="auto" w:w="0"/>
+        <w:jc w:val="center"/>
+        <w:tblLook w:firstColumn="1" w:firstRow="1" w:lastColumn="0" w:lastRow="0" w:noHBand="0" w:noVBand="1" w:val="04A0"/>
+      </w:tblPr>
+      <w:tblGrid>
+        <w:gridCol w:w="2556"/>
+        <w:gridCol w:w="2556"/>
+        <w:gridCol w:w="2556"/>
+        <w:gridCol w:w="2556"/>
+      </w:tblGrid>
+      <w:tr>
+        <w:tc>
+          <w:tcPr>
+            <w:tcW w:type="dxa" w:w="2556"/>
+            <w:shd w:fill="17365D"/>
+            <w:vAlign w:val="center"/>
+            <w:tcMar>
+              <w:top w:w="90" w:type="dxa"/>
+              <w:start w:w="100" w:type="dxa"/>
+              <w:bottom w:w="90" w:type="dxa"/>
+              <w:end w:w="100" w:type="dxa"/>
+            </w:tcMar>
+          </w:tcPr>
+          <w:p>
+            <w:pPr>
+              <w:spacing w:after="20"/>
+            </w:pPr>
+            <w:r/>
+            <w:r>
+              <w:rPr>
+                <w:b/>
+                <w:color w:val="FFFFFF"/>
+                <w:sz w:val="18"/>
+              </w:rPr>
+              <w:t>1  Collect</w:t>
+            </w:r>
+          </w:p>
+          <w:p>
+            <w:pPr>
+              <w:spacing w:after="0"/>
+            </w:pPr>
+            <w:r>
+              <w:rPr>
+                <w:b/>
+                <w:color w:val="FFFFFF"/>
+                <w:sz w:val="17"/>
+              </w:rPr>
+              <w:t>采集</w:t>
+            </w:r>
+          </w:p>
+        </w:tc>
+        <w:tc>
+          <w:tcPr>
+            <w:tcW w:type="dxa" w:w="2556"/>
+            <w:shd w:fill="17365D"/>
+            <w:vAlign w:val="center"/>
+            <w:tcMar>
+              <w:top w:w="90" w:type="dxa"/>
+              <w:start w:w="100" w:type="dxa"/>
+              <w:bottom w:w="90" w:type="dxa"/>
+              <w:end w:w="100" w:type="dxa"/>
+            </w:tcMar>
+          </w:tcPr>
+          <w:p>
+            <w:pPr>
+              <w:spacing w:after="20"/>
+            </w:pPr>
+            <w:r/>
+            <w:r>
+              <w:rPr>
+                <w:b/>
+                <w:color w:val="FFFFFF"/>
+                <w:sz w:val="18"/>
+              </w:rPr>
+              <w:t>2  AI screen</w:t>
+            </w:r>
+          </w:p>
+          <w:p>
+            <w:pPr>
+              <w:spacing w:after="0"/>
+            </w:pPr>
+            <w:r>
+              <w:rPr>
+                <w:b/>
+                <w:color w:val="FFFFFF"/>
+                <w:sz w:val="17"/>
+              </w:rPr>
+              <w:t>AI 筛选</w:t>
+            </w:r>
+          </w:p>
+        </w:tc>
+        <w:tc>
+          <w:tcPr>
+            <w:tcW w:type="dxa" w:w="2556"/>
+            <w:shd w:fill="17365D"/>
+            <w:vAlign w:val="center"/>
+            <w:tcMar>
+              <w:top w:w="90" w:type="dxa"/>
+              <w:start w:w="100" w:type="dxa"/>
+              <w:bottom w:w="90" w:type="dxa"/>
+              <w:end w:w="100" w:type="dxa"/>
+            </w:tcMar>
+          </w:tcPr>
+          <w:p>
+            <w:pPr>
+              <w:spacing w:after="20"/>
+            </w:pPr>
+            <w:r/>
+            <w:r>
+              <w:rPr>
+                <w:b/>
+                <w:color w:val="FFFFFF"/>
+                <w:sz w:val="18"/>
+              </w:rPr>
+              <w:t>3  AI interpret</w:t>
+            </w:r>
+          </w:p>
+          <w:p>
+            <w:pPr>
+              <w:spacing w:after="0"/>
+            </w:pPr>
+            <w:r>
+              <w:rPr>
+                <w:b/>
+                <w:color w:val="FFFFFF"/>
+                <w:sz w:val="17"/>
+              </w:rPr>
+              <w:t>AI 解读</w:t>
+            </w:r>
+          </w:p>
+        </w:tc>
+        <w:tc>
+          <w:tcPr>
+            <w:tcW w:type="dxa" w:w="2556"/>
+            <w:shd w:fill="17365D"/>
+            <w:vAlign w:val="center"/>
+            <w:tcMar>
+              <w:top w:w="90" w:type="dxa"/>
+              <w:start w:w="100" w:type="dxa"/>
+              <w:bottom w:w="90" w:type="dxa"/>
+              <w:end w:w="100" w:type="dxa"/>
+            </w:tcMar>
+          </w:tcPr>
+          <w:p>
+            <w:pPr>
+              <w:spacing w:after="20"/>
+            </w:pPr>
+            <w:r/>
+            <w:r>
+              <w:rPr>
+                <w:b/>
+                <w:color w:val="FFFFFF"/>
+                <w:sz w:val="18"/>
+              </w:rPr>
+              <w:t>4  Deliver</w:t>
+            </w:r>
+          </w:p>
+          <w:p>
+            <w:pPr>
+              <w:spacing w:after="0"/>
+            </w:pPr>
+            <w:r>
+              <w:rPr>
+                <w:b/>
+                <w:color w:val="FFFFFF"/>
+                <w:sz w:val="17"/>
+              </w:rPr>
+              <w:t>交付</w:t>
+            </w:r>
+          </w:p>
+        </w:tc>
+      </w:tr>
+      <w:tr>
+        <w:tc>
+          <w:tcPr>
+            <w:tcW w:type="dxa" w:w="2556"/>
+            <w:shd w:fill="F3F7FB"/>
+            <w:vAlign w:val="center"/>
+            <w:tcMar>
+              <w:top w:w="90" w:type="dxa"/>
+              <w:start w:w="100" w:type="dxa"/>
+              <w:bottom w:w="90" w:type="dxa"/>
+              <w:end w:w="100" w:type="dxa"/>
+            </w:tcMar>
+          </w:tcPr>
+          <w:p>
+            <w:pPr>
+              <w:spacing w:after="20"/>
+            </w:pPr>
+            <w:r/>
+            <w:r>
+              <w:rPr>
+                <w:b w:val="0"/>
+                <w:sz w:val="17"/>
+              </w:rPr>
+              <w:t>Recent public news</w:t>
+            </w:r>
+          </w:p>
+          <w:p>
+            <w:pPr>
+              <w:spacing w:after="0"/>
+            </w:pPr>
+            <w:r>
+              <w:rPr>
+                <w:b w:val="0"/>
+                <w:color w:val="6B7280"/>
+                <w:sz w:val="16"/>
+              </w:rPr>
+              <w:t>近期公开新闻</w:t>
+            </w:r>
+          </w:p>
+        </w:tc>
+        <w:tc>
+          <w:tcPr>
+            <w:tcW w:type="dxa" w:w="2556"/>
+            <w:shd w:fill="F2F2F2"/>
+            <w:vAlign w:val="center"/>
+            <w:tcMar>
+              <w:top w:w="90" w:type="dxa"/>
+              <w:start w:w="100" w:type="dxa"/>
+              <w:bottom w:w="90" w:type="dxa"/>
+              <w:end w:w="100" w:type="dxa"/>
+            </w:tcMar>
+          </w:tcPr>
+          <w:p>
+            <w:pPr>
+              <w:spacing w:after="20"/>
+            </w:pPr>
+            <w:r/>
+            <w:r>
+              <w:rPr>
+                <w:b w:val="0"/>
+                <w:sz w:val="17"/>
+              </w:rPr>
+              <w:t>Relevance &amp; direction</w:t>
+            </w:r>
+          </w:p>
+          <w:p>
+            <w:pPr>
+              <w:spacing w:after="0"/>
+            </w:pPr>
+            <w:r>
+              <w:rPr>
+                <w:b w:val="0"/>
+                <w:color w:val="6B7280"/>
+                <w:sz w:val="16"/>
+              </w:rPr>
+              <w:t>相关性与方向</w:t>
+            </w:r>
+          </w:p>
+        </w:tc>
+        <w:tc>
+          <w:tcPr>
+            <w:tcW w:type="dxa" w:w="2556"/>
+            <w:shd w:fill="F3F7FB"/>
+            <w:vAlign w:val="center"/>
+            <w:tcMar>
+              <w:top w:w="90" w:type="dxa"/>
+              <w:start w:w="100" w:type="dxa"/>
+              <w:bottom w:w="90" w:type="dxa"/>
+              <w:end w:w="100" w:type="dxa"/>
+            </w:tcMar>
+          </w:tcPr>
+          <w:p>
+            <w:pPr>
+              <w:spacing w:after="20"/>
+            </w:pPr>
+            <w:r/>
+            <w:r>
+              <w:rPr>
+                <w:b w:val="0"/>
+                <w:sz w:val="17"/>
+              </w:rPr>
+              <w:t>Impact &amp; watchlist</w:t>
+            </w:r>
+          </w:p>
+          <w:p>
+            <w:pPr>
+              <w:spacing w:after="0"/>
+            </w:pPr>
+            <w:r>
+              <w:rPr>
+                <w:b w:val="0"/>
+                <w:color w:val="6B7280"/>
+                <w:sz w:val="16"/>
+              </w:rPr>
+              <w:t>影响与观察清单</w:t>
+            </w:r>
+          </w:p>
+        </w:tc>
+        <w:tc>
+          <w:tcPr>
+            <w:tcW w:type="dxa" w:w="2556"/>
+            <w:shd w:fill="F2F2F2"/>
+            <w:vAlign w:val="center"/>
+            <w:tcMar>
+              <w:top w:w="90" w:type="dxa"/>
+              <w:start w:w="100" w:type="dxa"/>
+              <w:bottom w:w="90" w:type="dxa"/>
+              <w:end w:w="100" w:type="dxa"/>
+            </w:tcMar>
+          </w:tcPr>
+          <w:p>
+            <w:pPr>
+              <w:spacing w:after="20"/>
+            </w:pPr>
+            <w:r/>
+            <w:r>
+              <w:rPr>
+                <w:b w:val="0"/>
+                <w:sz w:val="17"/>
+              </w:rPr>
+              <w:t>Word executive brief</w:t>
+            </w:r>
+          </w:p>
+          <w:p>
+            <w:pPr>
+              <w:spacing w:after="0"/>
+            </w:pPr>
+            <w:r>
+              <w:rPr>
+                <w:b w:val="0"/>
+                <w:color w:val="6B7280"/>
+                <w:sz w:val="16"/>
+              </w:rPr>
+              <w:t>Word 管理层简报</w:t>
+            </w:r>
+          </w:p>
+        </w:tc>
+      </w:tr>
+    </w:tbl>
+    <w:p>
+      <w:r>
+        <w:br w:type="page"/>
+      </w:r>
+    </w:p>
+    <w:p>
+      <w:pPr>
+        <w:pStyle w:val="Heading1"/>
+        <w:keepNext/>
+      </w:pPr>
+      <w:r>
+        <w:t>1. Current AI Agent model</w:t>
+      </w:r>
+      <w:r>
+        <w:rPr>
+          <w:color w:val="2F75B5"/>
+        </w:rPr>
+        <w:t xml:space="preserve">  /  当前 AI Agent 模式</w:t>
+      </w:r>
+    </w:p>
+    <w:p>
+      <w:pPr>
+        <w:spacing w:after="200"/>
       </w:pPr>
       <w:r>
         <w:rPr>
           <w:b/>
-          <w:sz w:val="24"/>
+          <w:color w:val="548235"/>
+          <w:sz w:val="26"/>
         </w:rPr>
-        <w:t>1. Business Purpose / 业务目标</w:t>
+        <w:t>Business definition: 2 AI Agents / roles</w:t>
+      </w:r>
+    </w:p>
+    <w:tbl>
+      <w:tblPr>
+        <w:tblStyle w:val="TableGrid"/>
+        <w:tblW w:type="auto" w:w="0"/>
+        <w:jc w:val="center"/>
+        <w:tblLook w:firstColumn="1" w:firstRow="1" w:lastColumn="0" w:lastRow="0" w:noHBand="0" w:noVBand="1" w:val="04A0"/>
+      </w:tblPr>
+      <w:tblGrid>
+        <w:gridCol w:w="2556"/>
+        <w:gridCol w:w="2556"/>
+        <w:gridCol w:w="2556"/>
+        <w:gridCol w:w="2556"/>
+      </w:tblGrid>
+      <w:tr>
+        <w:trPr>
+          <w:tblHeader w:val="true"/>
+        </w:trPr>
+        <w:tc>
+          <w:tcPr>
+            <w:tcW w:type="dxa" w:w="2556"/>
+            <w:shd w:fill="17365D"/>
+            <w:vAlign w:val="center"/>
+            <w:tcMar>
+              <w:top w:w="90" w:type="dxa"/>
+              <w:start w:w="100" w:type="dxa"/>
+              <w:bottom w:w="90" w:type="dxa"/>
+              <w:end w:w="100" w:type="dxa"/>
+            </w:tcMar>
+          </w:tcPr>
+          <w:p>
+            <w:pPr>
+              <w:spacing w:after="20"/>
+            </w:pPr>
+            <w:r/>
+            <w:r>
+              <w:rPr>
+                <w:b/>
+                <w:color w:val="FFFFFF"/>
+                <w:sz w:val="17"/>
+              </w:rPr>
+              <w:t>AI role</w:t>
+            </w:r>
+          </w:p>
+          <w:p>
+            <w:pPr>
+              <w:spacing w:after="0"/>
+            </w:pPr>
+            <w:r>
+              <w:rPr>
+                <w:b/>
+                <w:color w:val="FFFFFF"/>
+                <w:sz w:val="16"/>
+              </w:rPr>
+              <w:t>AI 角色</w:t>
+            </w:r>
+          </w:p>
+        </w:tc>
+        <w:tc>
+          <w:tcPr>
+            <w:tcW w:type="dxa" w:w="2556"/>
+            <w:shd w:fill="17365D"/>
+            <w:vAlign w:val="center"/>
+            <w:tcMar>
+              <w:top w:w="90" w:type="dxa"/>
+              <w:start w:w="100" w:type="dxa"/>
+              <w:bottom w:w="90" w:type="dxa"/>
+              <w:end w:w="100" w:type="dxa"/>
+            </w:tcMar>
+          </w:tcPr>
+          <w:p>
+            <w:pPr>
+              <w:spacing w:after="20"/>
+            </w:pPr>
+            <w:r/>
+            <w:r>
+              <w:rPr>
+                <w:b/>
+                <w:color w:val="FFFFFF"/>
+                <w:sz w:val="17"/>
+              </w:rPr>
+              <w:t>Primary task</w:t>
+            </w:r>
+          </w:p>
+          <w:p>
+            <w:pPr>
+              <w:spacing w:after="0"/>
+            </w:pPr>
+            <w:r>
+              <w:rPr>
+                <w:b/>
+                <w:color w:val="FFFFFF"/>
+                <w:sz w:val="16"/>
+              </w:rPr>
+              <w:t>主要任务</w:t>
+            </w:r>
+          </w:p>
+        </w:tc>
+        <w:tc>
+          <w:tcPr>
+            <w:tcW w:type="dxa" w:w="2556"/>
+            <w:shd w:fill="17365D"/>
+            <w:vAlign w:val="center"/>
+            <w:tcMar>
+              <w:top w:w="90" w:type="dxa"/>
+              <w:start w:w="100" w:type="dxa"/>
+              <w:bottom w:w="90" w:type="dxa"/>
+              <w:end w:w="100" w:type="dxa"/>
+            </w:tcMar>
+          </w:tcPr>
+          <w:p>
+            <w:pPr>
+              <w:spacing w:after="20"/>
+            </w:pPr>
+            <w:r/>
+            <w:r>
+              <w:rPr>
+                <w:b/>
+                <w:color w:val="FFFFFF"/>
+                <w:sz w:val="17"/>
+              </w:rPr>
+              <w:t>Business output</w:t>
+            </w:r>
+          </w:p>
+          <w:p>
+            <w:pPr>
+              <w:spacing w:after="0"/>
+            </w:pPr>
+            <w:r>
+              <w:rPr>
+                <w:b/>
+                <w:color w:val="FFFFFF"/>
+                <w:sz w:val="16"/>
+              </w:rPr>
+              <w:t>业务产出</w:t>
+            </w:r>
+          </w:p>
+        </w:tc>
+        <w:tc>
+          <w:tcPr>
+            <w:tcW w:type="dxa" w:w="2556"/>
+            <w:shd w:fill="17365D"/>
+            <w:vAlign w:val="center"/>
+            <w:tcMar>
+              <w:top w:w="90" w:type="dxa"/>
+              <w:start w:w="100" w:type="dxa"/>
+              <w:bottom w:w="90" w:type="dxa"/>
+              <w:end w:w="100" w:type="dxa"/>
+            </w:tcMar>
+          </w:tcPr>
+          <w:p>
+            <w:pPr>
+              <w:spacing w:after="20"/>
+            </w:pPr>
+            <w:r/>
+            <w:r>
+              <w:rPr>
+                <w:b/>
+                <w:color w:val="FFFFFF"/>
+                <w:sz w:val="17"/>
+              </w:rPr>
+              <w:t>What it does not do</w:t>
+            </w:r>
+          </w:p>
+          <w:p>
+            <w:pPr>
+              <w:spacing w:after="0"/>
+            </w:pPr>
+            <w:r>
+              <w:rPr>
+                <w:b/>
+                <w:color w:val="FFFFFF"/>
+                <w:sz w:val="16"/>
+              </w:rPr>
+              <w:t>不负责事项</w:t>
+            </w:r>
+          </w:p>
+        </w:tc>
+      </w:tr>
+      <w:tr>
+        <w:tc>
+          <w:tcPr>
+            <w:tcW w:type="dxa" w:w="2556"/>
+            <w:shd w:fill="FFFFFF"/>
+            <w:vAlign w:val="center"/>
+            <w:tcMar>
+              <w:top w:w="90" w:type="dxa"/>
+              <w:start w:w="100" w:type="dxa"/>
+              <w:bottom w:w="90" w:type="dxa"/>
+              <w:end w:w="100" w:type="dxa"/>
+            </w:tcMar>
+          </w:tcPr>
+          <w:p>
+            <w:pPr>
+              <w:spacing w:after="20"/>
+            </w:pPr>
+            <w:r/>
+            <w:r>
+              <w:rPr>
+                <w:b/>
+                <w:sz w:val="17"/>
+              </w:rPr>
+              <w:t>Agent 1</w:t>
+              <w:br/>
+              <w:t>News Relevance &amp; Signal</w:t>
+            </w:r>
+          </w:p>
+          <w:p>
+            <w:pPr>
+              <w:spacing w:after="0"/>
+            </w:pPr>
+            <w:r>
+              <w:rPr>
+                <w:b/>
+                <w:color w:val="6B7280"/>
+                <w:sz w:val="16"/>
+              </w:rPr>
+              <w:t>新闻相关性与信号判断</w:t>
+            </w:r>
+          </w:p>
+        </w:tc>
+        <w:tc>
+          <w:tcPr>
+            <w:tcW w:type="dxa" w:w="2556"/>
+            <w:shd w:fill="FFFFFF"/>
+            <w:vAlign w:val="center"/>
+            <w:tcMar>
+              <w:top w:w="90" w:type="dxa"/>
+              <w:start w:w="100" w:type="dxa"/>
+              <w:bottom w:w="90" w:type="dxa"/>
+              <w:end w:w="100" w:type="dxa"/>
+            </w:tcMar>
+          </w:tcPr>
+          <w:p>
+            <w:pPr>
+              <w:spacing w:after="20"/>
+            </w:pPr>
+            <w:r/>
+            <w:r>
+              <w:rPr>
+                <w:b w:val="0"/>
+                <w:sz w:val="17"/>
+              </w:rPr>
+              <w:t>Reviews each shortlisted item; assesses USD/JPY relevance, theme, likely direction and confidence.</w:t>
+            </w:r>
+          </w:p>
+          <w:p>
+            <w:pPr>
+              <w:spacing w:after="0"/>
+            </w:pPr>
+            <w:r>
+              <w:rPr>
+                <w:b w:val="0"/>
+                <w:color w:val="6B7280"/>
+                <w:sz w:val="16"/>
+              </w:rPr>
+              <w:t>审阅每条候选新闻，判断 USD/JPY 相关性、主题、可能方向及置信度。</w:t>
+            </w:r>
+          </w:p>
+        </w:tc>
+        <w:tc>
+          <w:tcPr>
+            <w:tcW w:type="dxa" w:w="2556"/>
+            <w:shd w:fill="FFFFFF"/>
+            <w:vAlign w:val="center"/>
+            <w:tcMar>
+              <w:top w:w="90" w:type="dxa"/>
+              <w:start w:w="100" w:type="dxa"/>
+              <w:bottom w:w="90" w:type="dxa"/>
+              <w:end w:w="100" w:type="dxa"/>
+            </w:tcMar>
+          </w:tcPr>
+          <w:p>
+            <w:pPr>
+              <w:spacing w:after="20"/>
+            </w:pPr>
+            <w:r/>
+            <w:r>
+              <w:rPr>
+                <w:b w:val="0"/>
+                <w:sz w:val="17"/>
+              </w:rPr>
+              <w:t>Prioritized news with a short explanation of why it matters.</w:t>
+            </w:r>
+          </w:p>
+          <w:p>
+            <w:pPr>
+              <w:spacing w:after="0"/>
+            </w:pPr>
+            <w:r>
+              <w:rPr>
+                <w:b w:val="0"/>
+                <w:color w:val="6B7280"/>
+                <w:sz w:val="16"/>
+              </w:rPr>
+              <w:t>形成新闻优先级及“为何重要”的简要说明。</w:t>
+            </w:r>
+          </w:p>
+        </w:tc>
+        <w:tc>
+          <w:tcPr>
+            <w:tcW w:type="dxa" w:w="2556"/>
+            <w:shd w:fill="FFFFFF"/>
+            <w:vAlign w:val="center"/>
+            <w:tcMar>
+              <w:top w:w="90" w:type="dxa"/>
+              <w:start w:w="100" w:type="dxa"/>
+              <w:bottom w:w="90" w:type="dxa"/>
+              <w:end w:w="100" w:type="dxa"/>
+            </w:tcMar>
+          </w:tcPr>
+          <w:p>
+            <w:pPr>
+              <w:spacing w:after="20"/>
+            </w:pPr>
+            <w:r/>
+            <w:r>
+              <w:rPr>
+                <w:b w:val="0"/>
+                <w:sz w:val="17"/>
+              </w:rPr>
+              <w:t>Does not execute trades or prove price causality.</w:t>
+            </w:r>
+          </w:p>
+          <w:p>
+            <w:pPr>
+              <w:spacing w:after="0"/>
+            </w:pPr>
+            <w:r>
+              <w:rPr>
+                <w:b w:val="0"/>
+                <w:color w:val="6B7280"/>
+                <w:sz w:val="16"/>
+              </w:rPr>
+              <w:t>不执行交易，也不证明新闻与价格之间的因果关系。</w:t>
+            </w:r>
+          </w:p>
+        </w:tc>
+      </w:tr>
+      <w:tr>
+        <w:tc>
+          <w:tcPr>
+            <w:tcW w:type="dxa" w:w="2556"/>
+            <w:shd w:fill="F3F7FB"/>
+            <w:vAlign w:val="center"/>
+            <w:tcMar>
+              <w:top w:w="90" w:type="dxa"/>
+              <w:start w:w="100" w:type="dxa"/>
+              <w:bottom w:w="90" w:type="dxa"/>
+              <w:end w:w="100" w:type="dxa"/>
+            </w:tcMar>
+          </w:tcPr>
+          <w:p>
+            <w:pPr>
+              <w:spacing w:after="20"/>
+            </w:pPr>
+            <w:r/>
+            <w:r>
+              <w:rPr>
+                <w:b/>
+                <w:sz w:val="17"/>
+              </w:rPr>
+              <w:t>Agent 2</w:t>
+              <w:br/>
+              <w:t>Market Impact &amp; Briefing</w:t>
+            </w:r>
+          </w:p>
+          <w:p>
+            <w:pPr>
+              <w:spacing w:after="0"/>
+            </w:pPr>
+            <w:r>
+              <w:rPr>
+                <w:b/>
+                <w:color w:val="6B7280"/>
+                <w:sz w:val="16"/>
+              </w:rPr>
+              <w:t>市场影响与简报生成</w:t>
+            </w:r>
+          </w:p>
+        </w:tc>
+        <w:tc>
+          <w:tcPr>
+            <w:tcW w:type="dxa" w:w="2556"/>
+            <w:shd w:fill="F3F7FB"/>
+            <w:vAlign w:val="center"/>
+            <w:tcMar>
+              <w:top w:w="90" w:type="dxa"/>
+              <w:start w:w="100" w:type="dxa"/>
+              <w:bottom w:w="90" w:type="dxa"/>
+              <w:end w:w="100" w:type="dxa"/>
+            </w:tcMar>
+          </w:tcPr>
+          <w:p>
+            <w:pPr>
+              <w:spacing w:after="20"/>
+            </w:pPr>
+            <w:r/>
+            <w:r>
+              <w:rPr>
+                <w:b w:val="0"/>
+                <w:sz w:val="17"/>
+              </w:rPr>
+              <w:t>Interprets transmission to USD/JPY, identifies the key institution/theme, suggests follow-up, and synthesizes the overall market read.</w:t>
+            </w:r>
+          </w:p>
+          <w:p>
+            <w:pPr>
+              <w:spacing w:after="0"/>
+            </w:pPr>
+            <w:r>
+              <w:rPr>
+                <w:b w:val="0"/>
+                <w:color w:val="6B7280"/>
+                <w:sz w:val="16"/>
+              </w:rPr>
+              <w:t>解读新闻如何影响 USD/JPY，识别关键机构或主题，提出后续关注点，并汇总整体市场判断。</w:t>
+            </w:r>
+          </w:p>
+        </w:tc>
+        <w:tc>
+          <w:tcPr>
+            <w:tcW w:type="dxa" w:w="2556"/>
+            <w:shd w:fill="F3F7FB"/>
+            <w:vAlign w:val="center"/>
+            <w:tcMar>
+              <w:top w:w="90" w:type="dxa"/>
+              <w:start w:w="100" w:type="dxa"/>
+              <w:bottom w:w="90" w:type="dxa"/>
+              <w:end w:w="100" w:type="dxa"/>
+            </w:tcMar>
+          </w:tcPr>
+          <w:p>
+            <w:pPr>
+              <w:spacing w:after="20"/>
+            </w:pPr>
+            <w:r/>
+            <w:r>
+              <w:rPr>
+                <w:b w:val="0"/>
+                <w:sz w:val="17"/>
+              </w:rPr>
+              <w:t>Executive narrative, top stories, monitoring actions and watchlist.</w:t>
+            </w:r>
+          </w:p>
+          <w:p>
+            <w:pPr>
+              <w:spacing w:after="0"/>
+            </w:pPr>
+            <w:r>
+              <w:rPr>
+                <w:b w:val="0"/>
+                <w:color w:val="6B7280"/>
+                <w:sz w:val="16"/>
+              </w:rPr>
+              <w:t>生成管理层摘要、重点新闻、监测建议及观察清单。</w:t>
+            </w:r>
+          </w:p>
+        </w:tc>
+        <w:tc>
+          <w:tcPr>
+            <w:tcW w:type="dxa" w:w="2556"/>
+            <w:shd w:fill="F3F7FB"/>
+            <w:vAlign w:val="center"/>
+            <w:tcMar>
+              <w:top w:w="90" w:type="dxa"/>
+              <w:start w:w="100" w:type="dxa"/>
+              <w:bottom w:w="90" w:type="dxa"/>
+              <w:end w:w="100" w:type="dxa"/>
+            </w:tcMar>
+          </w:tcPr>
+          <w:p>
+            <w:pPr>
+              <w:spacing w:after="20"/>
+            </w:pPr>
+            <w:r/>
+            <w:r>
+              <w:rPr>
+                <w:b w:val="0"/>
+                <w:sz w:val="17"/>
+              </w:rPr>
+              <w:t>Does not replace trader judgment or real-time market terminals.</w:t>
+            </w:r>
+          </w:p>
+          <w:p>
+            <w:pPr>
+              <w:spacing w:after="0"/>
+            </w:pPr>
+            <w:r>
+              <w:rPr>
+                <w:b w:val="0"/>
+                <w:color w:val="6B7280"/>
+                <w:sz w:val="16"/>
+              </w:rPr>
+              <w:t>不替代交易员判断或实时市场终端。</w:t>
+            </w:r>
+          </w:p>
+        </w:tc>
+      </w:tr>
+    </w:tbl>
+    <w:p/>
+    <w:p>
+      <w:pPr>
+        <w:pStyle w:val="Heading2"/>
+        <w:keepNext/>
+      </w:pPr>
+      <w:r>
+        <w:t>How the roles work together</w:t>
+      </w:r>
+      <w:r>
+        <w:rPr>
+          <w:color w:val="2F75B5"/>
+        </w:rPr>
+        <w:t xml:space="preserve">  /  两个角色如何协作</w:t>
       </w:r>
     </w:p>
     <w:p>
@@ -37,7 +1170,20 @@
         <w:spacing w:after="40"/>
       </w:pPr>
       <w:r>
-        <w:t>Purpose: turn scattered Japan, US policy, and FX market news into a concise USD/JPY briefing for traders and analysts. 目标：把分散的日本、美国政策和外汇市场新闻，整理成可快速阅读的美元/日元简报。</w:t>
+        <w:t>Agent 1 creates consistency at scale by applying the same USD/JPY lens to every candidate item.</w:t>
+      </w:r>
+    </w:p>
+    <w:p>
+      <w:pPr>
+        <w:pStyle w:val="ListBullet"/>
+        <w:spacing w:after="120"/>
+      </w:pPr>
+      <w:r>
+        <w:rPr>
+          <w:color w:val="6B7280"/>
+          <w:sz w:val="19"/>
+        </w:rPr>
+        <w:t>Agent 1 对所有候选新闻使用一致的 USD/JPY 判断标准，确保批量处理的一致性。</w:t>
       </w:r>
     </w:p>
     <w:p>
@@ -46,7 +1192,20 @@
         <w:spacing w:after="40"/>
       </w:pPr>
       <w:r>
-        <w:t>The brief is designed to answer three business questions: what happened, why it matters for USD/JPY, and what to watch next. 简报重点回答三个问题：发生了什么、为什么影响 USD/JPY、下一步关注什么。</w:t>
+        <w:t>Agent 2 adds context and converts the ranked items into an executive-level view of market drivers and next watchpoints.</w:t>
+      </w:r>
+    </w:p>
+    <w:p>
+      <w:pPr>
+        <w:pStyle w:val="ListBullet"/>
+        <w:spacing w:after="120"/>
+      </w:pPr>
+      <w:r>
+        <w:rPr>
+          <w:color w:val="6B7280"/>
+          <w:sz w:val="19"/>
+        </w:rPr>
+        <w:t>Agent 2 补充市场语境，将已排序新闻转化为管理层可读的市场驱动因素及后续观察点。</w:t>
       </w:r>
     </w:p>
     <w:p>
@@ -55,19 +1214,1808 @@
         <w:spacing w:after="40"/>
       </w:pPr>
       <w:r>
-        <w:t>The output is decision-support context, not a buy/sell instruction or a statistically tested trading signal. 输出定位是决策辅助信息，不是买卖建议，也不是经过统计回测的交易信号。</w:t>
+        <w:t>The two roles can use different AI models if required, while remaining one controlled workflow.</w:t>
       </w:r>
     </w:p>
     <w:p>
       <w:pPr>
-        <w:spacing w:before="200" w:after="80"/>
+        <w:pStyle w:val="ListBullet"/>
+        <w:spacing w:after="120"/>
       </w:pPr>
       <w:r>
         <w:rPr>
-          <w:b/>
-          <w:sz w:val="24"/>
+          <w:color w:val="6B7280"/>
+          <w:sz w:val="19"/>
         </w:rPr>
-        <w:t>2. Source Coverage / 信息覆盖范围</w:t>
+        <w:t>如业务需要，两个角色可使用不同 AI 模型，但仍在同一受控流程内运行。</w:t>
+      </w:r>
+    </w:p>
+    <w:p>
+      <w:r>
+        <w:br w:type="page"/>
+      </w:r>
+    </w:p>
+    <w:p>
+      <w:pPr>
+        <w:pStyle w:val="Heading1"/>
+        <w:keepNext/>
+      </w:pPr>
+      <w:r>
+        <w:t>2. Information sources</w:t>
+      </w:r>
+      <w:r>
+        <w:rPr>
+          <w:color w:val="2F75B5"/>
+        </w:rPr>
+        <w:t xml:space="preserve">  /  信息来源</w:t>
+      </w:r>
+    </w:p>
+    <w:p>
+      <w:pPr>
+        <w:spacing w:after="40"/>
+      </w:pPr>
+      <w:r>
+        <w:t>The current scope comprises nine public source channels across official institutions and established financial media. Official policy sources receive priority; FX media provides supplementary market context.</w:t>
+      </w:r>
+    </w:p>
+    <w:p>
+      <w:pPr>
+        <w:spacing w:after="120"/>
+      </w:pPr>
+      <w:r>
+        <w:rPr>
+          <w:color w:val="6B7280"/>
+          <w:sz w:val="19"/>
+        </w:rPr>
+        <w:t>当前覆盖 9 个公开信息渠道，包括官方机构和主流财经媒体。官方政策来源优先，外汇媒体用于补充市场观点。</w:t>
+      </w:r>
+    </w:p>
+    <w:tbl>
+      <w:tblPr>
+        <w:tblStyle w:val="TableGrid"/>
+        <w:tblW w:type="auto" w:w="0"/>
+        <w:jc w:val="center"/>
+        <w:tblLook w:firstColumn="1" w:firstRow="1" w:lastColumn="0" w:lastRow="0" w:noHBand="0" w:noVBand="1" w:val="04A0"/>
+      </w:tblPr>
+      <w:tblGrid>
+        <w:gridCol w:w="3408"/>
+        <w:gridCol w:w="3408"/>
+        <w:gridCol w:w="3408"/>
+      </w:tblGrid>
+      <w:tr>
+        <w:trPr>
+          <w:tblHeader w:val="true"/>
+        </w:trPr>
+        <w:tc>
+          <w:tcPr>
+            <w:tcW w:type="dxa" w:w="3408"/>
+            <w:shd w:fill="17365D"/>
+            <w:vAlign w:val="center"/>
+            <w:tcMar>
+              <w:top w:w="90" w:type="dxa"/>
+              <w:start w:w="100" w:type="dxa"/>
+              <w:bottom w:w="90" w:type="dxa"/>
+              <w:end w:w="100" w:type="dxa"/>
+            </w:tcMar>
+          </w:tcPr>
+          <w:p>
+            <w:pPr>
+              <w:spacing w:after="20"/>
+            </w:pPr>
+            <w:r/>
+            <w:r>
+              <w:rPr>
+                <w:b/>
+                <w:color w:val="FFFFFF"/>
+                <w:sz w:val="18"/>
+              </w:rPr>
+              <w:t>Source group</w:t>
+            </w:r>
+          </w:p>
+          <w:p>
+            <w:pPr>
+              <w:spacing w:after="0"/>
+            </w:pPr>
+            <w:r>
+              <w:rPr>
+                <w:b/>
+                <w:color w:val="FFFFFF"/>
+                <w:sz w:val="17"/>
+              </w:rPr>
+              <w:t>来源类别</w:t>
+            </w:r>
+          </w:p>
+        </w:tc>
+        <w:tc>
+          <w:tcPr>
+            <w:tcW w:type="dxa" w:w="3408"/>
+            <w:shd w:fill="17365D"/>
+            <w:vAlign w:val="center"/>
+            <w:tcMar>
+              <w:top w:w="90" w:type="dxa"/>
+              <w:start w:w="100" w:type="dxa"/>
+              <w:bottom w:w="90" w:type="dxa"/>
+              <w:end w:w="100" w:type="dxa"/>
+            </w:tcMar>
+          </w:tcPr>
+          <w:p>
+            <w:pPr>
+              <w:spacing w:after="20"/>
+            </w:pPr>
+            <w:r/>
+            <w:r>
+              <w:rPr>
+                <w:b/>
+                <w:color w:val="FFFFFF"/>
+                <w:sz w:val="18"/>
+              </w:rPr>
+              <w:t>Current channels</w:t>
+            </w:r>
+          </w:p>
+          <w:p>
+            <w:pPr>
+              <w:spacing w:after="0"/>
+            </w:pPr>
+            <w:r>
+              <w:rPr>
+                <w:b/>
+                <w:color w:val="FFFFFF"/>
+                <w:sz w:val="17"/>
+              </w:rPr>
+              <w:t>当前渠道</w:t>
+            </w:r>
+          </w:p>
+        </w:tc>
+        <w:tc>
+          <w:tcPr>
+            <w:tcW w:type="dxa" w:w="3408"/>
+            <w:shd w:fill="17365D"/>
+            <w:vAlign w:val="center"/>
+            <w:tcMar>
+              <w:top w:w="90" w:type="dxa"/>
+              <w:start w:w="100" w:type="dxa"/>
+              <w:bottom w:w="90" w:type="dxa"/>
+              <w:end w:w="100" w:type="dxa"/>
+            </w:tcMar>
+          </w:tcPr>
+          <w:p>
+            <w:pPr>
+              <w:spacing w:after="20"/>
+            </w:pPr>
+            <w:r/>
+            <w:r>
+              <w:rPr>
+                <w:b/>
+                <w:color w:val="FFFFFF"/>
+                <w:sz w:val="18"/>
+              </w:rPr>
+              <w:t>Information captured</w:t>
+            </w:r>
+          </w:p>
+          <w:p>
+            <w:pPr>
+              <w:spacing w:after="0"/>
+            </w:pPr>
+            <w:r>
+              <w:rPr>
+                <w:b/>
+                <w:color w:val="FFFFFF"/>
+                <w:sz w:val="17"/>
+              </w:rPr>
+              <w:t>抓取内容</w:t>
+            </w:r>
+          </w:p>
+        </w:tc>
+      </w:tr>
+      <w:tr>
+        <w:tc>
+          <w:tcPr>
+            <w:tcW w:type="dxa" w:w="3408"/>
+            <w:shd w:fill="FFFFFF"/>
+            <w:vAlign w:val="center"/>
+            <w:tcMar>
+              <w:top w:w="90" w:type="dxa"/>
+              <w:start w:w="100" w:type="dxa"/>
+              <w:bottom w:w="90" w:type="dxa"/>
+              <w:end w:w="100" w:type="dxa"/>
+            </w:tcMar>
+          </w:tcPr>
+          <w:p>
+            <w:pPr>
+              <w:spacing w:after="20"/>
+            </w:pPr>
+            <w:r/>
+            <w:r>
+              <w:rPr>
+                <w:b/>
+                <w:sz w:val="17"/>
+              </w:rPr>
+              <w:t>Japan — official</w:t>
+            </w:r>
+          </w:p>
+          <w:p>
+            <w:pPr>
+              <w:spacing w:after="0"/>
+            </w:pPr>
+            <w:r>
+              <w:rPr>
+                <w:b/>
+                <w:color w:val="6B7280"/>
+                <w:sz w:val="16"/>
+              </w:rPr>
+              <w:t>日本官方</w:t>
+            </w:r>
+          </w:p>
+        </w:tc>
+        <w:tc>
+          <w:tcPr>
+            <w:tcW w:type="dxa" w:w="3408"/>
+            <w:shd w:fill="FFFFFF"/>
+            <w:vAlign w:val="center"/>
+            <w:tcMar>
+              <w:top w:w="90" w:type="dxa"/>
+              <w:start w:w="100" w:type="dxa"/>
+              <w:bottom w:w="90" w:type="dxa"/>
+              <w:end w:w="100" w:type="dxa"/>
+            </w:tcMar>
+          </w:tcPr>
+          <w:p>
+            <w:pPr>
+              <w:spacing w:after="20"/>
+            </w:pPr>
+            <w:r/>
+            <w:r>
+              <w:rPr>
+                <w:b w:val="0"/>
+                <w:sz w:val="17"/>
+              </w:rPr>
+              <w:t>Bank of Japan: What's New</w:t>
+              <w:br/>
+              <w:t>Bank of Japan: Statistics</w:t>
+            </w:r>
+          </w:p>
+          <w:p>
+            <w:pPr>
+              <w:spacing w:after="0"/>
+            </w:pPr>
+            <w:r>
+              <w:rPr>
+                <w:b w:val="0"/>
+                <w:color w:val="6B7280"/>
+                <w:sz w:val="16"/>
+              </w:rPr>
+              <w:t>日本银行：最新发布</w:t>
+              <w:br/>
+              <w:t>日本银行：统计数据</w:t>
+            </w:r>
+          </w:p>
+        </w:tc>
+        <w:tc>
+          <w:tcPr>
+            <w:tcW w:type="dxa" w:w="3408"/>
+            <w:shd w:fill="FFFFFF"/>
+            <w:vAlign w:val="center"/>
+            <w:tcMar>
+              <w:top w:w="90" w:type="dxa"/>
+              <w:start w:w="100" w:type="dxa"/>
+              <w:bottom w:w="90" w:type="dxa"/>
+              <w:end w:w="100" w:type="dxa"/>
+            </w:tcMar>
+          </w:tcPr>
+          <w:p>
+            <w:pPr>
+              <w:spacing w:after="20"/>
+            </w:pPr>
+            <w:r/>
+            <w:r>
+              <w:rPr>
+                <w:b w:val="0"/>
+                <w:sz w:val="17"/>
+              </w:rPr>
+              <w:t>Policy announcements, official publications, monetary and economic statistics.</w:t>
+            </w:r>
+          </w:p>
+          <w:p>
+            <w:pPr>
+              <w:spacing w:after="0"/>
+            </w:pPr>
+            <w:r>
+              <w:rPr>
+                <w:b w:val="0"/>
+                <w:color w:val="6B7280"/>
+                <w:sz w:val="16"/>
+              </w:rPr>
+              <w:t>政策公告、官方发布、货币及经济统计数据。</w:t>
+            </w:r>
+          </w:p>
+        </w:tc>
+      </w:tr>
+      <w:tr>
+        <w:tc>
+          <w:tcPr>
+            <w:tcW w:type="dxa" w:w="3408"/>
+            <w:shd w:fill="F3F7FB"/>
+            <w:vAlign w:val="center"/>
+            <w:tcMar>
+              <w:top w:w="90" w:type="dxa"/>
+              <w:start w:w="100" w:type="dxa"/>
+              <w:bottom w:w="90" w:type="dxa"/>
+              <w:end w:w="100" w:type="dxa"/>
+            </w:tcMar>
+          </w:tcPr>
+          <w:p>
+            <w:pPr>
+              <w:spacing w:after="20"/>
+            </w:pPr>
+            <w:r/>
+            <w:r>
+              <w:rPr>
+                <w:b/>
+                <w:sz w:val="17"/>
+              </w:rPr>
+              <w:t>Japan — media</w:t>
+            </w:r>
+          </w:p>
+          <w:p>
+            <w:pPr>
+              <w:spacing w:after="0"/>
+            </w:pPr>
+            <w:r>
+              <w:rPr>
+                <w:b/>
+                <w:color w:val="6B7280"/>
+                <w:sz w:val="16"/>
+              </w:rPr>
+              <w:t>日本媒体</w:t>
+            </w:r>
+          </w:p>
+        </w:tc>
+        <w:tc>
+          <w:tcPr>
+            <w:tcW w:type="dxa" w:w="3408"/>
+            <w:shd w:fill="F3F7FB"/>
+            <w:vAlign w:val="center"/>
+            <w:tcMar>
+              <w:top w:w="90" w:type="dxa"/>
+              <w:start w:w="100" w:type="dxa"/>
+              <w:bottom w:w="90" w:type="dxa"/>
+              <w:end w:w="100" w:type="dxa"/>
+            </w:tcMar>
+          </w:tcPr>
+          <w:p>
+            <w:pPr>
+              <w:spacing w:after="20"/>
+            </w:pPr>
+            <w:r/>
+            <w:r>
+              <w:rPr>
+                <w:b w:val="0"/>
+                <w:sz w:val="17"/>
+              </w:rPr>
+              <w:t>Nikkei Asia</w:t>
+              <w:br/>
+              <w:t>NHK WORLD-JAPAN</w:t>
+            </w:r>
+          </w:p>
+          <w:p>
+            <w:pPr>
+              <w:spacing w:after="0"/>
+            </w:pPr>
+            <w:r>
+              <w:rPr>
+                <w:b w:val="0"/>
+                <w:color w:val="6B7280"/>
+                <w:sz w:val="16"/>
+              </w:rPr>
+              <w:t>Nikkei Asia</w:t>
+              <w:br/>
+              <w:t>NHK WORLD-JAPAN</w:t>
+            </w:r>
+          </w:p>
+        </w:tc>
+        <w:tc>
+          <w:tcPr>
+            <w:tcW w:type="dxa" w:w="3408"/>
+            <w:shd w:fill="F3F7FB"/>
+            <w:vAlign w:val="center"/>
+            <w:tcMar>
+              <w:top w:w="90" w:type="dxa"/>
+              <w:start w:w="100" w:type="dxa"/>
+              <w:bottom w:w="90" w:type="dxa"/>
+              <w:end w:w="100" w:type="dxa"/>
+            </w:tcMar>
+          </w:tcPr>
+          <w:p>
+            <w:pPr>
+              <w:spacing w:after="20"/>
+            </w:pPr>
+            <w:r/>
+            <w:r>
+              <w:rPr>
+                <w:b w:val="0"/>
+                <w:sz w:val="17"/>
+              </w:rPr>
+              <w:t>Japan macro, policy, corporate and market developments relevant to the yen.</w:t>
+            </w:r>
+          </w:p>
+          <w:p>
+            <w:pPr>
+              <w:spacing w:after="0"/>
+            </w:pPr>
+            <w:r>
+              <w:rPr>
+                <w:b w:val="0"/>
+                <w:color w:val="6B7280"/>
+                <w:sz w:val="16"/>
+              </w:rPr>
+              <w:t>与日元相关的日本宏观、政策、企业及市场动态。</w:t>
+            </w:r>
+          </w:p>
+        </w:tc>
+      </w:tr>
+      <w:tr>
+        <w:tc>
+          <w:tcPr>
+            <w:tcW w:type="dxa" w:w="3408"/>
+            <w:shd w:fill="FFFFFF"/>
+            <w:vAlign w:val="center"/>
+            <w:tcMar>
+              <w:top w:w="90" w:type="dxa"/>
+              <w:start w:w="100" w:type="dxa"/>
+              <w:bottom w:w="90" w:type="dxa"/>
+              <w:end w:w="100" w:type="dxa"/>
+            </w:tcMar>
+          </w:tcPr>
+          <w:p>
+            <w:pPr>
+              <w:spacing w:after="20"/>
+            </w:pPr>
+            <w:r/>
+            <w:r>
+              <w:rPr>
+                <w:b/>
+                <w:sz w:val="17"/>
+              </w:rPr>
+              <w:t>United States — official</w:t>
+            </w:r>
+          </w:p>
+          <w:p>
+            <w:pPr>
+              <w:spacing w:after="0"/>
+            </w:pPr>
+            <w:r>
+              <w:rPr>
+                <w:b/>
+                <w:color w:val="6B7280"/>
+                <w:sz w:val="16"/>
+              </w:rPr>
+              <w:t>美国官方</w:t>
+            </w:r>
+          </w:p>
+        </w:tc>
+        <w:tc>
+          <w:tcPr>
+            <w:tcW w:type="dxa" w:w="3408"/>
+            <w:shd w:fill="FFFFFF"/>
+            <w:vAlign w:val="center"/>
+            <w:tcMar>
+              <w:top w:w="90" w:type="dxa"/>
+              <w:start w:w="100" w:type="dxa"/>
+              <w:bottom w:w="90" w:type="dxa"/>
+              <w:end w:w="100" w:type="dxa"/>
+            </w:tcMar>
+          </w:tcPr>
+          <w:p>
+            <w:pPr>
+              <w:spacing w:after="20"/>
+            </w:pPr>
+            <w:r/>
+            <w:r>
+              <w:rPr>
+                <w:b w:val="0"/>
+                <w:sz w:val="17"/>
+              </w:rPr>
+              <w:t>Federal Reserve: monetary policy releases</w:t>
+              <w:br/>
+              <w:t>Federal Reserve: speeches</w:t>
+              <w:br/>
+              <w:t>US Treasury: press releases</w:t>
+            </w:r>
+          </w:p>
+          <w:p>
+            <w:pPr>
+              <w:spacing w:after="0"/>
+            </w:pPr>
+            <w:r>
+              <w:rPr>
+                <w:b w:val="0"/>
+                <w:color w:val="6B7280"/>
+                <w:sz w:val="16"/>
+              </w:rPr>
+              <w:t>美联储：货币政策发布</w:t>
+              <w:br/>
+              <w:t>美联储：官员讲话</w:t>
+              <w:br/>
+              <w:t>美国财政部：新闻稿</w:t>
+            </w:r>
+          </w:p>
+        </w:tc>
+        <w:tc>
+          <w:tcPr>
+            <w:tcW w:type="dxa" w:w="3408"/>
+            <w:shd w:fill="FFFFFF"/>
+            <w:vAlign w:val="center"/>
+            <w:tcMar>
+              <w:top w:w="90" w:type="dxa"/>
+              <w:start w:w="100" w:type="dxa"/>
+              <w:bottom w:w="90" w:type="dxa"/>
+              <w:end w:w="100" w:type="dxa"/>
+            </w:tcMar>
+          </w:tcPr>
+          <w:p>
+            <w:pPr>
+              <w:spacing w:after="20"/>
+            </w:pPr>
+            <w:r/>
+            <w:r>
+              <w:rPr>
+                <w:b w:val="0"/>
+                <w:sz w:val="17"/>
+              </w:rPr>
+              <w:t>Rate decisions, policy communication, speeches, fiscal and Treasury developments.</w:t>
+            </w:r>
+          </w:p>
+          <w:p>
+            <w:pPr>
+              <w:spacing w:after="0"/>
+            </w:pPr>
+            <w:r>
+              <w:rPr>
+                <w:b w:val="0"/>
+                <w:color w:val="6B7280"/>
+                <w:sz w:val="16"/>
+              </w:rPr>
+              <w:t>利率决策、政策沟通、官员讲话、财政及美国国债动态。</w:t>
+            </w:r>
+          </w:p>
+        </w:tc>
+      </w:tr>
+      <w:tr>
+        <w:tc>
+          <w:tcPr>
+            <w:tcW w:type="dxa" w:w="3408"/>
+            <w:shd w:fill="F3F7FB"/>
+            <w:vAlign w:val="center"/>
+            <w:tcMar>
+              <w:top w:w="90" w:type="dxa"/>
+              <w:start w:w="100" w:type="dxa"/>
+              <w:bottom w:w="90" w:type="dxa"/>
+              <w:end w:w="100" w:type="dxa"/>
+            </w:tcMar>
+          </w:tcPr>
+          <w:p>
+            <w:pPr>
+              <w:spacing w:after="20"/>
+            </w:pPr>
+            <w:r/>
+            <w:r>
+              <w:rPr>
+                <w:b/>
+                <w:sz w:val="17"/>
+              </w:rPr>
+              <w:t>FX market commentary</w:t>
+            </w:r>
+          </w:p>
+          <w:p>
+            <w:pPr>
+              <w:spacing w:after="0"/>
+            </w:pPr>
+            <w:r>
+              <w:rPr>
+                <w:b/>
+                <w:color w:val="6B7280"/>
+                <w:sz w:val="16"/>
+              </w:rPr>
+              <w:t>外汇市场评论</w:t>
+            </w:r>
+          </w:p>
+        </w:tc>
+        <w:tc>
+          <w:tcPr>
+            <w:tcW w:type="dxa" w:w="3408"/>
+            <w:shd w:fill="F3F7FB"/>
+            <w:vAlign w:val="center"/>
+            <w:tcMar>
+              <w:top w:w="90" w:type="dxa"/>
+              <w:start w:w="100" w:type="dxa"/>
+              <w:bottom w:w="90" w:type="dxa"/>
+              <w:end w:w="100" w:type="dxa"/>
+            </w:tcMar>
+          </w:tcPr>
+          <w:p>
+            <w:pPr>
+              <w:spacing w:after="20"/>
+            </w:pPr>
+            <w:r/>
+            <w:r>
+              <w:rPr>
+                <w:b w:val="0"/>
+                <w:sz w:val="17"/>
+              </w:rPr>
+              <w:t>FXStreet</w:t>
+              <w:br/>
+              <w:t>Investing.com Forex</w:t>
+            </w:r>
+          </w:p>
+          <w:p>
+            <w:pPr>
+              <w:spacing w:after="0"/>
+            </w:pPr>
+            <w:r>
+              <w:rPr>
+                <w:b w:val="0"/>
+                <w:color w:val="6B7280"/>
+                <w:sz w:val="16"/>
+              </w:rPr>
+              <w:t>FXStreet</w:t>
+              <w:br/>
+              <w:t>Investing.com 外汇</w:t>
+            </w:r>
+          </w:p>
+        </w:tc>
+        <w:tc>
+          <w:tcPr>
+            <w:tcW w:type="dxa" w:w="3408"/>
+            <w:shd w:fill="F3F7FB"/>
+            <w:vAlign w:val="center"/>
+            <w:tcMar>
+              <w:top w:w="90" w:type="dxa"/>
+              <w:start w:w="100" w:type="dxa"/>
+              <w:bottom w:w="90" w:type="dxa"/>
+              <w:end w:w="100" w:type="dxa"/>
+            </w:tcMar>
+          </w:tcPr>
+          <w:p>
+            <w:pPr>
+              <w:spacing w:after="20"/>
+            </w:pPr>
+            <w:r/>
+            <w:r>
+              <w:rPr>
+                <w:b w:val="0"/>
+                <w:sz w:val="17"/>
+              </w:rPr>
+              <w:t>Market reaction and FX commentary; treated as supporting context rather than primary official evidence.</w:t>
+            </w:r>
+          </w:p>
+          <w:p>
+            <w:pPr>
+              <w:spacing w:after="0"/>
+            </w:pPr>
+            <w:r>
+              <w:rPr>
+                <w:b w:val="0"/>
+                <w:color w:val="6B7280"/>
+                <w:sz w:val="16"/>
+              </w:rPr>
+              <w:t>市场反应及外汇评论；作为辅助背景，不作为最高优先级的官方依据。</w:t>
+            </w:r>
+          </w:p>
+        </w:tc>
+      </w:tr>
+    </w:tbl>
+    <w:p/>
+    <w:p>
+      <w:pPr>
+        <w:pStyle w:val="Heading2"/>
+        <w:keepNext/>
+      </w:pPr>
+      <w:r>
+        <w:t>What is captured</w:t>
+      </w:r>
+      <w:r>
+        <w:rPr>
+          <w:color w:val="2F75B5"/>
+        </w:rPr>
+        <w:t xml:space="preserve">  /  采集哪些数据</w:t>
+      </w:r>
+    </w:p>
+    <w:tbl>
+      <w:tblPr>
+        <w:tblStyle w:val="TableGrid"/>
+        <w:tblW w:type="auto" w:w="0"/>
+        <w:jc w:val="center"/>
+        <w:tblLook w:firstColumn="1" w:firstRow="1" w:lastColumn="0" w:lastRow="0" w:noHBand="0" w:noVBand="1" w:val="04A0"/>
+      </w:tblPr>
+      <w:tblGrid>
+        <w:gridCol w:w="3408"/>
+        <w:gridCol w:w="3408"/>
+        <w:gridCol w:w="3408"/>
+      </w:tblGrid>
+      <w:tr>
+        <w:tc>
+          <w:tcPr>
+            <w:tcW w:type="dxa" w:w="3408"/>
+            <w:shd w:fill="DDEBF7"/>
+            <w:vAlign w:val="center"/>
+            <w:tcMar>
+              <w:top w:w="90" w:type="dxa"/>
+              <w:start w:w="100" w:type="dxa"/>
+              <w:bottom w:w="90" w:type="dxa"/>
+              <w:end w:w="100" w:type="dxa"/>
+            </w:tcMar>
+          </w:tcPr>
+          <w:p>
+            <w:pPr>
+              <w:spacing w:after="20"/>
+            </w:pPr>
+            <w:r/>
+            <w:r>
+              <w:rPr>
+                <w:b/>
+                <w:color w:val="17365D"/>
+                <w:sz w:val="18"/>
+              </w:rPr>
+              <w:t>Headline &amp; excerpt</w:t>
+            </w:r>
+          </w:p>
+          <w:p>
+            <w:pPr>
+              <w:spacing w:after="0"/>
+            </w:pPr>
+            <w:r>
+              <w:rPr>
+                <w:b/>
+                <w:color w:val="17365D"/>
+                <w:sz w:val="17"/>
+              </w:rPr>
+              <w:t>标题与摘要</w:t>
+            </w:r>
+          </w:p>
+          <w:p>
+            <w:pPr>
+              <w:spacing w:after="20"/>
+            </w:pPr>
+            <w:r>
+              <w:rPr>
+                <w:sz w:val="17"/>
+              </w:rPr>
+              <w:t>Public headline and available summary/excerpt</w:t>
+            </w:r>
+          </w:p>
+          <w:p>
+            <w:pPr>
+              <w:spacing w:after="0"/>
+            </w:pPr>
+            <w:r>
+              <w:rPr>
+                <w:color w:val="6B7280"/>
+                <w:sz w:val="16"/>
+              </w:rPr>
+              <w:t>公开标题及可获取的摘要/摘录</w:t>
+            </w:r>
+          </w:p>
+        </w:tc>
+        <w:tc>
+          <w:tcPr>
+            <w:tcW w:type="dxa" w:w="3408"/>
+            <w:shd w:fill="DDEBF7"/>
+            <w:vAlign w:val="center"/>
+            <w:tcMar>
+              <w:top w:w="90" w:type="dxa"/>
+              <w:start w:w="100" w:type="dxa"/>
+              <w:bottom w:w="90" w:type="dxa"/>
+              <w:end w:w="100" w:type="dxa"/>
+            </w:tcMar>
+          </w:tcPr>
+          <w:p>
+            <w:pPr>
+              <w:spacing w:after="20"/>
+            </w:pPr>
+            <w:r/>
+            <w:r>
+              <w:rPr>
+                <w:b/>
+                <w:color w:val="17365D"/>
+                <w:sz w:val="18"/>
+              </w:rPr>
+              <w:t>Source &amp; link</w:t>
+            </w:r>
+          </w:p>
+          <w:p>
+            <w:pPr>
+              <w:spacing w:after="0"/>
+            </w:pPr>
+            <w:r>
+              <w:rPr>
+                <w:b/>
+                <w:color w:val="17365D"/>
+                <w:sz w:val="17"/>
+              </w:rPr>
+              <w:t>来源与链接</w:t>
+            </w:r>
+          </w:p>
+          <w:p>
+            <w:pPr>
+              <w:spacing w:after="20"/>
+            </w:pPr>
+            <w:r>
+              <w:rPr>
+                <w:sz w:val="17"/>
+              </w:rPr>
+              <w:t>Publisher identity and original URL</w:t>
+            </w:r>
+          </w:p>
+          <w:p>
+            <w:pPr>
+              <w:spacing w:after="0"/>
+            </w:pPr>
+            <w:r>
+              <w:rPr>
+                <w:color w:val="6B7280"/>
+                <w:sz w:val="16"/>
+              </w:rPr>
+              <w:t>发布方信息及原文链接</w:t>
+            </w:r>
+          </w:p>
+        </w:tc>
+        <w:tc>
+          <w:tcPr>
+            <w:tcW w:type="dxa" w:w="3408"/>
+            <w:shd w:fill="DDEBF7"/>
+            <w:vAlign w:val="center"/>
+            <w:tcMar>
+              <w:top w:w="90" w:type="dxa"/>
+              <w:start w:w="100" w:type="dxa"/>
+              <w:bottom w:w="90" w:type="dxa"/>
+              <w:end w:w="100" w:type="dxa"/>
+            </w:tcMar>
+          </w:tcPr>
+          <w:p>
+            <w:pPr>
+              <w:spacing w:after="20"/>
+            </w:pPr>
+            <w:r/>
+            <w:r>
+              <w:rPr>
+                <w:b/>
+                <w:color w:val="17365D"/>
+                <w:sz w:val="18"/>
+              </w:rPr>
+              <w:t>Timing</w:t>
+            </w:r>
+          </w:p>
+          <w:p>
+            <w:pPr>
+              <w:spacing w:after="0"/>
+            </w:pPr>
+            <w:r>
+              <w:rPr>
+                <w:b/>
+                <w:color w:val="17365D"/>
+                <w:sz w:val="17"/>
+              </w:rPr>
+              <w:t>时间信息</w:t>
+            </w:r>
+          </w:p>
+          <w:p>
+            <w:pPr>
+              <w:spacing w:after="20"/>
+            </w:pPr>
+            <w:r>
+              <w:rPr>
+                <w:sz w:val="17"/>
+              </w:rPr>
+              <w:t>Publication date where available; otherwise first-seen timing</w:t>
+            </w:r>
+          </w:p>
+          <w:p>
+            <w:pPr>
+              <w:spacing w:after="0"/>
+            </w:pPr>
+            <w:r>
+              <w:rPr>
+                <w:color w:val="6B7280"/>
+                <w:sz w:val="16"/>
+              </w:rPr>
+              <w:t>优先记录发布日期；缺失时使用首次发现时间</w:t>
+            </w:r>
+          </w:p>
+        </w:tc>
+      </w:tr>
+    </w:tbl>
+    <w:p>
+      <w:r>
+        <w:br w:type="page"/>
+      </w:r>
+    </w:p>
+    <w:p>
+      <w:pPr>
+        <w:pStyle w:val="Heading1"/>
+        <w:keepNext/>
+      </w:pPr>
+      <w:r>
+        <w:t>3. End-to-end business workflow</w:t>
+      </w:r>
+      <w:r>
+        <w:rPr>
+          <w:color w:val="2F75B5"/>
+        </w:rPr>
+        <w:t xml:space="preserve">  /  端到端业务流程</w:t>
+      </w:r>
+    </w:p>
+    <w:tbl>
+      <w:tblPr>
+        <w:tblStyle w:val="TableGrid"/>
+        <w:tblW w:type="auto" w:w="0"/>
+        <w:jc w:val="center"/>
+        <w:tblLook w:firstColumn="1" w:firstRow="1" w:lastColumn="0" w:lastRow="0" w:noHBand="0" w:noVBand="1" w:val="04A0"/>
+      </w:tblPr>
+      <w:tblGrid>
+        <w:gridCol w:w="3408"/>
+        <w:gridCol w:w="3408"/>
+        <w:gridCol w:w="3408"/>
+      </w:tblGrid>
+      <w:tr>
+        <w:trPr>
+          <w:tblHeader w:val="true"/>
+        </w:trPr>
+        <w:tc>
+          <w:tcPr>
+            <w:tcW w:type="dxa" w:w="3408"/>
+            <w:shd w:fill="17365D"/>
+            <w:vAlign w:val="center"/>
+            <w:tcMar>
+              <w:top w:w="90" w:type="dxa"/>
+              <w:start w:w="100" w:type="dxa"/>
+              <w:bottom w:w="90" w:type="dxa"/>
+              <w:end w:w="100" w:type="dxa"/>
+            </w:tcMar>
+          </w:tcPr>
+          <w:p>
+            <w:pPr>
+              <w:spacing w:after="20"/>
+            </w:pPr>
+            <w:r/>
+            <w:r>
+              <w:rPr>
+                <w:b/>
+                <w:color w:val="FFFFFF"/>
+                <w:sz w:val="18"/>
+              </w:rPr>
+              <w:t>Step</w:t>
+            </w:r>
+          </w:p>
+          <w:p>
+            <w:pPr>
+              <w:spacing w:after="0"/>
+            </w:pPr>
+            <w:r>
+              <w:rPr>
+                <w:b/>
+                <w:color w:val="FFFFFF"/>
+                <w:sz w:val="17"/>
+              </w:rPr>
+              <w:t>步骤</w:t>
+            </w:r>
+          </w:p>
+        </w:tc>
+        <w:tc>
+          <w:tcPr>
+            <w:tcW w:type="dxa" w:w="3408"/>
+            <w:shd w:fill="17365D"/>
+            <w:vAlign w:val="center"/>
+            <w:tcMar>
+              <w:top w:w="90" w:type="dxa"/>
+              <w:start w:w="100" w:type="dxa"/>
+              <w:bottom w:w="90" w:type="dxa"/>
+              <w:end w:w="100" w:type="dxa"/>
+            </w:tcMar>
+          </w:tcPr>
+          <w:p>
+            <w:pPr>
+              <w:spacing w:after="20"/>
+            </w:pPr>
+            <w:r/>
+            <w:r>
+              <w:rPr>
+                <w:b/>
+                <w:color w:val="FFFFFF"/>
+                <w:sz w:val="18"/>
+              </w:rPr>
+              <w:t>Business purpose</w:t>
+            </w:r>
+          </w:p>
+          <w:p>
+            <w:pPr>
+              <w:spacing w:after="0"/>
+            </w:pPr>
+            <w:r>
+              <w:rPr>
+                <w:b/>
+                <w:color w:val="FFFFFF"/>
+                <w:sz w:val="17"/>
+              </w:rPr>
+              <w:t>业务目的</w:t>
+            </w:r>
+          </w:p>
+        </w:tc>
+        <w:tc>
+          <w:tcPr>
+            <w:tcW w:type="dxa" w:w="3408"/>
+            <w:shd w:fill="17365D"/>
+            <w:vAlign w:val="center"/>
+            <w:tcMar>
+              <w:top w:w="90" w:type="dxa"/>
+              <w:start w:w="100" w:type="dxa"/>
+              <w:bottom w:w="90" w:type="dxa"/>
+              <w:end w:w="100" w:type="dxa"/>
+            </w:tcMar>
+          </w:tcPr>
+          <w:p>
+            <w:pPr>
+              <w:spacing w:after="20"/>
+            </w:pPr>
+            <w:r/>
+            <w:r>
+              <w:rPr>
+                <w:b/>
+                <w:color w:val="FFFFFF"/>
+                <w:sz w:val="18"/>
+              </w:rPr>
+              <w:t>Outcome</w:t>
+            </w:r>
+          </w:p>
+          <w:p>
+            <w:pPr>
+              <w:spacing w:after="0"/>
+            </w:pPr>
+            <w:r>
+              <w:rPr>
+                <w:b/>
+                <w:color w:val="FFFFFF"/>
+                <w:sz w:val="17"/>
+              </w:rPr>
+              <w:t>结果</w:t>
+            </w:r>
+          </w:p>
+        </w:tc>
+      </w:tr>
+      <w:tr>
+        <w:tc>
+          <w:tcPr>
+            <w:tcW w:type="dxa" w:w="3408"/>
+            <w:shd w:fill="DDEBF7"/>
+            <w:vAlign w:val="center"/>
+            <w:tcMar>
+              <w:top w:w="90" w:type="dxa"/>
+              <w:start w:w="100" w:type="dxa"/>
+              <w:bottom w:w="90" w:type="dxa"/>
+              <w:end w:w="100" w:type="dxa"/>
+            </w:tcMar>
+          </w:tcPr>
+          <w:p>
+            <w:pPr>
+              <w:spacing w:after="20"/>
+            </w:pPr>
+            <w:r/>
+            <w:r>
+              <w:rPr>
+                <w:b/>
+                <w:color w:val="17365D"/>
+                <w:sz w:val="17"/>
+              </w:rPr>
+              <w:t>1. Collect</w:t>
+            </w:r>
+          </w:p>
+          <w:p>
+            <w:pPr>
+              <w:spacing w:after="0"/>
+            </w:pPr>
+            <w:r>
+              <w:rPr>
+                <w:b/>
+                <w:color w:val="17365D"/>
+                <w:sz w:val="16"/>
+              </w:rPr>
+              <w:t>采集</w:t>
+            </w:r>
+          </w:p>
+        </w:tc>
+        <w:tc>
+          <w:tcPr>
+            <w:tcW w:type="dxa" w:w="3408"/>
+            <w:shd w:fill="FFFFFF"/>
+            <w:vAlign w:val="center"/>
+            <w:tcMar>
+              <w:top w:w="90" w:type="dxa"/>
+              <w:start w:w="100" w:type="dxa"/>
+              <w:bottom w:w="90" w:type="dxa"/>
+              <w:end w:w="100" w:type="dxa"/>
+            </w:tcMar>
+          </w:tcPr>
+          <w:p>
+            <w:pPr>
+              <w:spacing w:after="20"/>
+            </w:pPr>
+            <w:r/>
+            <w:r>
+              <w:rPr>
+                <w:b w:val="0"/>
+                <w:sz w:val="17"/>
+              </w:rPr>
+              <w:t>Gather recent public news from the nine configured channels.</w:t>
+            </w:r>
+          </w:p>
+          <w:p>
+            <w:pPr>
+              <w:spacing w:after="0"/>
+            </w:pPr>
+            <w:r>
+              <w:rPr>
+                <w:b w:val="0"/>
+                <w:color w:val="6B7280"/>
+                <w:sz w:val="16"/>
+              </w:rPr>
+              <w:t>从 9 个已配置渠道采集近期公开新闻。</w:t>
+            </w:r>
+          </w:p>
+        </w:tc>
+        <w:tc>
+          <w:tcPr>
+            <w:tcW w:type="dxa" w:w="3408"/>
+            <w:shd w:fill="FFFFFF"/>
+            <w:vAlign w:val="center"/>
+            <w:tcMar>
+              <w:top w:w="90" w:type="dxa"/>
+              <w:start w:w="100" w:type="dxa"/>
+              <w:bottom w:w="90" w:type="dxa"/>
+              <w:end w:w="100" w:type="dxa"/>
+            </w:tcMar>
+          </w:tcPr>
+          <w:p>
+            <w:pPr>
+              <w:spacing w:after="20"/>
+            </w:pPr>
+            <w:r/>
+            <w:r>
+              <w:rPr>
+                <w:b/>
+                <w:sz w:val="17"/>
+              </w:rPr>
+              <w:t>Source pool</w:t>
+            </w:r>
+          </w:p>
+          <w:p>
+            <w:pPr>
+              <w:spacing w:after="0"/>
+            </w:pPr>
+            <w:r>
+              <w:rPr>
+                <w:b/>
+                <w:color w:val="6B7280"/>
+                <w:sz w:val="16"/>
+              </w:rPr>
+              <w:t>来源池</w:t>
+            </w:r>
+          </w:p>
+        </w:tc>
+      </w:tr>
+      <w:tr>
+        <w:tc>
+          <w:tcPr>
+            <w:tcW w:type="dxa" w:w="3408"/>
+            <w:shd w:fill="DDEBF7"/>
+            <w:vAlign w:val="center"/>
+            <w:tcMar>
+              <w:top w:w="90" w:type="dxa"/>
+              <w:start w:w="100" w:type="dxa"/>
+              <w:bottom w:w="90" w:type="dxa"/>
+              <w:end w:w="100" w:type="dxa"/>
+            </w:tcMar>
+          </w:tcPr>
+          <w:p>
+            <w:pPr>
+              <w:spacing w:after="20"/>
+            </w:pPr>
+            <w:r/>
+            <w:r>
+              <w:rPr>
+                <w:b/>
+                <w:color w:val="17365D"/>
+                <w:sz w:val="17"/>
+              </w:rPr>
+              <w:t>2. Clean &amp; shortlist</w:t>
+            </w:r>
+          </w:p>
+          <w:p>
+            <w:pPr>
+              <w:spacing w:after="0"/>
+            </w:pPr>
+            <w:r>
+              <w:rPr>
+                <w:b/>
+                <w:color w:val="17365D"/>
+                <w:sz w:val="16"/>
+              </w:rPr>
+              <w:t>清理与初筛</w:t>
+            </w:r>
+          </w:p>
+        </w:tc>
+        <w:tc>
+          <w:tcPr>
+            <w:tcW w:type="dxa" w:w="3408"/>
+            <w:shd w:fill="F3F7FB"/>
+            <w:vAlign w:val="center"/>
+            <w:tcMar>
+              <w:top w:w="90" w:type="dxa"/>
+              <w:start w:w="100" w:type="dxa"/>
+              <w:bottom w:w="90" w:type="dxa"/>
+              <w:end w:w="100" w:type="dxa"/>
+            </w:tcMar>
+          </w:tcPr>
+          <w:p>
+            <w:pPr>
+              <w:spacing w:after="20"/>
+            </w:pPr>
+            <w:r/>
+            <w:r>
+              <w:rPr>
+                <w:b w:val="0"/>
+                <w:sz w:val="17"/>
+              </w:rPr>
+              <w:t>Remove repeats, apply freshness checks and filter out low-value noise.</w:t>
+            </w:r>
+          </w:p>
+          <w:p>
+            <w:pPr>
+              <w:spacing w:after="0"/>
+            </w:pPr>
+            <w:r>
+              <w:rPr>
+                <w:b w:val="0"/>
+                <w:color w:val="6B7280"/>
+                <w:sz w:val="16"/>
+              </w:rPr>
+              <w:t>去除重复内容，检查时效性，并过滤低价值噪音。</w:t>
+            </w:r>
+          </w:p>
+        </w:tc>
+        <w:tc>
+          <w:tcPr>
+            <w:tcW w:type="dxa" w:w="3408"/>
+            <w:shd w:fill="F3F7FB"/>
+            <w:vAlign w:val="center"/>
+            <w:tcMar>
+              <w:top w:w="90" w:type="dxa"/>
+              <w:start w:w="100" w:type="dxa"/>
+              <w:bottom w:w="90" w:type="dxa"/>
+              <w:end w:w="100" w:type="dxa"/>
+            </w:tcMar>
+          </w:tcPr>
+          <w:p>
+            <w:pPr>
+              <w:spacing w:after="20"/>
+            </w:pPr>
+            <w:r/>
+            <w:r>
+              <w:rPr>
+                <w:b/>
+                <w:sz w:val="17"/>
+              </w:rPr>
+              <w:t>Relevant candidates</w:t>
+            </w:r>
+          </w:p>
+          <w:p>
+            <w:pPr>
+              <w:spacing w:after="0"/>
+            </w:pPr>
+            <w:r>
+              <w:rPr>
+                <w:b/>
+                <w:color w:val="6B7280"/>
+                <w:sz w:val="16"/>
+              </w:rPr>
+              <w:t>相关候选新闻</w:t>
+            </w:r>
+          </w:p>
+        </w:tc>
+      </w:tr>
+      <w:tr>
+        <w:tc>
+          <w:tcPr>
+            <w:tcW w:type="dxa" w:w="3408"/>
+            <w:shd w:fill="DDEBF7"/>
+            <w:vAlign w:val="center"/>
+            <w:tcMar>
+              <w:top w:w="90" w:type="dxa"/>
+              <w:start w:w="100" w:type="dxa"/>
+              <w:bottom w:w="90" w:type="dxa"/>
+              <w:end w:w="100" w:type="dxa"/>
+            </w:tcMar>
+          </w:tcPr>
+          <w:p>
+            <w:pPr>
+              <w:spacing w:after="20"/>
+            </w:pPr>
+            <w:r/>
+            <w:r>
+              <w:rPr>
+                <w:b/>
+                <w:color w:val="17365D"/>
+                <w:sz w:val="17"/>
+              </w:rPr>
+              <w:t>3. AI relevance assessment</w:t>
+            </w:r>
+          </w:p>
+          <w:p>
+            <w:pPr>
+              <w:spacing w:after="0"/>
+            </w:pPr>
+            <w:r>
+              <w:rPr>
+                <w:b/>
+                <w:color w:val="17365D"/>
+                <w:sz w:val="16"/>
+              </w:rPr>
+              <w:t>AI 相关性判断</w:t>
+            </w:r>
+          </w:p>
+        </w:tc>
+        <w:tc>
+          <w:tcPr>
+            <w:tcW w:type="dxa" w:w="3408"/>
+            <w:shd w:fill="FFFFFF"/>
+            <w:vAlign w:val="center"/>
+            <w:tcMar>
+              <w:top w:w="90" w:type="dxa"/>
+              <w:start w:w="100" w:type="dxa"/>
+              <w:bottom w:w="90" w:type="dxa"/>
+              <w:end w:w="100" w:type="dxa"/>
+            </w:tcMar>
+          </w:tcPr>
+          <w:p>
+            <w:pPr>
+              <w:spacing w:after="20"/>
+            </w:pPr>
+            <w:r/>
+            <w:r>
+              <w:rPr>
+                <w:b w:val="0"/>
+                <w:sz w:val="17"/>
+              </w:rPr>
+              <w:t>Agent 1 ranks items and assesses topic, direction and confidence.</w:t>
+            </w:r>
+          </w:p>
+          <w:p>
+            <w:pPr>
+              <w:spacing w:after="0"/>
+            </w:pPr>
+            <w:r>
+              <w:rPr>
+                <w:b w:val="0"/>
+                <w:color w:val="6B7280"/>
+                <w:sz w:val="16"/>
+              </w:rPr>
+              <w:t>Agent 1 对新闻排序，并判断主题、方向和置信度。</w:t>
+            </w:r>
+          </w:p>
+        </w:tc>
+        <w:tc>
+          <w:tcPr>
+            <w:tcW w:type="dxa" w:w="3408"/>
+            <w:shd w:fill="FFFFFF"/>
+            <w:vAlign w:val="center"/>
+            <w:tcMar>
+              <w:top w:w="90" w:type="dxa"/>
+              <w:start w:w="100" w:type="dxa"/>
+              <w:bottom w:w="90" w:type="dxa"/>
+              <w:end w:w="100" w:type="dxa"/>
+            </w:tcMar>
+          </w:tcPr>
+          <w:p>
+            <w:pPr>
+              <w:spacing w:after="20"/>
+            </w:pPr>
+            <w:r/>
+            <w:r>
+              <w:rPr>
+                <w:b/>
+                <w:sz w:val="17"/>
+              </w:rPr>
+              <w:t>Ranked signals</w:t>
+            </w:r>
+          </w:p>
+          <w:p>
+            <w:pPr>
+              <w:spacing w:after="0"/>
+            </w:pPr>
+            <w:r>
+              <w:rPr>
+                <w:b/>
+                <w:color w:val="6B7280"/>
+                <w:sz w:val="16"/>
+              </w:rPr>
+              <w:t>排序后的信号</w:t>
+            </w:r>
+          </w:p>
+        </w:tc>
+      </w:tr>
+      <w:tr>
+        <w:tc>
+          <w:tcPr>
+            <w:tcW w:type="dxa" w:w="3408"/>
+            <w:shd w:fill="DDEBF7"/>
+            <w:vAlign w:val="center"/>
+            <w:tcMar>
+              <w:top w:w="90" w:type="dxa"/>
+              <w:start w:w="100" w:type="dxa"/>
+              <w:bottom w:w="90" w:type="dxa"/>
+              <w:end w:w="100" w:type="dxa"/>
+            </w:tcMar>
+          </w:tcPr>
+          <w:p>
+            <w:pPr>
+              <w:spacing w:after="20"/>
+            </w:pPr>
+            <w:r/>
+            <w:r>
+              <w:rPr>
+                <w:b/>
+                <w:color w:val="17365D"/>
+                <w:sz w:val="17"/>
+              </w:rPr>
+              <w:t>4. AI impact interpretation</w:t>
+            </w:r>
+          </w:p>
+          <w:p>
+            <w:pPr>
+              <w:spacing w:after="0"/>
+            </w:pPr>
+            <w:r>
+              <w:rPr>
+                <w:b/>
+                <w:color w:val="17365D"/>
+                <w:sz w:val="16"/>
+              </w:rPr>
+              <w:t>AI 影响解读</w:t>
+            </w:r>
+          </w:p>
+        </w:tc>
+        <w:tc>
+          <w:tcPr>
+            <w:tcW w:type="dxa" w:w="3408"/>
+            <w:shd w:fill="F3F7FB"/>
+            <w:vAlign w:val="center"/>
+            <w:tcMar>
+              <w:top w:w="90" w:type="dxa"/>
+              <w:start w:w="100" w:type="dxa"/>
+              <w:bottom w:w="90" w:type="dxa"/>
+              <w:end w:w="100" w:type="dxa"/>
+            </w:tcMar>
+          </w:tcPr>
+          <w:p>
+            <w:pPr>
+              <w:spacing w:after="20"/>
+            </w:pPr>
+            <w:r/>
+            <w:r>
+              <w:rPr>
+                <w:b w:val="0"/>
+                <w:sz w:val="17"/>
+              </w:rPr>
+              <w:t>Agent 2 explains market transmission and identifies follow-up actions.</w:t>
+            </w:r>
+          </w:p>
+          <w:p>
+            <w:pPr>
+              <w:spacing w:after="0"/>
+            </w:pPr>
+            <w:r>
+              <w:rPr>
+                <w:b w:val="0"/>
+                <w:color w:val="6B7280"/>
+                <w:sz w:val="16"/>
+              </w:rPr>
+              <w:t>Agent 2 解释市场传导逻辑并识别后续关注事项。</w:t>
+            </w:r>
+          </w:p>
+        </w:tc>
+        <w:tc>
+          <w:tcPr>
+            <w:tcW w:type="dxa" w:w="3408"/>
+            <w:shd w:fill="F3F7FB"/>
+            <w:vAlign w:val="center"/>
+            <w:tcMar>
+              <w:top w:w="90" w:type="dxa"/>
+              <w:start w:w="100" w:type="dxa"/>
+              <w:bottom w:w="90" w:type="dxa"/>
+              <w:end w:w="100" w:type="dxa"/>
+            </w:tcMar>
+          </w:tcPr>
+          <w:p>
+            <w:pPr>
+              <w:spacing w:after="20"/>
+            </w:pPr>
+            <w:r/>
+            <w:r>
+              <w:rPr>
+                <w:b/>
+                <w:sz w:val="17"/>
+              </w:rPr>
+              <w:t>Actionable context</w:t>
+            </w:r>
+          </w:p>
+          <w:p>
+            <w:pPr>
+              <w:spacing w:after="0"/>
+            </w:pPr>
+            <w:r>
+              <w:rPr>
+                <w:b/>
+                <w:color w:val="6B7280"/>
+                <w:sz w:val="16"/>
+              </w:rPr>
+              <w:t>可行动的市场语境</w:t>
+            </w:r>
+          </w:p>
+        </w:tc>
+      </w:tr>
+      <w:tr>
+        <w:tc>
+          <w:tcPr>
+            <w:tcW w:type="dxa" w:w="3408"/>
+            <w:shd w:fill="DDEBF7"/>
+            <w:vAlign w:val="center"/>
+            <w:tcMar>
+              <w:top w:w="90" w:type="dxa"/>
+              <w:start w:w="100" w:type="dxa"/>
+              <w:bottom w:w="90" w:type="dxa"/>
+              <w:end w:w="100" w:type="dxa"/>
+            </w:tcMar>
+          </w:tcPr>
+          <w:p>
+            <w:pPr>
+              <w:spacing w:after="20"/>
+            </w:pPr>
+            <w:r/>
+            <w:r>
+              <w:rPr>
+                <w:b/>
+                <w:color w:val="17365D"/>
+                <w:sz w:val="17"/>
+              </w:rPr>
+              <w:t>5. Executive synthesis</w:t>
+            </w:r>
+          </w:p>
+          <w:p>
+            <w:pPr>
+              <w:spacing w:after="0"/>
+            </w:pPr>
+            <w:r>
+              <w:rPr>
+                <w:b/>
+                <w:color w:val="17365D"/>
+                <w:sz w:val="16"/>
+              </w:rPr>
+              <w:t>管理层汇总</w:t>
+            </w:r>
+          </w:p>
+        </w:tc>
+        <w:tc>
+          <w:tcPr>
+            <w:tcW w:type="dxa" w:w="3408"/>
+            <w:shd w:fill="FFFFFF"/>
+            <w:vAlign w:val="center"/>
+            <w:tcMar>
+              <w:top w:w="90" w:type="dxa"/>
+              <w:start w:w="100" w:type="dxa"/>
+              <w:bottom w:w="90" w:type="dxa"/>
+              <w:end w:w="100" w:type="dxa"/>
+            </w:tcMar>
+          </w:tcPr>
+          <w:p>
+            <w:pPr>
+              <w:spacing w:after="20"/>
+            </w:pPr>
+            <w:r/>
+            <w:r>
+              <w:rPr>
+                <w:b w:val="0"/>
+                <w:sz w:val="17"/>
+              </w:rPr>
+              <w:t>Create the overall market read, top stories and watchlist.</w:t>
+            </w:r>
+          </w:p>
+          <w:p>
+            <w:pPr>
+              <w:spacing w:after="0"/>
+            </w:pPr>
+            <w:r>
+              <w:rPr>
+                <w:b w:val="0"/>
+                <w:color w:val="6B7280"/>
+                <w:sz w:val="16"/>
+              </w:rPr>
+              <w:t>生成整体市场判断、重点新闻和观察清单。</w:t>
+            </w:r>
+          </w:p>
+        </w:tc>
+        <w:tc>
+          <w:tcPr>
+            <w:tcW w:type="dxa" w:w="3408"/>
+            <w:shd w:fill="FFFFFF"/>
+            <w:vAlign w:val="center"/>
+            <w:tcMar>
+              <w:top w:w="90" w:type="dxa"/>
+              <w:start w:w="100" w:type="dxa"/>
+              <w:bottom w:w="90" w:type="dxa"/>
+              <w:end w:w="100" w:type="dxa"/>
+            </w:tcMar>
+          </w:tcPr>
+          <w:p>
+            <w:pPr>
+              <w:spacing w:after="20"/>
+            </w:pPr>
+            <w:r/>
+            <w:r>
+              <w:rPr>
+                <w:b/>
+                <w:sz w:val="17"/>
+              </w:rPr>
+              <w:t>Executive view</w:t>
+            </w:r>
+          </w:p>
+          <w:p>
+            <w:pPr>
+              <w:spacing w:after="0"/>
+            </w:pPr>
+            <w:r>
+              <w:rPr>
+                <w:b/>
+                <w:color w:val="6B7280"/>
+                <w:sz w:val="16"/>
+              </w:rPr>
+              <w:t>管理层视图</w:t>
+            </w:r>
+          </w:p>
+        </w:tc>
+      </w:tr>
+      <w:tr>
+        <w:tc>
+          <w:tcPr>
+            <w:tcW w:type="dxa" w:w="3408"/>
+            <w:shd w:fill="DDEBF7"/>
+            <w:vAlign w:val="center"/>
+            <w:tcMar>
+              <w:top w:w="90" w:type="dxa"/>
+              <w:start w:w="100" w:type="dxa"/>
+              <w:bottom w:w="90" w:type="dxa"/>
+              <w:end w:w="100" w:type="dxa"/>
+            </w:tcMar>
+          </w:tcPr>
+          <w:p>
+            <w:pPr>
+              <w:spacing w:after="20"/>
+            </w:pPr>
+            <w:r/>
+            <w:r>
+              <w:rPr>
+                <w:b/>
+                <w:color w:val="17365D"/>
+                <w:sz w:val="17"/>
+              </w:rPr>
+              <w:t>6. Deliver &amp; trace</w:t>
+            </w:r>
+          </w:p>
+          <w:p>
+            <w:pPr>
+              <w:spacing w:after="0"/>
+            </w:pPr>
+            <w:r>
+              <w:rPr>
+                <w:b/>
+                <w:color w:val="17365D"/>
+                <w:sz w:val="16"/>
+              </w:rPr>
+              <w:t>交付与溯源</w:t>
+            </w:r>
+          </w:p>
+        </w:tc>
+        <w:tc>
+          <w:tcPr>
+            <w:tcW w:type="dxa" w:w="3408"/>
+            <w:shd w:fill="F3F7FB"/>
+            <w:vAlign w:val="center"/>
+            <w:tcMar>
+              <w:top w:w="90" w:type="dxa"/>
+              <w:start w:w="100" w:type="dxa"/>
+              <w:bottom w:w="90" w:type="dxa"/>
+              <w:end w:w="100" w:type="dxa"/>
+            </w:tcMar>
+          </w:tcPr>
+          <w:p>
+            <w:pPr>
+              <w:spacing w:after="20"/>
+            </w:pPr>
+            <w:r/>
+            <w:r>
+              <w:rPr>
+                <w:b w:val="0"/>
+                <w:sz w:val="17"/>
+              </w:rPr>
+              <w:t>Produce a Word briefing with links back to original public sources.</w:t>
+            </w:r>
+          </w:p>
+          <w:p>
+            <w:pPr>
+              <w:spacing w:after="0"/>
+            </w:pPr>
+            <w:r>
+              <w:rPr>
+                <w:b w:val="0"/>
+                <w:color w:val="6B7280"/>
+                <w:sz w:val="16"/>
+              </w:rPr>
+              <w:t>生成 Word 简报，并保留原始公开来源链接以便追溯。</w:t>
+            </w:r>
+          </w:p>
+        </w:tc>
+        <w:tc>
+          <w:tcPr>
+            <w:tcW w:type="dxa" w:w="3408"/>
+            <w:shd w:fill="F3F7FB"/>
+            <w:vAlign w:val="center"/>
+            <w:tcMar>
+              <w:top w:w="90" w:type="dxa"/>
+              <w:start w:w="100" w:type="dxa"/>
+              <w:bottom w:w="90" w:type="dxa"/>
+              <w:end w:w="100" w:type="dxa"/>
+            </w:tcMar>
+          </w:tcPr>
+          <w:p>
+            <w:pPr>
+              <w:spacing w:after="20"/>
+            </w:pPr>
+            <w:r/>
+            <w:r>
+              <w:rPr>
+                <w:b/>
+                <w:sz w:val="17"/>
+              </w:rPr>
+              <w:t>Traceable report</w:t>
+            </w:r>
+          </w:p>
+          <w:p>
+            <w:pPr>
+              <w:spacing w:after="0"/>
+            </w:pPr>
+            <w:r>
+              <w:rPr>
+                <w:b/>
+                <w:color w:val="6B7280"/>
+                <w:sz w:val="16"/>
+              </w:rPr>
+              <w:t>可追溯报告</w:t>
+            </w:r>
+          </w:p>
+        </w:tc>
+      </w:tr>
+    </w:tbl>
+    <w:p/>
+    <w:p>
+      <w:pPr>
+        <w:pStyle w:val="Heading1"/>
+        <w:keepNext/>
+      </w:pPr>
+      <w:r>
+        <w:t>4. Executive output</w:t>
+      </w:r>
+      <w:r>
+        <w:rPr>
+          <w:color w:val="2F75B5"/>
+        </w:rPr>
+        <w:t xml:space="preserve">  /  管理层交付内容</w:t>
       </w:r>
     </w:p>
     <w:p>
@@ -76,7 +3024,20 @@
         <w:spacing w:after="40"/>
       </w:pPr>
       <w:r>
-        <w:t>Japan policy and macro channel: Bank of Japan announcements and statistics, Nikkei Asia, and NHK WORLD-JAPAN. 日本政策与宏观渠道：日本央行公告和统计、Nikkei Asia、NHK WORLD-JAPAN。</w:t>
+        <w:t>Market Read — a concise view of the main forces affecting USD/JPY.</w:t>
+      </w:r>
+    </w:p>
+    <w:p>
+      <w:pPr>
+        <w:pStyle w:val="ListBullet"/>
+        <w:spacing w:after="120"/>
+      </w:pPr>
+      <w:r>
+        <w:rPr>
+          <w:color w:val="6B7280"/>
+          <w:sz w:val="19"/>
+        </w:rPr>
+        <w:t>Market Read —— 简明概括影响 USD/JPY 的主要力量。</w:t>
       </w:r>
     </w:p>
     <w:p>
@@ -85,7 +3046,20 @@
         <w:spacing w:after="40"/>
       </w:pPr>
       <w:r>
-        <w:t>US policy channel: Federal Reserve monetary-policy releases, Federal Reserve speeches, and US Treasury press releases. 美国政策渠道：美联储货币政策公告、美联储讲话、美国财政部新闻。</w:t>
+        <w:t>Top Stories — prioritized developments with source, direction, relevance and business takeaway.</w:t>
+      </w:r>
+    </w:p>
+    <w:p>
+      <w:pPr>
+        <w:pStyle w:val="ListBullet"/>
+        <w:spacing w:after="120"/>
+      </w:pPr>
+      <w:r>
+        <w:rPr>
+          <w:color w:val="6B7280"/>
+          <w:sz w:val="19"/>
+        </w:rPr>
+        <w:t>Top Stories —— 按优先级展示新闻来源、方向、相关性及业务要点。</w:t>
       </w:r>
     </w:p>
     <w:p>
@@ -94,7 +3068,20 @@
         <w:spacing w:after="40"/>
       </w:pPr>
       <w:r>
-        <w:t>FX market channel: FXStreet and Investing.com forex news, used as market-commentary supplements rather than primary official evidence. 外汇市场渠道：FXStreet 与 Investing.com 外汇新闻，作为市场解读补充，而非优先级最高的官方依据。</w:t>
+        <w:t>Watchlist — upcoming decisions, data and risks that may move the currency pair.</w:t>
+      </w:r>
+    </w:p>
+    <w:p>
+      <w:pPr>
+        <w:pStyle w:val="ListBullet"/>
+        <w:spacing w:after="120"/>
+      </w:pPr>
+      <w:r>
+        <w:rPr>
+          <w:color w:val="6B7280"/>
+          <w:sz w:val="19"/>
+        </w:rPr>
+        <w:t>Watchlist —— 列出可能影响汇率的后续决策、数据及风险。</w:t>
       </w:r>
     </w:p>
     <w:p>
@@ -103,275 +3090,524 @@
         <w:spacing w:after="40"/>
       </w:pPr>
       <w:r>
-        <w:t>Business focus: BOJ/Fed policy, rate differentials, inflation, wages, JGB and Treasury yields, intervention rhetoric, fiscal policy, risk sentiment, trade balance, oil/commodities, and growth data. 业务关注点：日美央行政策、利差、通胀、工资、日债与美债收益率、干预言论、财政政策、风险情绪、贸易收支、油价/商品和增长数据。</w:t>
-      </w:r>
-    </w:p>
-    <w:p>
-      <w:pPr>
-        <w:spacing w:before="200" w:after="80"/>
-      </w:pPr>
-      <w:r>
-        <w:rPr>
-          <w:b/>
-          <w:sz w:val="24"/>
-        </w:rPr>
-        <w:t>3. Business Workflow / 业务流程</w:t>
+        <w:t>Source Citations — direct links for validation and deeper reading.</w:t>
       </w:r>
     </w:p>
     <w:p>
       <w:pPr>
         <w:pStyle w:val="ListBullet"/>
-        <w:spacing w:after="40"/>
+        <w:spacing w:after="120"/>
       </w:pPr>
       <w:r>
-        <w:t>Collect: gather recent public headlines from the source set above and keep the news items that can plausibly affect USD/JPY. 收集：从上述信源获取近期公开新闻，保留可能影响美元/日元的条目。</w:t>
+        <w:rPr>
+          <w:color w:val="6B7280"/>
+          <w:sz w:val="19"/>
+        </w:rPr>
+        <w:t>Source Citations —— 提供原文链接，便于核实和进一步阅读。</w:t>
       </w:r>
     </w:p>
     <w:p>
       <w:pPr>
-        <w:pStyle w:val="ListBullet"/>
-        <w:spacing w:after="40"/>
+        <w:pStyle w:val="Heading1"/>
+        <w:keepNext/>
       </w:pPr>
       <w:r>
-        <w:t>Freshness control: prefer genuinely recent news; when a source has incomplete date information, the item is marked by first-seen timing instead of being treated as an exact publication date. 时效控制：优先近期新闻；当信源日期信息不完整时，用“首次看到”作为近似，不把它误写成确定发布时间。</w:t>
+        <w:t>5. Governance and boundaries</w:t>
+      </w:r>
+      <w:r>
+        <w:rPr>
+          <w:color w:val="2F75B5"/>
+        </w:rPr>
+        <w:t xml:space="preserve">  /  管控与边界</w:t>
+      </w:r>
+    </w:p>
+    <w:tbl>
+      <w:tblPr>
+        <w:tblStyle w:val="TableGrid"/>
+        <w:tblW w:type="auto" w:w="0"/>
+        <w:jc w:val="center"/>
+        <w:tblLook w:firstColumn="1" w:firstRow="1" w:lastColumn="0" w:lastRow="0" w:noHBand="0" w:noVBand="1" w:val="04A0"/>
+      </w:tblPr>
+      <w:tblGrid>
+        <w:gridCol w:w="5112"/>
+        <w:gridCol w:w="5112"/>
+      </w:tblGrid>
+      <w:tr>
+        <w:tc>
+          <w:tcPr>
+            <w:tcW w:type="dxa" w:w="5112"/>
+            <w:shd w:fill="17365D"/>
+            <w:vAlign w:val="center"/>
+            <w:tcMar>
+              <w:top w:w="90" w:type="dxa"/>
+              <w:start w:w="100" w:type="dxa"/>
+              <w:bottom w:w="90" w:type="dxa"/>
+              <w:end w:w="100" w:type="dxa"/>
+            </w:tcMar>
+          </w:tcPr>
+          <w:p>
+            <w:pPr>
+              <w:spacing w:after="20"/>
+            </w:pPr>
+            <w:r/>
+            <w:r>
+              <w:rPr>
+                <w:b/>
+                <w:color w:val="FFFFFF"/>
+                <w:sz w:val="18"/>
+              </w:rPr>
+              <w:t>Control</w:t>
+            </w:r>
+          </w:p>
+          <w:p>
+            <w:pPr>
+              <w:spacing w:after="0"/>
+            </w:pPr>
+            <w:r>
+              <w:rPr>
+                <w:b/>
+                <w:color w:val="FFFFFF"/>
+                <w:sz w:val="17"/>
+              </w:rPr>
+              <w:t>管控</w:t>
+            </w:r>
+          </w:p>
+        </w:tc>
+        <w:tc>
+          <w:tcPr>
+            <w:tcW w:type="dxa" w:w="5112"/>
+            <w:shd w:fill="17365D"/>
+            <w:vAlign w:val="center"/>
+            <w:tcMar>
+              <w:top w:w="90" w:type="dxa"/>
+              <w:start w:w="100" w:type="dxa"/>
+              <w:bottom w:w="90" w:type="dxa"/>
+              <w:end w:w="100" w:type="dxa"/>
+            </w:tcMar>
+          </w:tcPr>
+          <w:p>
+            <w:pPr>
+              <w:spacing w:after="20"/>
+            </w:pPr>
+            <w:r/>
+            <w:r>
+              <w:rPr>
+                <w:b/>
+                <w:color w:val="FFFFFF"/>
+                <w:sz w:val="18"/>
+              </w:rPr>
+              <w:t>Executive implication</w:t>
+            </w:r>
+          </w:p>
+          <w:p>
+            <w:pPr>
+              <w:spacing w:after="0"/>
+            </w:pPr>
+            <w:r>
+              <w:rPr>
+                <w:b/>
+                <w:color w:val="FFFFFF"/>
+                <w:sz w:val="17"/>
+              </w:rPr>
+              <w:t>管理层含义</w:t>
+            </w:r>
+          </w:p>
+        </w:tc>
+      </w:tr>
+      <w:tr>
+        <w:tc>
+          <w:tcPr>
+            <w:tcW w:type="dxa" w:w="5112"/>
+            <w:shd w:fill="FFFFFF"/>
+            <w:vAlign w:val="center"/>
+            <w:tcMar>
+              <w:top w:w="90" w:type="dxa"/>
+              <w:start w:w="100" w:type="dxa"/>
+              <w:bottom w:w="90" w:type="dxa"/>
+              <w:end w:w="100" w:type="dxa"/>
+            </w:tcMar>
+          </w:tcPr>
+          <w:p>
+            <w:pPr>
+              <w:spacing w:after="20"/>
+            </w:pPr>
+            <w:r/>
+            <w:r>
+              <w:rPr>
+                <w:b/>
+                <w:sz w:val="17"/>
+              </w:rPr>
+              <w:t>Official-source priority</w:t>
+            </w:r>
+          </w:p>
+          <w:p>
+            <w:pPr>
+              <w:spacing w:after="0"/>
+            </w:pPr>
+            <w:r>
+              <w:rPr>
+                <w:b/>
+                <w:color w:val="6B7280"/>
+                <w:sz w:val="16"/>
+              </w:rPr>
+              <w:t>官方来源优先</w:t>
+            </w:r>
+          </w:p>
+        </w:tc>
+        <w:tc>
+          <w:tcPr>
+            <w:tcW w:type="dxa" w:w="5112"/>
+            <w:shd w:fill="FFFFFF"/>
+            <w:vAlign w:val="center"/>
+            <w:tcMar>
+              <w:top w:w="90" w:type="dxa"/>
+              <w:start w:w="100" w:type="dxa"/>
+              <w:bottom w:w="90" w:type="dxa"/>
+              <w:end w:w="100" w:type="dxa"/>
+            </w:tcMar>
+          </w:tcPr>
+          <w:p>
+            <w:pPr>
+              <w:spacing w:after="20"/>
+            </w:pPr>
+            <w:r/>
+            <w:r>
+              <w:rPr>
+                <w:b w:val="0"/>
+                <w:sz w:val="17"/>
+              </w:rPr>
+              <w:t>Policy sources lead; media commentary supplements interpretation.</w:t>
+            </w:r>
+          </w:p>
+          <w:p>
+            <w:pPr>
+              <w:spacing w:after="0"/>
+            </w:pPr>
+            <w:r>
+              <w:rPr>
+                <w:b w:val="0"/>
+                <w:color w:val="6B7280"/>
+                <w:sz w:val="16"/>
+              </w:rPr>
+              <w:t>政策类官方来源优先，媒体评论用于补充解读。</w:t>
+            </w:r>
+          </w:p>
+        </w:tc>
+      </w:tr>
+      <w:tr>
+        <w:tc>
+          <w:tcPr>
+            <w:tcW w:type="dxa" w:w="5112"/>
+            <w:shd w:fill="F2F2F2"/>
+            <w:vAlign w:val="center"/>
+            <w:tcMar>
+              <w:top w:w="90" w:type="dxa"/>
+              <w:start w:w="100" w:type="dxa"/>
+              <w:bottom w:w="90" w:type="dxa"/>
+              <w:end w:w="100" w:type="dxa"/>
+            </w:tcMar>
+          </w:tcPr>
+          <w:p>
+            <w:pPr>
+              <w:spacing w:after="20"/>
+            </w:pPr>
+            <w:r/>
+            <w:r>
+              <w:rPr>
+                <w:b/>
+                <w:sz w:val="17"/>
+              </w:rPr>
+              <w:t>No autonomous trading</w:t>
+            </w:r>
+          </w:p>
+          <w:p>
+            <w:pPr>
+              <w:spacing w:after="0"/>
+            </w:pPr>
+            <w:r>
+              <w:rPr>
+                <w:b/>
+                <w:color w:val="6B7280"/>
+                <w:sz w:val="16"/>
+              </w:rPr>
+              <w:t>不进行自动交易</w:t>
+            </w:r>
+          </w:p>
+        </w:tc>
+        <w:tc>
+          <w:tcPr>
+            <w:tcW w:type="dxa" w:w="5112"/>
+            <w:shd w:fill="F2F2F2"/>
+            <w:vAlign w:val="center"/>
+            <w:tcMar>
+              <w:top w:w="90" w:type="dxa"/>
+              <w:start w:w="100" w:type="dxa"/>
+              <w:bottom w:w="90" w:type="dxa"/>
+              <w:end w:w="100" w:type="dxa"/>
+            </w:tcMar>
+          </w:tcPr>
+          <w:p>
+            <w:pPr>
+              <w:spacing w:after="20"/>
+            </w:pPr>
+            <w:r/>
+            <w:r>
+              <w:rPr>
+                <w:b w:val="0"/>
+                <w:sz w:val="17"/>
+              </w:rPr>
+              <w:t>Outputs support decisions but never place or recommend trades.</w:t>
+            </w:r>
+          </w:p>
+          <w:p>
+            <w:pPr>
+              <w:spacing w:after="0"/>
+            </w:pPr>
+            <w:r>
+              <w:rPr>
+                <w:b w:val="0"/>
+                <w:color w:val="6B7280"/>
+                <w:sz w:val="16"/>
+              </w:rPr>
+              <w:t>输出用于辅助决策，但不会执行或直接建议交易。</w:t>
+            </w:r>
+          </w:p>
+        </w:tc>
+      </w:tr>
+      <w:tr>
+        <w:tc>
+          <w:tcPr>
+            <w:tcW w:type="dxa" w:w="5112"/>
+            <w:shd w:fill="FFFFFF"/>
+            <w:vAlign w:val="center"/>
+            <w:tcMar>
+              <w:top w:w="90" w:type="dxa"/>
+              <w:start w:w="100" w:type="dxa"/>
+              <w:bottom w:w="90" w:type="dxa"/>
+              <w:end w:w="100" w:type="dxa"/>
+            </w:tcMar>
+          </w:tcPr>
+          <w:p>
+            <w:pPr>
+              <w:spacing w:after="20"/>
+            </w:pPr>
+            <w:r/>
+            <w:r>
+              <w:rPr>
+                <w:b/>
+                <w:sz w:val="17"/>
+              </w:rPr>
+              <w:t>Human review remains required</w:t>
+            </w:r>
+          </w:p>
+          <w:p>
+            <w:pPr>
+              <w:spacing w:after="0"/>
+            </w:pPr>
+            <w:r>
+              <w:rPr>
+                <w:b/>
+                <w:color w:val="6B7280"/>
+                <w:sz w:val="16"/>
+              </w:rPr>
+              <w:t>仍需人工复核</w:t>
+            </w:r>
+          </w:p>
+        </w:tc>
+        <w:tc>
+          <w:tcPr>
+            <w:tcW w:type="dxa" w:w="5112"/>
+            <w:shd w:fill="FFFFFF"/>
+            <w:vAlign w:val="center"/>
+            <w:tcMar>
+              <w:top w:w="90" w:type="dxa"/>
+              <w:start w:w="100" w:type="dxa"/>
+              <w:bottom w:w="90" w:type="dxa"/>
+              <w:end w:w="100" w:type="dxa"/>
+            </w:tcMar>
+          </w:tcPr>
+          <w:p>
+            <w:pPr>
+              <w:spacing w:after="20"/>
+            </w:pPr>
+            <w:r/>
+            <w:r>
+              <w:rPr>
+                <w:b w:val="0"/>
+                <w:sz w:val="17"/>
+              </w:rPr>
+              <w:t>Material decisions should be checked against original sources and current market conditions.</w:t>
+            </w:r>
+          </w:p>
+          <w:p>
+            <w:pPr>
+              <w:spacing w:after="0"/>
+            </w:pPr>
+            <w:r>
+              <w:rPr>
+                <w:b w:val="0"/>
+                <w:color w:val="6B7280"/>
+                <w:sz w:val="16"/>
+              </w:rPr>
+              <w:t>重要决策应结合原始来源及当时市场情况进行人工核实。</w:t>
+            </w:r>
+          </w:p>
+        </w:tc>
+      </w:tr>
+      <w:tr>
+        <w:tc>
+          <w:tcPr>
+            <w:tcW w:type="dxa" w:w="5112"/>
+            <w:shd w:fill="F2F2F2"/>
+            <w:vAlign w:val="center"/>
+            <w:tcMar>
+              <w:top w:w="90" w:type="dxa"/>
+              <w:start w:w="100" w:type="dxa"/>
+              <w:bottom w:w="90" w:type="dxa"/>
+              <w:end w:w="100" w:type="dxa"/>
+            </w:tcMar>
+          </w:tcPr>
+          <w:p>
+            <w:pPr>
+              <w:spacing w:after="20"/>
+            </w:pPr>
+            <w:r/>
+            <w:r>
+              <w:rPr>
+                <w:b/>
+                <w:sz w:val="17"/>
+              </w:rPr>
+              <w:t>Public-source limitations</w:t>
+            </w:r>
+          </w:p>
+          <w:p>
+            <w:pPr>
+              <w:spacing w:after="0"/>
+            </w:pPr>
+            <w:r>
+              <w:rPr>
+                <w:b/>
+                <w:color w:val="6B7280"/>
+                <w:sz w:val="16"/>
+              </w:rPr>
+              <w:t>公开来源限制</w:t>
+            </w:r>
+          </w:p>
+        </w:tc>
+        <w:tc>
+          <w:tcPr>
+            <w:tcW w:type="dxa" w:w="5112"/>
+            <w:shd w:fill="F2F2F2"/>
+            <w:vAlign w:val="center"/>
+            <w:tcMar>
+              <w:top w:w="90" w:type="dxa"/>
+              <w:start w:w="100" w:type="dxa"/>
+              <w:bottom w:w="90" w:type="dxa"/>
+              <w:end w:w="100" w:type="dxa"/>
+            </w:tcMar>
+          </w:tcPr>
+          <w:p>
+            <w:pPr>
+              <w:spacing w:after="20"/>
+            </w:pPr>
+            <w:r/>
+            <w:r>
+              <w:rPr>
+                <w:b w:val="0"/>
+                <w:sz w:val="17"/>
+              </w:rPr>
+              <w:t>Delays, missing dates or ambiguous headlines can affect interpretation.</w:t>
+            </w:r>
+          </w:p>
+          <w:p>
+            <w:pPr>
+              <w:spacing w:after="0"/>
+            </w:pPr>
+            <w:r>
+              <w:rPr>
+                <w:b w:val="0"/>
+                <w:color w:val="6B7280"/>
+                <w:sz w:val="16"/>
+              </w:rPr>
+              <w:t>信息延迟、日期缺失或标题歧义可能影响判断。</w:t>
+            </w:r>
+          </w:p>
+        </w:tc>
+      </w:tr>
+    </w:tbl>
+    <w:p>
+      <w:pPr>
+        <w:spacing w:before="200"/>
+        <w:jc w:val="center"/>
+      </w:pPr>
+      <w:r>
+        <w:rPr>
+          <w:b/>
+          <w:color w:val="17365D"/>
+          <w:sz w:val="22"/>
+        </w:rPr>
+        <w:t>Bottom line: two AI roles convert nine public source channels into one traceable executive briefing.</w:t>
       </w:r>
     </w:p>
     <w:p>
       <w:pPr>
-        <w:pStyle w:val="ListBullet"/>
-        <w:spacing w:after="40"/>
-      </w:pPr>
-      <w:r>
-        <w:t>Duplicate control: similar or repeated headlines are consolidated so the report does not over-count the same story. 去重控制：相似或重复标题会被合并，避免同一事件在报告中被重复放大。</w:t>
-      </w:r>
-    </w:p>
-    <w:p>
-      <w:pPr>
-        <w:pStyle w:val="ListBullet"/>
-        <w:spacing w:after="40"/>
-      </w:pPr>
-      <w:r>
-        <w:t>Pre-screening: direct USD/JPY, yen, BOJ, Fed, Treasury-yield, inflation, intervention, and risk-sentiment clues are used to identify relevant candidates. 预筛选：使用 USD/JPY、日元、日本央行、美联储、美债收益率、通胀、干预、风险情绪等线索识别候选新闻。</w:t>
-      </w:r>
-    </w:p>
-    <w:p>
-      <w:pPr>
-        <w:pStyle w:val="ListBullet"/>
-        <w:spacing w:after="40"/>
-      </w:pPr>
-      <w:r>
-        <w:t>Official-source preference: BOJ, Fed, and US Treasury items can pass the screen even when the headline does not explicitly say USD/JPY, as long as the topic has a clear macro or policy channel. 官方信源优先：BOJ、美联储、美国财政部新闻即使标题没有写 USD/JPY，只要有明确宏观或政策传导路径，也会进入评估。</w:t>
-      </w:r>
-    </w:p>
-    <w:p>
-      <w:pPr>
-        <w:pStyle w:val="ListBullet"/>
-        <w:spacing w:after="40"/>
-      </w:pPr>
-      <w:r>
-        <w:t>Noise reduction: generic forex headlines are filtered more strictly; FX media items need direct USD/JPY/Japan evidence or multiple strong macro clues. 降噪：泛泛的外汇新闻会被更严格过滤；外汇媒体条目需要直接的 USD/JPY/日本线索，或多个强宏观线索。</w:t>
-      </w:r>
-    </w:p>
-    <w:p>
-      <w:pPr>
-        <w:pStyle w:val="ListBullet"/>
-        <w:spacing w:after="40"/>
-      </w:pPr>
-      <w:r>
-        <w:t>Prioritization: official policy news and high-signal macro stories are ranked ahead of generic commentary, while source caps keep any one media feed from dominating. 排序：官方政策新闻和高信号宏观新闻优先于泛市场评论，同时限制单一媒体来源占比。</w:t>
-      </w:r>
-    </w:p>
-    <w:p>
-      <w:pPr>
-        <w:pStyle w:val="ListBullet"/>
-        <w:spacing w:after="40"/>
-      </w:pPr>
-      <w:r>
-        <w:t>Assessment: each selected story is evaluated for relevance, likely USD/JPY direction, confidence, transmission channel, and a short "why it matters" explanation. 评估：每条新闻都会形成相关性、可能方向、信心程度、传导渠道和“为什么重要”的简短解释。</w:t>
-      </w:r>
-    </w:p>
-    <w:p>
-      <w:pPr>
-        <w:pStyle w:val="ListBullet"/>
-        <w:spacing w:after="40"/>
-      </w:pPr>
-      <w:r>
-        <w:t>Summary: the final briefing uses recent higher-relevance stories, diversifies sources, removes near-duplicates, and produces an overall market read plus a watchlist. 总结：最终简报选取近期高相关新闻，兼顾信源多样性，去除近似重复，并生成整体市场解读和观察清单。</w:t>
-      </w:r>
-    </w:p>
-    <w:p>
-      <w:pPr>
-        <w:spacing w:before="200" w:after="80"/>
+        <w:jc w:val="center"/>
       </w:pPr>
       <w:r>
         <w:rPr>
           <w:b/>
-          <w:sz w:val="24"/>
+          <w:color w:val="2F75B5"/>
+          <w:sz w:val="20"/>
         </w:rPr>
-        <w:t>4. Relevance And Direction Logic / 相关性与方向解读</w:t>
-      </w:r>
-    </w:p>
-    <w:p>
-      <w:pPr>
-        <w:pStyle w:val="ListBullet"/>
-        <w:spacing w:after="40"/>
-      </w:pPr>
-      <w:r>
-        <w:t>High relevance: direct BOJ/Fed policy decisions, intervention risk, major inflation/rates surprises, or news with an immediate rate-differential channel. 高相关：直接的日美央行政策、汇率干预风险、重大通胀/利率意外，或对利差有直接影响的新闻。</w:t>
-      </w:r>
-    </w:p>
-    <w:p>
-      <w:pPr>
-        <w:pStyle w:val="ListBullet"/>
-        <w:spacing w:after="40"/>
-      </w:pPr>
-      <w:r>
-        <w:t>Medium relevance: macro stories with a clear yen or dollar transmission path, such as wages, JGB yields, Treasury yields, oil shocks, or Japan growth data. 中相关：有清晰日元或美元传导路径的宏观新闻，例如工资、日债收益率、美债收益率、油价冲击或日本增长数据。</w:t>
-      </w:r>
-    </w:p>
-    <w:p>
-      <w:pPr>
-        <w:pStyle w:val="ListBullet"/>
-        <w:spacing w:after="40"/>
-      </w:pPr>
-      <w:r>
-        <w:t>Low relevance: indirect but still useful context, such as trade, fiscal, commodity, or broad risk-sentiment developments. 低相关：影响较间接但仍有参考价值的背景信息，例如贸易、财政、商品或整体风险情绪变化。</w:t>
-      </w:r>
-    </w:p>
-    <w:p>
-      <w:pPr>
-        <w:pStyle w:val="ListBullet"/>
-        <w:spacing w:after="40"/>
-      </w:pPr>
-      <w:r>
-        <w:t>USD/JPY up means the dollar is stronger or the yen is weaker; USD/JPY down means the dollar is weaker or the yen is stronger. USD/JPY 上行表示美元走强或日元走弱；USD/JPY 下行表示美元走弱或日元走强。</w:t>
-      </w:r>
-    </w:p>
-    <w:p>
-      <w:pPr>
-        <w:pStyle w:val="ListBullet"/>
-        <w:spacing w:after="40"/>
-      </w:pPr>
-      <w:r>
-        <w:t>Mixed or unclear is used when competing forces exist or the headline does not support a clean directional read. 当多种力量相互抵消，或新闻本身不足以支持明确方向时，会标记为 Mixed 或 Unclear。</w:t>
-      </w:r>
-    </w:p>
-    <w:p>
-      <w:pPr>
-        <w:spacing w:before="200" w:after="80"/>
-      </w:pPr>
-      <w:r>
-        <w:rPr>
-          <w:b/>
-          <w:sz w:val="24"/>
-        </w:rPr>
-        <w:t>5. Report Structure / 报告结构</w:t>
-      </w:r>
-    </w:p>
-    <w:p>
-      <w:pPr>
-        <w:pStyle w:val="ListBullet"/>
-        <w:spacing w:after="40"/>
-      </w:pPr>
-      <w:r>
-        <w:t>Market Read: one concise paragraph summarizing the overall USD/JPY backdrop from the selected stories. Market Read：用一段话总结精选新闻所呈现的美元/日元整体背景。</w:t>
-      </w:r>
-    </w:p>
-    <w:p>
-      <w:pPr>
-        <w:pStyle w:val="ListBullet"/>
-        <w:spacing w:after="40"/>
-      </w:pPr>
-      <w:r>
-        <w:t>Top Stories: ranked stories with source, direction, relevance label, business takeaway, date, and read-more link. Top Stories：按重要性排序，展示信源、方向、相关性标签、业务要点、日期和原文链接。</w:t>
-      </w:r>
-    </w:p>
-    <w:p>
-      <w:pPr>
-        <w:pStyle w:val="ListBullet"/>
-        <w:spacing w:after="40"/>
-      </w:pPr>
-      <w:r>
-        <w:t>Watchlist: upcoming events, risks, or data points that may move USD/JPY next. Watchlist：列出后续可能影响美元/日元的事件、风险或数据。</w:t>
-      </w:r>
-    </w:p>
-    <w:p>
-      <w:pPr>
-        <w:pStyle w:val="ListBullet"/>
-        <w:spacing w:after="40"/>
-      </w:pPr>
-      <w:r>
-        <w:t>Source Citations: source links are kept so readers can trace the briefing back to the original public news. Source Citations：保留来源链接，方便读者回溯到原始公开新闻。</w:t>
-      </w:r>
-    </w:p>
-    <w:p>
-      <w:pPr>
-        <w:spacing w:before="200" w:after="80"/>
-      </w:pPr>
-      <w:r>
-        <w:rPr>
-          <w:b/>
-          <w:sz w:val="24"/>
-        </w:rPr>
-        <w:t>6. Business Boundaries / 业务边界</w:t>
-      </w:r>
-    </w:p>
-    <w:p>
-      <w:pPr>
-        <w:pStyle w:val="ListBullet"/>
-        <w:spacing w:after="40"/>
-      </w:pPr>
-      <w:r>
-        <w:t>This tracker explains narrative relevance; it does not prove historical correlation between news and USD/JPY price moves. 本工具解释新闻叙事相关性，不证明新闻与 USD/JPY 价格变化之间的历史统计相关。</w:t>
-      </w:r>
-    </w:p>
-    <w:p>
-      <w:pPr>
-        <w:pStyle w:val="ListBullet"/>
-        <w:spacing w:after="40"/>
-      </w:pPr>
-      <w:r>
-        <w:t>It does not replace real-time terminals, broker quotes, or trader judgment during fast markets. 它不能替代实时终端、券商报价，也不能替代快速行情中的交易员判断。</w:t>
-      </w:r>
-    </w:p>
-    <w:p>
-      <w:pPr>
-        <w:pStyle w:val="ListBullet"/>
-        <w:spacing w:after="40"/>
-      </w:pPr>
-      <w:r>
-        <w:t>Public-source delay, missing metadata, and ambiguous headlines can affect interpretation, so important decisions still require human review. 公开信源延迟、元数据缺失和标题歧义都可能影响解读，重要决策仍需人工复核。</w:t>
-      </w:r>
-    </w:p>
-    <w:p>
-      <w:pPr>
-        <w:pStyle w:val="ListBullet"/>
-        <w:spacing w:after="40"/>
-      </w:pPr>
-      <w:r>
-        <w:t>The source universe is intentionally focused on Japan, US policy, and FX commentary; it is not a complete global macro news terminal. 当前信源有意聚焦日本、美国政策和外汇评论，并不是完整的全球宏观新闻终端。</w:t>
-      </w:r>
-    </w:p>
-    <w:p>
-      <w:pPr>
-        <w:spacing w:before="240"/>
-      </w:pPr>
-      <w:r>
-        <w:rPr>
-          <w:i/>
-          <w:sz w:val="18"/>
-        </w:rPr>
-        <w:t>Updated to match current code behavior. / 已按当前代码行为更新。</w:t>
+        <w:t>结论：两个 AI 角色将 9 个公开信息渠道整合为一份可追溯的管理层简报。</w:t>
       </w:r>
     </w:p>
     <w:sectPr>
+      <w:headerReference w:type="default" r:id="rId9"/>
+      <w:footerReference w:type="default" r:id="rId10"/>
       <w:pgSz w:w="12240" w:h="15840"/>
-      <w:pgMar w:top="1080" w:right="1200" w:bottom="1080" w:left="1200" w:header="720" w:footer="720" w:gutter="0"/>
+      <w:pgMar w:top="936" w:right="1008" w:bottom="893" w:left="1008" w:header="720" w:footer="720" w:gutter="0"/>
       <w:cols w:space="720"/>
       <w:docGrid w:linePitch="360"/>
     </w:sectPr>
   </w:body>
 </w:document>
+</file>
+
+<file path=word/footer1.xml><?xml version="1.0" encoding="utf-8"?>
+<w:ftr xmlns:m="http://schemas.openxmlformats.org/officeDocument/2006/math" xmlns:mc="http://schemas.openxmlformats.org/markup-compatibility/2006" xmlns:mo="http://schemas.microsoft.com/office/mac/office/2008/main" xmlns:mv="urn:schemas-microsoft-com:mac:vml" xmlns:o="urn:schemas-microsoft-com:office:office" xmlns:r="http://schemas.openxmlformats.org/officeDocument/2006/relationships" xmlns:v="urn:schemas-microsoft-com:vml" xmlns:w10="urn:schemas-microsoft-com:office:word" xmlns:w14="http://schemas.microsoft.com/office/word/2010/wordml" xmlns:w="http://schemas.openxmlformats.org/wordprocessingml/2006/main" xmlns:wne="http://schemas.microsoft.com/office/word/2006/wordml" xmlns:wp14="http://schemas.microsoft.com/office/word/2010/wordprocessingDrawing" xmlns:wp="http://schemas.openxmlformats.org/drawingml/2006/wordprocessingDrawing" xmlns:wpc="http://schemas.microsoft.com/office/word/2010/wordprocessingCanvas" xmlns:wpg="http://schemas.microsoft.com/office/word/2010/wordprocessingGroup" xmlns:wpi="http://schemas.microsoft.com/office/word/2010/wordprocessingInk" xmlns:wps="http://schemas.microsoft.com/office/word/2010/wordprocessingShape" mc:Ignorable="w14 wp14">
+  <w:p>
+    <w:pPr>
+      <w:pStyle w:val="Footer"/>
+      <w:jc w:val="center"/>
+    </w:pPr>
+    <w:r>
+      <w:rPr>
+        <w:color w:val="6B7280"/>
+        <w:sz w:val="16"/>
+      </w:rPr>
+      <w:t>Internal working document  •  29 July 2026</w:t>
+    </w:r>
+  </w:p>
+</w:ftr>
+</file>
+
+<file path=word/header1.xml><?xml version="1.0" encoding="utf-8"?>
+<w:hdr xmlns:m="http://schemas.openxmlformats.org/officeDocument/2006/math" xmlns:mc="http://schemas.openxmlformats.org/markup-compatibility/2006" xmlns:mo="http://schemas.microsoft.com/office/mac/office/2008/main" xmlns:mv="urn:schemas-microsoft-com:mac:vml" xmlns:o="urn:schemas-microsoft-com:office:office" xmlns:r="http://schemas.openxmlformats.org/officeDocument/2006/relationships" xmlns:v="urn:schemas-microsoft-com:vml" xmlns:w10="urn:schemas-microsoft-com:office:word" xmlns:w14="http://schemas.microsoft.com/office/word/2010/wordml" xmlns:w="http://schemas.openxmlformats.org/wordprocessingml/2006/main" xmlns:wne="http://schemas.microsoft.com/office/word/2006/wordml" xmlns:wp14="http://schemas.microsoft.com/office/word/2010/wordprocessingDrawing" xmlns:wp="http://schemas.openxmlformats.org/drawingml/2006/wordprocessingDrawing" xmlns:wpc="http://schemas.microsoft.com/office/word/2010/wordprocessingCanvas" xmlns:wpg="http://schemas.microsoft.com/office/word/2010/wordprocessingGroup" xmlns:wpi="http://schemas.microsoft.com/office/word/2010/wordprocessingInk" xmlns:wps="http://schemas.microsoft.com/office/word/2010/wordprocessingShape" mc:Ignorable="w14 wp14">
+  <w:p>
+    <w:pPr>
+      <w:pStyle w:val="Header"/>
+      <w:jc w:val="right"/>
+    </w:pPr>
+    <w:r>
+      <w:rPr>
+        <w:color w:val="6B7280"/>
+        <w:sz w:val="16"/>
+      </w:rPr>
+      <w:t>USD/JPY NEWS TRACKER  |  EXECUTIVE OVERVIEW</w:t>
+    </w:r>
+  </w:p>
+</w:hdr>
 </file>
 
 <file path=word/numbering.xml><?xml version="1.0" encoding="utf-8"?>
@@ -737,8 +3973,11 @@
     <w:name w:val="Normal"/>
     <w:qFormat/>
     <w:rsid w:val="00FC693F"/>
+    <w:pPr>
+      <w:spacing w:after="100" w:line="252" w:lineRule="auto"/>
+    </w:pPr>
     <w:rPr>
-      <w:rFonts w:ascii="Calibri" w:hAnsi="Calibri" w:eastAsia="Microsoft YaHei"/>
+      <w:rFonts w:ascii="Aptos" w:hAnsi="Aptos" w:eastAsia="Microsoft YaHei"/>
       <w:sz w:val="21"/>
     </w:rPr>
   </w:style>
@@ -797,15 +4036,15 @@
     <w:pPr>
       <w:keepNext/>
       <w:keepLines/>
-      <w:spacing w:before="480" w:after="0"/>
+      <w:spacing w:before="160" w:after="120"/>
       <w:outlineLvl w:val="0"/>
     </w:pPr>
     <w:rPr>
-      <w:rFonts w:asciiTheme="majorHAnsi" w:eastAsiaTheme="majorEastAsia" w:hAnsiTheme="majorHAnsi" w:cstheme="majorBidi"/>
+      <w:rFonts w:asciiTheme="majorHAnsi" w:eastAsiaTheme="majorEastAsia" w:hAnsiTheme="majorHAnsi" w:cstheme="majorBidi" w:ascii="Aptos Display" w:hAnsi="Aptos Display" w:eastAsia="Microsoft YaHei"/>
       <w:b/>
       <w:bCs/>
-      <w:color w:val="365F91" w:themeColor="accent1" w:themeShade="BF"/>
-      <w:sz w:val="28"/>
+      <w:color w:val="17365D"/>
+      <w:sz w:val="36"/>
       <w:szCs w:val="28"/>
     </w:rPr>
   </w:style>
@@ -821,14 +4060,14 @@
     <w:pPr>
       <w:keepNext/>
       <w:keepLines/>
-      <w:spacing w:before="200" w:after="0"/>
+      <w:spacing w:before="160" w:after="120"/>
       <w:outlineLvl w:val="1"/>
     </w:pPr>
     <w:rPr>
-      <w:rFonts w:asciiTheme="majorHAnsi" w:eastAsiaTheme="majorEastAsia" w:hAnsiTheme="majorHAnsi" w:cstheme="majorBidi"/>
+      <w:rFonts w:asciiTheme="majorHAnsi" w:eastAsiaTheme="majorEastAsia" w:hAnsiTheme="majorHAnsi" w:cstheme="majorBidi" w:ascii="Aptos Display" w:hAnsi="Aptos Display" w:eastAsia="Microsoft YaHei"/>
       <w:b/>
       <w:bCs/>
-      <w:color w:val="4F81BD" w:themeColor="accent1"/>
+      <w:color w:val="2F75B5"/>
       <w:sz w:val="26"/>
       <w:szCs w:val="26"/>
     </w:rPr>
@@ -1086,15 +4325,16 @@
       <w:pBdr>
         <w:bottom w:val="single" w:sz="8" w:space="4" w:color="4F81BD" w:themeColor="accent1"/>
       </w:pBdr>
-      <w:spacing w:after="300" w:line="240" w:lineRule="auto"/>
+      <w:spacing w:after="120" w:line="240" w:lineRule="auto" w:before="160"/>
       <w:contextualSpacing/>
     </w:pPr>
     <w:rPr>
-      <w:rFonts w:asciiTheme="majorHAnsi" w:eastAsiaTheme="majorEastAsia" w:hAnsiTheme="majorHAnsi" w:cstheme="majorBidi"/>
-      <w:color w:val="17365D" w:themeColor="text2" w:themeShade="BF"/>
+      <w:rFonts w:asciiTheme="majorHAnsi" w:eastAsiaTheme="majorEastAsia" w:hAnsiTheme="majorHAnsi" w:cstheme="majorBidi" w:ascii="Aptos Display" w:hAnsi="Aptos Display" w:eastAsia="Microsoft YaHei"/>
+      <w:b/>
+      <w:color w:val="17365D"/>
       <w:spacing w:val="5"/>
       <w:kern w:val="28"/>
-      <w:sz w:val="52"/>
+      <w:sz w:val="56"/>
       <w:szCs w:val="52"/>
     </w:rPr>
   </w:style>

</xml_diff>